<commit_message>
update on 2025-07-08 14:40:52.932939
</commit_message>
<xml_diff>
--- a/cfg - system.docx
+++ b/cfg - system.docx
@@ -4164,12 +4164,6 @@
             <w:insideH w:val="single" w:color="auto" w:sz="4" w:space="0"/>
             <w:insideV w:val="single" w:color="auto" w:sz="4" w:space="0"/>
           </w:tblBorders>
-          <w:tblCellMar>
-            <w:top w:w="0" w:type="dxa"/>
-            <w:left w:w="108" w:type="dxa"/>
-            <w:bottom w:w="0" w:type="dxa"/>
-            <w:right w:w="108" w:type="dxa"/>
-          </w:tblCellMar>
         </w:tblPrEx>
         <w:tc>
           <w:tcPr>
@@ -6444,12 +6438,6 @@
             <w:insideH w:val="single" w:color="auto" w:sz="4" w:space="0"/>
             <w:insideV w:val="single" w:color="auto" w:sz="4" w:space="0"/>
           </w:tblBorders>
-          <w:tblCellMar>
-            <w:top w:w="0" w:type="dxa"/>
-            <w:left w:w="108" w:type="dxa"/>
-            <w:bottom w:w="0" w:type="dxa"/>
-            <w:right w:w="108" w:type="dxa"/>
-          </w:tblCellMar>
         </w:tblPrEx>
         <w:tc>
           <w:tcPr>
@@ -13017,12 +13005,6 @@
             <w:insideH w:val="single" w:color="auto" w:sz="4" w:space="0"/>
             <w:insideV w:val="single" w:color="auto" w:sz="4" w:space="0"/>
           </w:tblBorders>
-          <w:tblCellMar>
-            <w:top w:w="0" w:type="dxa"/>
-            <w:left w:w="108" w:type="dxa"/>
-            <w:bottom w:w="0" w:type="dxa"/>
-            <w:right w:w="108" w:type="dxa"/>
-          </w:tblCellMar>
         </w:tblPrEx>
         <w:tc>
           <w:tcPr>
@@ -15920,6 +15902,12 @@
             <w:insideH w:val="single" w:color="auto" w:sz="4" w:space="0"/>
             <w:insideV w:val="single" w:color="auto" w:sz="4" w:space="0"/>
           </w:tblBorders>
+          <w:tblCellMar>
+            <w:top w:w="0" w:type="dxa"/>
+            <w:left w:w="108" w:type="dxa"/>
+            <w:bottom w:w="0" w:type="dxa"/>
+            <w:right w:w="108" w:type="dxa"/>
+          </w:tblCellMar>
         </w:tblPrEx>
         <w:tc>
           <w:tcPr>
@@ -17303,8 +17291,8 @@
           </w14:textFill>
         </w:rPr>
       </w:pPr>
-      <w:bookmarkStart w:id="1" w:name="_Toc12901"/>
-      <w:bookmarkStart w:id="2" w:name="_Toc131002735"/>
+      <w:bookmarkStart w:id="1" w:name="_Toc131002735"/>
+      <w:bookmarkStart w:id="2" w:name="_Toc12901"/>
       <w:r>
         <w:rPr>
           <w:rFonts w:hint="eastAsia" w:ascii="华文中宋" w:hAnsi="华文中宋" w:eastAsia="华文中宋" w:cs="华文中宋"/>
@@ -20147,6 +20135,7 @@
           <w:tcPr>
             <w:tcW w:w="0" w:type="auto"/>
             <w:vMerge w:val="continue"/>
+            <w:tcBorders/>
             <w:vAlign w:val="center"/>
           </w:tcPr>
           <w:p>
@@ -20283,6 +20272,7 @@
           <w:tcPr>
             <w:tcW w:w="0" w:type="auto"/>
             <w:vMerge w:val="continue"/>
+            <w:tcBorders/>
             <w:vAlign w:val="center"/>
           </w:tcPr>
           <w:p>
@@ -20418,6 +20408,7 @@
           <w:tcPr>
             <w:tcW w:w="0" w:type="auto"/>
             <w:vMerge w:val="continue"/>
+            <w:tcBorders/>
             <w:vAlign w:val="center"/>
           </w:tcPr>
           <w:p>
@@ -20530,6 +20521,145 @@
               </w:rPr>
               <w:t>仓库</w:t>
             </w:r>
+          </w:p>
+        </w:tc>
+      </w:tr>
+      <w:tr>
+        <w:tblPrEx>
+          <w:tblBorders>
+            <w:top w:val="single" w:color="auto" w:sz="4" w:space="0"/>
+            <w:left w:val="single" w:color="auto" w:sz="4" w:space="0"/>
+            <w:bottom w:val="single" w:color="auto" w:sz="4" w:space="0"/>
+            <w:right w:val="single" w:color="auto" w:sz="4" w:space="0"/>
+            <w:insideH w:val="single" w:color="auto" w:sz="4" w:space="0"/>
+            <w:insideV w:val="single" w:color="auto" w:sz="4" w:space="0"/>
+          </w:tblBorders>
+          <w:tblCellMar>
+            <w:top w:w="0" w:type="dxa"/>
+            <w:left w:w="108" w:type="dxa"/>
+            <w:bottom w:w="0" w:type="dxa"/>
+            <w:right w:w="108" w:type="dxa"/>
+          </w:tblCellMar>
+        </w:tblPrEx>
+        <w:tc>
+          <w:tcPr>
+            <w:tcW w:w="0" w:type="auto"/>
+            <w:vMerge w:val="continue"/>
+            <w:tcBorders/>
+            <w:vAlign w:val="center"/>
+          </w:tcPr>
+          <w:p>
+            <w:pPr>
+              <w:bidi w:val="0"/>
+              <w:spacing w:line="240" w:lineRule="auto"/>
+              <w:jc w:val="left"/>
+              <w:rPr>
+                <w:rFonts w:hint="default" w:ascii="华文中宋" w:hAnsi="华文中宋" w:eastAsia="华文中宋" w:cs="华文中宋"/>
+                <w:b/>
+                <w:bCs/>
+                <w:color w:val="FF0000"/>
+                <w:spacing w:val="0"/>
+                <w:sz w:val="21"/>
+                <w:szCs w:val="24"/>
+                <w:vertAlign w:val="baseline"/>
+                <w:lang w:val="en-US" w:eastAsia="zh-CN"/>
+              </w:rPr>
+            </w:pPr>
+          </w:p>
+        </w:tc>
+        <w:tc>
+          <w:tcPr>
+            <w:tcW w:w="0" w:type="auto"/>
+            <w:vAlign w:val="center"/>
+          </w:tcPr>
+          <w:p>
+            <w:pPr>
+              <w:bidi w:val="0"/>
+              <w:spacing w:line="240" w:lineRule="auto"/>
+              <w:jc w:val="left"/>
+              <w:rPr>
+                <w:rFonts w:hint="default" w:ascii="华文中宋" w:hAnsi="华文中宋" w:eastAsia="华文中宋" w:cs="华文中宋"/>
+                <w:b/>
+                <w:bCs/>
+                <w:color w:val="FF0000"/>
+                <w:spacing w:val="0"/>
+                <w:sz w:val="21"/>
+                <w:szCs w:val="24"/>
+                <w:vertAlign w:val="baseline"/>
+                <w:lang w:val="en-US" w:eastAsia="zh-CN"/>
+              </w:rPr>
+            </w:pPr>
+            <w:r>
+              <w:rPr>
+                <w:rFonts w:hint="eastAsia" w:ascii="华文中宋" w:hAnsi="华文中宋" w:eastAsia="华文中宋" w:cs="华文中宋"/>
+                <w:b/>
+                <w:bCs/>
+                <w:color w:val="FF0000"/>
+                <w:spacing w:val="0"/>
+                <w:sz w:val="21"/>
+                <w:szCs w:val="24"/>
+                <w:vertAlign w:val="baseline"/>
+                <w:lang w:val="en-US" w:eastAsia="zh-CN"/>
+              </w:rPr>
+              <w:t>git reset --soft</w:t>
+            </w:r>
+            <w:r>
+              <w:rPr>
+                <w:rFonts w:hint="eastAsia" w:ascii="华文中宋" w:hAnsi="华文中宋" w:cs="华文中宋"/>
+                <w:b/>
+                <w:bCs/>
+                <w:color w:val="FF0000"/>
+                <w:spacing w:val="0"/>
+                <w:sz w:val="21"/>
+                <w:szCs w:val="24"/>
+                <w:vertAlign w:val="baseline"/>
+                <w:lang w:val="en-US" w:eastAsia="zh-CN"/>
+              </w:rPr>
+              <w:t xml:space="preserve"> &lt;commit&gt;</w:t>
+            </w:r>
+          </w:p>
+        </w:tc>
+        <w:tc>
+          <w:tcPr>
+            <w:tcW w:w="0" w:type="auto"/>
+            <w:vAlign w:val="center"/>
+          </w:tcPr>
+          <w:p>
+            <w:pPr>
+              <w:bidi w:val="0"/>
+              <w:spacing w:line="240" w:lineRule="auto"/>
+              <w:jc w:val="left"/>
+              <w:rPr>
+                <w:rFonts w:hint="eastAsia" w:ascii="华文中宋" w:hAnsi="华文中宋" w:eastAsia="华文中宋" w:cs="华文中宋"/>
+                <w:b/>
+                <w:bCs/>
+                <w:color w:val="ED7D31" w:themeColor="accent2"/>
+                <w:spacing w:val="0"/>
+                <w:sz w:val="21"/>
+                <w:szCs w:val="24"/>
+                <w:vertAlign w:val="baseline"/>
+                <w:lang w:val="en-US" w:eastAsia="zh-CN"/>
+                <w14:textFill>
+                  <w14:solidFill>
+                    <w14:schemeClr w14:val="accent2"/>
+                  </w14:solidFill>
+                </w14:textFill>
+              </w:rPr>
+            </w:pPr>
+            <w:bookmarkStart w:id="9" w:name="_GoBack"/>
+            <w:r>
+              <w:rPr>
+                <w:rFonts w:hint="eastAsia" w:ascii="华文中宋" w:hAnsi="华文中宋" w:eastAsia="华文中宋" w:cs="华文中宋"/>
+                <w:b/>
+                <w:bCs/>
+                <w:color w:val="EA82F1"/>
+                <w:sz w:val="21"/>
+                <w:szCs w:val="24"/>
+                <w:lang w:val="en-US" w:eastAsia="zh-CN"/>
+              </w:rPr>
+              <w:t>撤销</w:t>
+            </w:r>
+            <w:bookmarkEnd w:id="9"/>
           </w:p>
         </w:tc>
       </w:tr>
@@ -23477,7 +23607,6 @@
           <w:tcPr>
             <w:tcW w:w="0" w:type="auto"/>
             <w:vMerge w:val="continue"/>
-            <w:tcBorders/>
             <w:vAlign w:val="center"/>
           </w:tcPr>
           <w:p>
@@ -23625,7 +23754,6 @@
           <w:tcPr>
             <w:tcW w:w="0" w:type="auto"/>
             <w:vMerge w:val="continue"/>
-            <w:tcBorders/>
             <w:vAlign w:val="center"/>
           </w:tcPr>
           <w:p>
@@ -23798,7 +23926,6 @@
           <w:tcPr>
             <w:tcW w:w="0" w:type="auto"/>
             <w:vMerge w:val="continue"/>
-            <w:tcBorders/>
             <w:vAlign w:val="center"/>
           </w:tcPr>
           <w:p>
@@ -24087,6 +24214,12 @@
             <w:insideH w:val="single" w:color="auto" w:sz="4" w:space="0"/>
             <w:insideV w:val="single" w:color="auto" w:sz="4" w:space="0"/>
           </w:tblBorders>
+          <w:tblCellMar>
+            <w:top w:w="0" w:type="dxa"/>
+            <w:left w:w="108" w:type="dxa"/>
+            <w:bottom w:w="0" w:type="dxa"/>
+            <w:right w:w="108" w:type="dxa"/>
+          </w:tblCellMar>
         </w:tblPrEx>
         <w:tc>
           <w:tcPr>
@@ -37587,6 +37720,12 @@
             <w:insideH w:val="single" w:color="auto" w:sz="4" w:space="0"/>
             <w:insideV w:val="single" w:color="auto" w:sz="4" w:space="0"/>
           </w:tblBorders>
+          <w:tblCellMar>
+            <w:top w:w="0" w:type="dxa"/>
+            <w:left w:w="108" w:type="dxa"/>
+            <w:bottom w:w="0" w:type="dxa"/>
+            <w:right w:w="108" w:type="dxa"/>
+          </w:tblCellMar>
         </w:tblPrEx>
         <w:trPr>
           <w:trHeight w:val="90" w:hRule="atLeast"/>
@@ -38138,12 +38277,6 @@
             <w:insideH w:val="single" w:color="auto" w:sz="4" w:space="0"/>
             <w:insideV w:val="single" w:color="auto" w:sz="4" w:space="0"/>
           </w:tblBorders>
-          <w:tblCellMar>
-            <w:top w:w="0" w:type="dxa"/>
-            <w:left w:w="108" w:type="dxa"/>
-            <w:bottom w:w="0" w:type="dxa"/>
-            <w:right w:w="108" w:type="dxa"/>
-          </w:tblCellMar>
         </w:tblPrEx>
         <w:tc>
           <w:tcPr>
@@ -40062,6 +40195,12 @@
             <w:insideH w:val="single" w:color="auto" w:sz="4" w:space="0"/>
             <w:insideV w:val="single" w:color="auto" w:sz="4" w:space="0"/>
           </w:tblBorders>
+          <w:tblCellMar>
+            <w:top w:w="0" w:type="dxa"/>
+            <w:left w:w="108" w:type="dxa"/>
+            <w:bottom w:w="0" w:type="dxa"/>
+            <w:right w:w="108" w:type="dxa"/>
+          </w:tblCellMar>
         </w:tblPrEx>
         <w:tc>
           <w:tcPr>
@@ -40721,12 +40860,6 @@
             <w:insideH w:val="single" w:color="auto" w:sz="4" w:space="0"/>
             <w:insideV w:val="single" w:color="auto" w:sz="4" w:space="0"/>
           </w:tblBorders>
-          <w:tblCellMar>
-            <w:top w:w="0" w:type="dxa"/>
-            <w:left w:w="108" w:type="dxa"/>
-            <w:bottom w:w="0" w:type="dxa"/>
-            <w:right w:w="108" w:type="dxa"/>
-          </w:tblCellMar>
         </w:tblPrEx>
         <w:tc>
           <w:tcPr>
@@ -42991,12 +43124,6 @@
             <w:insideH w:val="single" w:color="auto" w:sz="4" w:space="0"/>
             <w:insideV w:val="single" w:color="auto" w:sz="4" w:space="0"/>
           </w:tblBorders>
-          <w:tblCellMar>
-            <w:top w:w="0" w:type="dxa"/>
-            <w:left w:w="108" w:type="dxa"/>
-            <w:bottom w:w="0" w:type="dxa"/>
-            <w:right w:w="108" w:type="dxa"/>
-          </w:tblCellMar>
         </w:tblPrEx>
         <w:tc>
           <w:tcPr>
@@ -44354,6 +44481,12 @@
             <w:insideH w:val="single" w:color="auto" w:sz="4" w:space="0"/>
             <w:insideV w:val="single" w:color="auto" w:sz="4" w:space="0"/>
           </w:tblBorders>
+          <w:tblCellMar>
+            <w:top w:w="0" w:type="dxa"/>
+            <w:left w:w="108" w:type="dxa"/>
+            <w:bottom w:w="0" w:type="dxa"/>
+            <w:right w:w="108" w:type="dxa"/>
+          </w:tblCellMar>
         </w:tblPrEx>
         <w:tc>
           <w:tcPr>

</xml_diff>

<commit_message>
update on 2025-07-15 15:09:48.633097
</commit_message>
<xml_diff>
--- a/cfg - system.docx
+++ b/cfg - system.docx
@@ -4164,6 +4164,12 @@
             <w:insideH w:val="single" w:color="auto" w:sz="4" w:space="0"/>
             <w:insideV w:val="single" w:color="auto" w:sz="4" w:space="0"/>
           </w:tblBorders>
+          <w:tblCellMar>
+            <w:top w:w="0" w:type="dxa"/>
+            <w:left w:w="108" w:type="dxa"/>
+            <w:bottom w:w="0" w:type="dxa"/>
+            <w:right w:w="108" w:type="dxa"/>
+          </w:tblCellMar>
         </w:tblPrEx>
         <w:tc>
           <w:tcPr>
@@ -6153,12 +6159,6 @@
             <w:insideH w:val="single" w:color="auto" w:sz="4" w:space="0"/>
             <w:insideV w:val="single" w:color="auto" w:sz="4" w:space="0"/>
           </w:tblBorders>
-          <w:tblCellMar>
-            <w:top w:w="0" w:type="dxa"/>
-            <w:left w:w="108" w:type="dxa"/>
-            <w:bottom w:w="0" w:type="dxa"/>
-            <w:right w:w="108" w:type="dxa"/>
-          </w:tblCellMar>
         </w:tblPrEx>
         <w:tc>
           <w:tcPr>
@@ -6438,6 +6438,12 @@
             <w:insideH w:val="single" w:color="auto" w:sz="4" w:space="0"/>
             <w:insideV w:val="single" w:color="auto" w:sz="4" w:space="0"/>
           </w:tblBorders>
+          <w:tblCellMar>
+            <w:top w:w="0" w:type="dxa"/>
+            <w:left w:w="108" w:type="dxa"/>
+            <w:bottom w:w="0" w:type="dxa"/>
+            <w:right w:w="108" w:type="dxa"/>
+          </w:tblCellMar>
         </w:tblPrEx>
         <w:tc>
           <w:tcPr>
@@ -13005,6 +13011,12 @@
             <w:insideH w:val="single" w:color="auto" w:sz="4" w:space="0"/>
             <w:insideV w:val="single" w:color="auto" w:sz="4" w:space="0"/>
           </w:tblBorders>
+          <w:tblCellMar>
+            <w:top w:w="0" w:type="dxa"/>
+            <w:left w:w="108" w:type="dxa"/>
+            <w:bottom w:w="0" w:type="dxa"/>
+            <w:right w:w="108" w:type="dxa"/>
+          </w:tblCellMar>
         </w:tblPrEx>
         <w:tc>
           <w:tcPr>
@@ -13172,12 +13184,6 @@
             <w:insideH w:val="single" w:color="auto" w:sz="4" w:space="0"/>
             <w:insideV w:val="single" w:color="auto" w:sz="4" w:space="0"/>
           </w:tblBorders>
-          <w:tblCellMar>
-            <w:top w:w="0" w:type="dxa"/>
-            <w:left w:w="108" w:type="dxa"/>
-            <w:bottom w:w="0" w:type="dxa"/>
-            <w:right w:w="108" w:type="dxa"/>
-          </w:tblCellMar>
         </w:tblPrEx>
         <w:tc>
           <w:tcPr>
@@ -20135,7 +20141,6 @@
           <w:tcPr>
             <w:tcW w:w="0" w:type="auto"/>
             <w:vMerge w:val="continue"/>
-            <w:tcBorders/>
             <w:vAlign w:val="center"/>
           </w:tcPr>
           <w:p>
@@ -20272,7 +20277,6 @@
           <w:tcPr>
             <w:tcW w:w="0" w:type="auto"/>
             <w:vMerge w:val="continue"/>
-            <w:tcBorders/>
             <w:vAlign w:val="center"/>
           </w:tcPr>
           <w:p>
@@ -20305,7 +20309,7 @@
               <w:spacing w:line="240" w:lineRule="auto"/>
               <w:jc w:val="left"/>
               <w:rPr>
-                <w:rFonts w:hint="eastAsia" w:ascii="华文中宋" w:hAnsi="华文中宋" w:eastAsia="华文中宋" w:cs="华文中宋"/>
+                <w:rFonts w:hint="default" w:ascii="华文中宋" w:hAnsi="华文中宋" w:eastAsia="华文中宋" w:cs="华文中宋"/>
                 <w:b/>
                 <w:bCs/>
                 <w:color w:val="FF0000"/>
@@ -20330,6 +20334,20 @@
                 <w:lang w:val="en-US" w:eastAsia="zh-CN"/>
               </w:rPr>
               <w:t>git add &lt;path&gt;</w:t>
+            </w:r>
+            <w:r>
+              <w:rPr>
+                <w:rFonts w:hint="eastAsia" w:ascii="华文中宋" w:hAnsi="华文中宋" w:cs="华文中宋"/>
+                <w:b/>
+                <w:bCs/>
+                <w:color w:val="FF0000"/>
+                <w:spacing w:val="0"/>
+                <w:sz w:val="21"/>
+                <w:szCs w:val="24"/>
+                <w:vertAlign w:val="baseline"/>
+                <w:lang w:val="en-US" w:eastAsia="zh-CN"/>
+              </w:rPr>
+              <w:t xml:space="preserve"> --renormalize</w:t>
             </w:r>
           </w:p>
         </w:tc>
@@ -20408,7 +20426,6 @@
           <w:tcPr>
             <w:tcW w:w="0" w:type="auto"/>
             <w:vMerge w:val="continue"/>
-            <w:tcBorders/>
             <w:vAlign w:val="center"/>
           </w:tcPr>
           <w:p>
@@ -20545,7 +20562,6 @@
           <w:tcPr>
             <w:tcW w:w="0" w:type="auto"/>
             <w:vMerge w:val="continue"/>
-            <w:tcBorders/>
             <w:vAlign w:val="center"/>
           </w:tcPr>
           <w:p>
@@ -20601,7 +20617,7 @@
                 <w:vertAlign w:val="baseline"/>
                 <w:lang w:val="en-US" w:eastAsia="zh-CN"/>
               </w:rPr>
-              <w:t>git reset --soft</w:t>
+              <w:t>git reset</w:t>
             </w:r>
             <w:r>
               <w:rPr>
@@ -20646,7 +20662,6 @@
                 </w14:textFill>
               </w:rPr>
             </w:pPr>
-            <w:bookmarkStart w:id="9" w:name="_GoBack"/>
             <w:r>
               <w:rPr>
                 <w:rFonts w:hint="eastAsia" w:ascii="华文中宋" w:hAnsi="华文中宋" w:eastAsia="华文中宋" w:cs="华文中宋"/>
@@ -20659,7 +20674,6 @@
               </w:rPr>
               <w:t>撤销</w:t>
             </w:r>
-            <w:bookmarkEnd w:id="9"/>
           </w:p>
         </w:tc>
       </w:tr>
@@ -20844,6 +20858,8 @@
                 </w14:textFill>
               </w:rPr>
             </w:pPr>
+            <w:bookmarkStart w:id="9" w:name="_GoBack"/>
+            <w:bookmarkEnd w:id="9"/>
           </w:p>
         </w:tc>
         <w:tc>
@@ -20880,7 +20896,7 @@
                 <w:vertAlign w:val="baseline"/>
                 <w:lang w:val="en-US" w:eastAsia="zh-CN"/>
               </w:rPr>
-              <w:t>git rm &lt;path&gt;</w:t>
+              <w:t>git log</w:t>
             </w:r>
           </w:p>
         </w:tc>
@@ -20909,12 +20925,31 @@
                 <w:rFonts w:hint="eastAsia" w:ascii="华文中宋" w:hAnsi="华文中宋" w:eastAsia="华文中宋" w:cs="华文中宋"/>
                 <w:b/>
                 <w:bCs/>
+                <w:color w:val="ED7D31" w:themeColor="accent2"/>
+                <w:spacing w:val="0"/>
+                <w:sz w:val="21"/>
+                <w:szCs w:val="24"/>
+                <w:vertAlign w:val="baseline"/>
+                <w:lang w:val="en-US" w:eastAsia="zh-CN"/>
+                <w14:textFill>
+                  <w14:solidFill>
+                    <w14:schemeClr w14:val="accent2"/>
+                  </w14:solidFill>
+                </w14:textFill>
+              </w:rPr>
+              <w:t>获取</w:t>
+            </w:r>
+            <w:r>
+              <w:rPr>
+                <w:rFonts w:hint="eastAsia" w:ascii="华文中宋" w:hAnsi="华文中宋" w:eastAsia="华文中宋" w:cs="华文中宋"/>
+                <w:b/>
+                <w:bCs/>
                 <w:color w:val="EA82F1"/>
                 <w:sz w:val="21"/>
                 <w:szCs w:val="24"/>
                 <w:lang w:val="en-US" w:eastAsia="zh-CN"/>
               </w:rPr>
-              <w:t>删除文件</w:t>
+              <w:t>版本信息</w:t>
             </w:r>
           </w:p>
         </w:tc>
@@ -21000,7 +21035,35 @@
                 <w:vertAlign w:val="baseline"/>
                 <w:lang w:val="en-US" w:eastAsia="zh-CN"/>
               </w:rPr>
-              <w:t>git log</w:t>
+              <w:t>git checkout</w:t>
+            </w:r>
+            <w:r>
+              <w:rPr>
+                <w:rFonts w:hint="eastAsia" w:ascii="华文中宋" w:hAnsi="华文中宋" w:cs="华文中宋"/>
+                <w:b/>
+                <w:bCs/>
+                <w:color w:val="FF0000"/>
+                <w:spacing w:val="0"/>
+                <w:sz w:val="21"/>
+                <w:szCs w:val="24"/>
+                <w:vertAlign w:val="baseline"/>
+                <w:lang w:val="en-US" w:eastAsia="zh-CN"/>
+              </w:rPr>
+              <w:t xml:space="preserve"> -f</w:t>
+            </w:r>
+            <w:r>
+              <w:rPr>
+                <w:rFonts w:hint="eastAsia" w:ascii="华文中宋" w:hAnsi="华文中宋" w:eastAsia="华文中宋" w:cs="华文中宋"/>
+                <w:b/>
+                <w:bCs/>
+                <w:color w:val="FF0000"/>
+                <w:spacing w:val="0"/>
+                <w:sz w:val="21"/>
+                <w:szCs w:val="24"/>
+                <w:vertAlign w:val="baseline"/>
+                <w:lang w:val="en-US" w:eastAsia="zh-CN"/>
+              </w:rPr>
+              <w:t xml:space="preserve"> &lt;vid&gt;</w:t>
             </w:r>
           </w:p>
         </w:tc>
@@ -21029,31 +21092,31 @@
                 <w:rFonts w:hint="eastAsia" w:ascii="华文中宋" w:hAnsi="华文中宋" w:eastAsia="华文中宋" w:cs="华文中宋"/>
                 <w:b/>
                 <w:bCs/>
-                <w:color w:val="ED7D31" w:themeColor="accent2"/>
-                <w:spacing w:val="0"/>
-                <w:sz w:val="21"/>
-                <w:szCs w:val="24"/>
-                <w:vertAlign w:val="baseline"/>
-                <w:lang w:val="en-US" w:eastAsia="zh-CN"/>
-                <w14:textFill>
-                  <w14:solidFill>
-                    <w14:schemeClr w14:val="accent2"/>
-                  </w14:solidFill>
-                </w14:textFill>
-              </w:rPr>
-              <w:t>获取</w:t>
-            </w:r>
-            <w:r>
-              <w:rPr>
-                <w:rFonts w:hint="eastAsia" w:ascii="华文中宋" w:hAnsi="华文中宋" w:eastAsia="华文中宋" w:cs="华文中宋"/>
-                <w:b/>
-                <w:bCs/>
                 <w:color w:val="EA82F1"/>
                 <w:sz w:val="21"/>
                 <w:szCs w:val="24"/>
                 <w:lang w:val="en-US" w:eastAsia="zh-CN"/>
               </w:rPr>
-              <w:t>版本信息</w:t>
+              <w:t>回退</w:t>
+            </w:r>
+            <w:r>
+              <w:rPr>
+                <w:rFonts w:hint="eastAsia" w:ascii="华文中宋" w:hAnsi="华文中宋" w:eastAsia="华文中宋" w:cs="华文中宋"/>
+                <w:b/>
+                <w:bCs/>
+                <w:color w:val="ED7D31" w:themeColor="accent2"/>
+                <w:spacing w:val="0"/>
+                <w:sz w:val="21"/>
+                <w:szCs w:val="24"/>
+                <w:vertAlign w:val="baseline"/>
+                <w:lang w:val="en-US" w:eastAsia="zh-CN"/>
+                <w14:textFill>
+                  <w14:solidFill>
+                    <w14:schemeClr w14:val="accent2"/>
+                  </w14:solidFill>
+                </w14:textFill>
+              </w:rPr>
+              <w:t>到指定版本</w:t>
             </w:r>
           </w:p>
         </w:tc>
@@ -21108,6 +21171,7 @@
         <w:tc>
           <w:tcPr>
             <w:tcW w:w="0" w:type="auto"/>
+            <w:shd w:val="clear"/>
             <w:vAlign w:val="center"/>
           </w:tcPr>
           <w:p>
@@ -21116,64 +21180,38 @@
               <w:spacing w:line="240" w:lineRule="auto"/>
               <w:jc w:val="left"/>
               <w:rPr>
-                <w:rFonts w:hint="default" w:ascii="华文中宋" w:hAnsi="华文中宋" w:eastAsia="华文中宋" w:cs="华文中宋"/>
-                <w:b/>
-                <w:bCs/>
-                <w:color w:val="FF0000"/>
-                <w:spacing w:val="0"/>
-                <w:sz w:val="21"/>
-                <w:szCs w:val="24"/>
-                <w:vertAlign w:val="baseline"/>
-                <w:lang w:val="en-US" w:eastAsia="zh-CN"/>
-              </w:rPr>
-            </w:pPr>
-            <w:r>
-              <w:rPr>
-                <w:rFonts w:hint="eastAsia" w:ascii="华文中宋" w:hAnsi="华文中宋" w:eastAsia="华文中宋" w:cs="华文中宋"/>
-                <w:b/>
-                <w:bCs/>
-                <w:color w:val="FF0000"/>
-                <w:spacing w:val="0"/>
-                <w:sz w:val="21"/>
-                <w:szCs w:val="24"/>
-                <w:vertAlign w:val="baseline"/>
-                <w:lang w:val="en-US" w:eastAsia="zh-CN"/>
-              </w:rPr>
-              <w:t>git checkout</w:t>
-            </w:r>
-            <w:r>
-              <w:rPr>
-                <w:rFonts w:hint="eastAsia" w:ascii="华文中宋" w:hAnsi="华文中宋" w:cs="华文中宋"/>
-                <w:b/>
-                <w:bCs/>
-                <w:color w:val="FF0000"/>
-                <w:spacing w:val="0"/>
-                <w:sz w:val="21"/>
-                <w:szCs w:val="24"/>
-                <w:vertAlign w:val="baseline"/>
-                <w:lang w:val="en-US" w:eastAsia="zh-CN"/>
-              </w:rPr>
-              <w:t xml:space="preserve"> -f</w:t>
-            </w:r>
-            <w:r>
-              <w:rPr>
-                <w:rFonts w:hint="eastAsia" w:ascii="华文中宋" w:hAnsi="华文中宋" w:eastAsia="华文中宋" w:cs="华文中宋"/>
-                <w:b/>
-                <w:bCs/>
-                <w:color w:val="FF0000"/>
-                <w:spacing w:val="0"/>
-                <w:sz w:val="21"/>
-                <w:szCs w:val="24"/>
-                <w:vertAlign w:val="baseline"/>
-                <w:lang w:val="en-US" w:eastAsia="zh-CN"/>
-              </w:rPr>
-              <w:t xml:space="preserve"> &lt;vid&gt;</w:t>
-            </w:r>
-          </w:p>
-        </w:tc>
-        <w:tc>
-          <w:tcPr>
-            <w:tcW w:w="0" w:type="auto"/>
+                <w:rFonts w:hint="eastAsia" w:ascii="华文中宋" w:hAnsi="华文中宋" w:eastAsia="华文中宋" w:cs="华文中宋"/>
+                <w:b/>
+                <w:bCs/>
+                <w:color w:val="FF0000"/>
+                <w:spacing w:val="0"/>
+                <w:kern w:val="2"/>
+                <w:sz w:val="21"/>
+                <w:szCs w:val="24"/>
+                <w:vertAlign w:val="baseline"/>
+                <w:lang w:val="en-US" w:eastAsia="zh-CN" w:bidi="ar-SA"/>
+              </w:rPr>
+            </w:pPr>
+            <w:r>
+              <w:rPr>
+                <w:rFonts w:hint="eastAsia" w:ascii="华文中宋" w:hAnsi="华文中宋" w:eastAsia="华文中宋" w:cs="华文中宋"/>
+                <w:b/>
+                <w:bCs/>
+                <w:color w:val="FF0000"/>
+                <w:spacing w:val="0"/>
+                <w:sz w:val="21"/>
+                <w:szCs w:val="24"/>
+                <w:vertAlign w:val="baseline"/>
+                <w:lang w:val="en-US" w:eastAsia="zh-CN"/>
+              </w:rPr>
+              <w:t>git rm &lt;path&gt;</w:t>
+            </w:r>
+          </w:p>
+        </w:tc>
+        <w:tc>
+          <w:tcPr>
+            <w:tcW w:w="0" w:type="auto"/>
+            <w:shd w:val="clear"/>
             <w:vAlign w:val="center"/>
           </w:tcPr>
           <w:p>
@@ -21182,13 +21220,15 @@
               <w:spacing w:line="240" w:lineRule="auto"/>
               <w:jc w:val="left"/>
               <w:rPr>
-                <w:rFonts w:hint="default" w:ascii="华文中宋" w:hAnsi="华文中宋" w:eastAsia="华文中宋" w:cs="华文中宋"/>
+                <w:rFonts w:hint="eastAsia" w:ascii="华文中宋" w:hAnsi="华文中宋" w:eastAsia="华文中宋" w:cs="华文中宋"/>
                 <w:b/>
                 <w:bCs/>
                 <w:color w:val="EA82F1"/>
-                <w:sz w:val="21"/>
-                <w:szCs w:val="24"/>
-                <w:lang w:val="en-US" w:eastAsia="zh-CN"/>
+                <w:spacing w:val="6"/>
+                <w:kern w:val="2"/>
+                <w:sz w:val="21"/>
+                <w:szCs w:val="24"/>
+                <w:lang w:val="en-US" w:eastAsia="zh-CN" w:bidi="ar-SA"/>
               </w:rPr>
             </w:pPr>
             <w:r>
@@ -21201,26 +21241,7 @@
                 <w:szCs w:val="24"/>
                 <w:lang w:val="en-US" w:eastAsia="zh-CN"/>
               </w:rPr>
-              <w:t>回退</w:t>
-            </w:r>
-            <w:r>
-              <w:rPr>
-                <w:rFonts w:hint="eastAsia" w:ascii="华文中宋" w:hAnsi="华文中宋" w:eastAsia="华文中宋" w:cs="华文中宋"/>
-                <w:b/>
-                <w:bCs/>
-                <w:color w:val="ED7D31" w:themeColor="accent2"/>
-                <w:spacing w:val="0"/>
-                <w:sz w:val="21"/>
-                <w:szCs w:val="24"/>
-                <w:vertAlign w:val="baseline"/>
-                <w:lang w:val="en-US" w:eastAsia="zh-CN"/>
-                <w14:textFill>
-                  <w14:solidFill>
-                    <w14:schemeClr w14:val="accent2"/>
-                  </w14:solidFill>
-                </w14:textFill>
-              </w:rPr>
-              <w:t>到指定版本</w:t>
+              <w:t>删除文件</w:t>
             </w:r>
           </w:p>
         </w:tc>
@@ -23987,7 +24008,7 @@
                 <w:vertAlign w:val="baseline"/>
                 <w:lang w:val="en-US" w:eastAsia="zh-CN"/>
               </w:rPr>
-              <w:t>git push origin --force --all</w:t>
+              <w:t>git push origin -f --all</w:t>
             </w:r>
           </w:p>
           <w:p>
@@ -24019,7 +24040,7 @@
                 <w:vertAlign w:val="baseline"/>
                 <w:lang w:val="en-US" w:eastAsia="zh-CN"/>
               </w:rPr>
-              <w:t>git push origin --force --tags</w:t>
+              <w:t>git push origin -f --tags</w:t>
             </w:r>
           </w:p>
         </w:tc>
@@ -29846,12 +29867,6 @@
             <w:insideH w:val="single" w:color="auto" w:sz="4" w:space="0"/>
             <w:insideV w:val="single" w:color="auto" w:sz="4" w:space="0"/>
           </w:tblBorders>
-          <w:tblCellMar>
-            <w:top w:w="0" w:type="dxa"/>
-            <w:left w:w="108" w:type="dxa"/>
-            <w:bottom w:w="0" w:type="dxa"/>
-            <w:right w:w="108" w:type="dxa"/>
-          </w:tblCellMar>
         </w:tblPrEx>
         <w:tc>
           <w:tcPr>
@@ -31716,12 +31731,6 @@
             <w:insideH w:val="single" w:color="auto" w:sz="4" w:space="0"/>
             <w:insideV w:val="single" w:color="auto" w:sz="4" w:space="0"/>
           </w:tblBorders>
-          <w:tblCellMar>
-            <w:top w:w="0" w:type="dxa"/>
-            <w:left w:w="108" w:type="dxa"/>
-            <w:bottom w:w="0" w:type="dxa"/>
-            <w:right w:w="108" w:type="dxa"/>
-          </w:tblCellMar>
         </w:tblPrEx>
         <w:trPr>
           <w:trHeight w:val="90" w:hRule="atLeast"/>
@@ -38277,6 +38286,12 @@
             <w:insideH w:val="single" w:color="auto" w:sz="4" w:space="0"/>
             <w:insideV w:val="single" w:color="auto" w:sz="4" w:space="0"/>
           </w:tblBorders>
+          <w:tblCellMar>
+            <w:top w:w="0" w:type="dxa"/>
+            <w:left w:w="108" w:type="dxa"/>
+            <w:bottom w:w="0" w:type="dxa"/>
+            <w:right w:w="108" w:type="dxa"/>
+          </w:tblCellMar>
         </w:tblPrEx>
         <w:tc>
           <w:tcPr>
@@ -40860,6 +40875,12 @@
             <w:insideH w:val="single" w:color="auto" w:sz="4" w:space="0"/>
             <w:insideV w:val="single" w:color="auto" w:sz="4" w:space="0"/>
           </w:tblBorders>
+          <w:tblCellMar>
+            <w:top w:w="0" w:type="dxa"/>
+            <w:left w:w="108" w:type="dxa"/>
+            <w:bottom w:w="0" w:type="dxa"/>
+            <w:right w:w="108" w:type="dxa"/>
+          </w:tblCellMar>
         </w:tblPrEx>
         <w:tc>
           <w:tcPr>
@@ -43124,6 +43145,12 @@
             <w:insideH w:val="single" w:color="auto" w:sz="4" w:space="0"/>
             <w:insideV w:val="single" w:color="auto" w:sz="4" w:space="0"/>
           </w:tblBorders>
+          <w:tblCellMar>
+            <w:top w:w="0" w:type="dxa"/>
+            <w:left w:w="108" w:type="dxa"/>
+            <w:bottom w:w="0" w:type="dxa"/>
+            <w:right w:w="108" w:type="dxa"/>
+          </w:tblCellMar>
         </w:tblPrEx>
         <w:tc>
           <w:tcPr>

</xml_diff>

<commit_message>
update on 2025-07-18 02:32:23.639768
</commit_message>
<xml_diff>
--- a/cfg - system.docx
+++ b/cfg - system.docx
@@ -6159,6 +6159,12 @@
             <w:insideH w:val="single" w:color="auto" w:sz="4" w:space="0"/>
             <w:insideV w:val="single" w:color="auto" w:sz="4" w:space="0"/>
           </w:tblBorders>
+          <w:tblCellMar>
+            <w:top w:w="0" w:type="dxa"/>
+            <w:left w:w="108" w:type="dxa"/>
+            <w:bottom w:w="0" w:type="dxa"/>
+            <w:right w:w="108" w:type="dxa"/>
+          </w:tblCellMar>
         </w:tblPrEx>
         <w:tc>
           <w:tcPr>
@@ -10349,12 +10355,6 @@
             <w:insideH w:val="single" w:color="auto" w:sz="4" w:space="0"/>
             <w:insideV w:val="single" w:color="auto" w:sz="4" w:space="0"/>
           </w:tblBorders>
-          <w:tblCellMar>
-            <w:top w:w="0" w:type="dxa"/>
-            <w:left w:w="108" w:type="dxa"/>
-            <w:bottom w:w="0" w:type="dxa"/>
-            <w:right w:w="108" w:type="dxa"/>
-          </w:tblCellMar>
         </w:tblPrEx>
         <w:tc>
           <w:tcPr>
@@ -13184,6 +13184,12 @@
             <w:insideH w:val="single" w:color="auto" w:sz="4" w:space="0"/>
             <w:insideV w:val="single" w:color="auto" w:sz="4" w:space="0"/>
           </w:tblBorders>
+          <w:tblCellMar>
+            <w:top w:w="0" w:type="dxa"/>
+            <w:left w:w="108" w:type="dxa"/>
+            <w:bottom w:w="0" w:type="dxa"/>
+            <w:right w:w="108" w:type="dxa"/>
+          </w:tblCellMar>
         </w:tblPrEx>
         <w:tc>
           <w:tcPr>
@@ -14194,12 +14200,6 @@
             <w:insideH w:val="single" w:color="auto" w:sz="4" w:space="0"/>
             <w:insideV w:val="single" w:color="auto" w:sz="4" w:space="0"/>
           </w:tblBorders>
-          <w:tblCellMar>
-            <w:top w:w="0" w:type="dxa"/>
-            <w:left w:w="108" w:type="dxa"/>
-            <w:bottom w:w="0" w:type="dxa"/>
-            <w:right w:w="108" w:type="dxa"/>
-          </w:tblCellMar>
         </w:tblPrEx>
         <w:tc>
           <w:tcPr>
@@ -18625,6 +18625,118 @@
         <w:spacing w:line="240" w:lineRule="auto"/>
         <w:jc w:val="left"/>
         <w:rPr>
+          <w:rFonts w:hint="eastAsia" w:ascii="华文中宋" w:hAnsi="华文中宋" w:eastAsia="华文中宋" w:cs="华文中宋"/>
+          <w:b/>
+          <w:bCs/>
+          <w:color w:val="ED7D31" w:themeColor="accent2"/>
+          <w:spacing w:val="0"/>
+          <w:sz w:val="21"/>
+          <w:szCs w:val="24"/>
+          <w:vertAlign w:val="baseline"/>
+          <w:lang w:val="en-US" w:eastAsia="zh-CN"/>
+          <w14:textFill>
+            <w14:solidFill>
+              <w14:schemeClr w14:val="accent2"/>
+            </w14:solidFill>
+          </w14:textFill>
+        </w:rPr>
+      </w:pPr>
+      <w:r>
+        <w:rPr>
+          <w:rFonts w:hint="eastAsia" w:ascii="华文中宋" w:hAnsi="华文中宋" w:eastAsia="华文中宋" w:cs="华文中宋"/>
+          <w:b/>
+          <w:bCs/>
+          <w:color w:val="ED7D31" w:themeColor="accent2"/>
+          <w:spacing w:val="0"/>
+          <w:sz w:val="21"/>
+          <w:szCs w:val="24"/>
+          <w:vertAlign w:val="baseline"/>
+          <w:lang w:val="en-US" w:eastAsia="zh-CN"/>
+          <w14:textFill>
+            <w14:solidFill>
+              <w14:schemeClr w14:val="accent2"/>
+            </w14:solidFill>
+          </w14:textFill>
+        </w:rPr>
+        <w:t>git config --global http.proxy "</w:t>
+      </w:r>
+      <w:bookmarkStart w:id="9" w:name="_GoBack"/>
+      <w:bookmarkEnd w:id="9"/>
+      <w:r>
+        <w:rPr>
+          <w:rFonts w:hint="eastAsia" w:ascii="华文中宋" w:hAnsi="华文中宋" w:eastAsia="华文中宋" w:cs="华文中宋"/>
+          <w:b/>
+          <w:bCs/>
+          <w:color w:val="ED7D31" w:themeColor="accent2"/>
+          <w:spacing w:val="0"/>
+          <w:sz w:val="21"/>
+          <w:szCs w:val="24"/>
+          <w:vertAlign w:val="baseline"/>
+          <w:lang w:val="en-US" w:eastAsia="zh-CN"/>
+          <w14:textFill>
+            <w14:solidFill>
+              <w14:schemeClr w14:val="accent2"/>
+            </w14:solidFill>
+          </w14:textFill>
+        </w:rPr>
+        <w:t>http://127.0.0.1:8080"</w:t>
+      </w:r>
+    </w:p>
+    <w:p>
+      <w:pPr>
+        <w:bidi w:val="0"/>
+        <w:spacing w:line="240" w:lineRule="auto"/>
+        <w:jc w:val="left"/>
+        <w:rPr>
+          <w:rFonts w:hint="eastAsia" w:ascii="华文中宋" w:hAnsi="华文中宋" w:eastAsia="华文中宋" w:cs="华文中宋"/>
+          <w:b/>
+          <w:bCs/>
+          <w:color w:val="ED7D31" w:themeColor="accent2"/>
+          <w:spacing w:val="0"/>
+          <w:sz w:val="21"/>
+          <w:szCs w:val="24"/>
+          <w:vertAlign w:val="baseline"/>
+          <w:lang w:val="en-US" w:eastAsia="zh-CN"/>
+          <w14:textFill>
+            <w14:solidFill>
+              <w14:schemeClr w14:val="accent2"/>
+            </w14:solidFill>
+          </w14:textFill>
+        </w:rPr>
+      </w:pPr>
+      <w:r>
+        <w:rPr>
+          <w:rFonts w:hint="eastAsia" w:ascii="华文中宋" w:hAnsi="华文中宋" w:eastAsia="华文中宋" w:cs="华文中宋"/>
+          <w:b/>
+          <w:bCs/>
+          <w:color w:val="ED7D31" w:themeColor="accent2"/>
+          <w:spacing w:val="0"/>
+          <w:sz w:val="21"/>
+          <w:szCs w:val="24"/>
+          <w:vertAlign w:val="baseline"/>
+          <w:lang w:val="en-US" w:eastAsia="zh-CN"/>
+          <w14:textFill>
+            <w14:solidFill>
+              <w14:schemeClr w14:val="accent2"/>
+            </w14:solidFill>
+          </w14:textFill>
+        </w:rPr>
+        <w:t>git config --global https.proxy "http://127.0.0.1:8080"</w:t>
+      </w:r>
+    </w:p>
+    <w:p>
+      <w:pPr>
+        <w:bidi w:val="0"/>
+        <w:spacing w:line="240" w:lineRule="auto"/>
+        <w:jc w:val="left"/>
+      </w:pPr>
+    </w:p>
+    <w:p>
+      <w:pPr>
+        <w:bidi w:val="0"/>
+        <w:spacing w:line="240" w:lineRule="auto"/>
+        <w:jc w:val="left"/>
+        <w:rPr>
           <w:rFonts w:hint="default" w:ascii="华文中宋" w:hAnsi="华文中宋" w:eastAsia="华文中宋" w:cs="华文中宋"/>
           <w:b/>
           <w:bCs/>
@@ -20858,8 +20970,6 @@
                 </w14:textFill>
               </w:rPr>
             </w:pPr>
-            <w:bookmarkStart w:id="9" w:name="_GoBack"/>
-            <w:bookmarkEnd w:id="9"/>
           </w:p>
         </w:tc>
         <w:tc>
@@ -21171,7 +21281,7 @@
         <w:tc>
           <w:tcPr>
             <w:tcW w:w="0" w:type="auto"/>
-            <w:shd w:val="clear"/>
+            <w:shd w:val="clear" w:color="auto" w:fill="auto"/>
             <w:vAlign w:val="center"/>
           </w:tcPr>
           <w:p>
@@ -21211,7 +21321,7 @@
         <w:tc>
           <w:tcPr>
             <w:tcW w:w="0" w:type="auto"/>
-            <w:shd w:val="clear"/>
+            <w:shd w:val="clear" w:color="auto" w:fill="auto"/>
             <w:vAlign w:val="center"/>
           </w:tcPr>
           <w:p>
@@ -29867,6 +29977,12 @@
             <w:insideH w:val="single" w:color="auto" w:sz="4" w:space="0"/>
             <w:insideV w:val="single" w:color="auto" w:sz="4" w:space="0"/>
           </w:tblBorders>
+          <w:tblCellMar>
+            <w:top w:w="0" w:type="dxa"/>
+            <w:left w:w="108" w:type="dxa"/>
+            <w:bottom w:w="0" w:type="dxa"/>
+            <w:right w:w="108" w:type="dxa"/>
+          </w:tblCellMar>
         </w:tblPrEx>
         <w:tc>
           <w:tcPr>
@@ -31731,6 +31847,12 @@
             <w:insideH w:val="single" w:color="auto" w:sz="4" w:space="0"/>
             <w:insideV w:val="single" w:color="auto" w:sz="4" w:space="0"/>
           </w:tblBorders>
+          <w:tblCellMar>
+            <w:top w:w="0" w:type="dxa"/>
+            <w:left w:w="108" w:type="dxa"/>
+            <w:bottom w:w="0" w:type="dxa"/>
+            <w:right w:w="108" w:type="dxa"/>
+          </w:tblCellMar>
         </w:tblPrEx>
         <w:trPr>
           <w:trHeight w:val="90" w:hRule="atLeast"/>
@@ -38122,12 +38244,6 @@
             <w:insideH w:val="single" w:color="auto" w:sz="4" w:space="0"/>
             <w:insideV w:val="single" w:color="auto" w:sz="4" w:space="0"/>
           </w:tblBorders>
-          <w:tblCellMar>
-            <w:top w:w="0" w:type="dxa"/>
-            <w:left w:w="108" w:type="dxa"/>
-            <w:bottom w:w="0" w:type="dxa"/>
-            <w:right w:w="108" w:type="dxa"/>
-          </w:tblCellMar>
         </w:tblPrEx>
         <w:tc>
           <w:tcPr>
@@ -38784,12 +38900,6 @@
             <w:insideH w:val="single" w:color="auto" w:sz="4" w:space="0"/>
             <w:insideV w:val="single" w:color="auto" w:sz="4" w:space="0"/>
           </w:tblBorders>
-          <w:tblCellMar>
-            <w:top w:w="0" w:type="dxa"/>
-            <w:left w:w="108" w:type="dxa"/>
-            <w:bottom w:w="0" w:type="dxa"/>
-            <w:right w:w="108" w:type="dxa"/>
-          </w:tblCellMar>
         </w:tblPrEx>
         <w:tc>
           <w:tcPr>
@@ -40210,12 +40320,6 @@
             <w:insideH w:val="single" w:color="auto" w:sz="4" w:space="0"/>
             <w:insideV w:val="single" w:color="auto" w:sz="4" w:space="0"/>
           </w:tblBorders>
-          <w:tblCellMar>
-            <w:top w:w="0" w:type="dxa"/>
-            <w:left w:w="108" w:type="dxa"/>
-            <w:bottom w:w="0" w:type="dxa"/>
-            <w:right w:w="108" w:type="dxa"/>
-          </w:tblCellMar>
         </w:tblPrEx>
         <w:tc>
           <w:tcPr>
@@ -41691,12 +41795,6 @@
             <w:insideH w:val="single" w:color="auto" w:sz="4" w:space="0"/>
             <w:insideV w:val="single" w:color="auto" w:sz="4" w:space="0"/>
           </w:tblBorders>
-          <w:tblCellMar>
-            <w:top w:w="0" w:type="dxa"/>
-            <w:left w:w="108" w:type="dxa"/>
-            <w:bottom w:w="0" w:type="dxa"/>
-            <w:right w:w="108" w:type="dxa"/>
-          </w:tblCellMar>
         </w:tblPrEx>
         <w:tc>
           <w:tcPr>
@@ -46145,12 +46243,6 @@
             <w:insideH w:val="single" w:color="auto" w:sz="4" w:space="0"/>
             <w:insideV w:val="single" w:color="auto" w:sz="4" w:space="0"/>
           </w:tblBorders>
-          <w:tblCellMar>
-            <w:top w:w="0" w:type="dxa"/>
-            <w:left w:w="108" w:type="dxa"/>
-            <w:bottom w:w="0" w:type="dxa"/>
-            <w:right w:w="108" w:type="dxa"/>
-          </w:tblCellMar>
         </w:tblPrEx>
         <w:tc>
           <w:tcPr>

</xml_diff>

<commit_message>
update on 2025-08-04 23:11:34.858243
</commit_message>
<xml_diff>
--- a/cfg - system.docx
+++ b/cfg - system.docx
@@ -4164,12 +4164,6 @@
             <w:insideH w:val="single" w:color="auto" w:sz="4" w:space="0"/>
             <w:insideV w:val="single" w:color="auto" w:sz="4" w:space="0"/>
           </w:tblBorders>
-          <w:tblCellMar>
-            <w:top w:w="0" w:type="dxa"/>
-            <w:left w:w="108" w:type="dxa"/>
-            <w:bottom w:w="0" w:type="dxa"/>
-            <w:right w:w="108" w:type="dxa"/>
-          </w:tblCellMar>
         </w:tblPrEx>
         <w:tc>
           <w:tcPr>
@@ -6444,12 +6438,6 @@
             <w:insideH w:val="single" w:color="auto" w:sz="4" w:space="0"/>
             <w:insideV w:val="single" w:color="auto" w:sz="4" w:space="0"/>
           </w:tblBorders>
-          <w:tblCellMar>
-            <w:top w:w="0" w:type="dxa"/>
-            <w:left w:w="108" w:type="dxa"/>
-            <w:bottom w:w="0" w:type="dxa"/>
-            <w:right w:w="108" w:type="dxa"/>
-          </w:tblCellMar>
         </w:tblPrEx>
         <w:tc>
           <w:tcPr>
@@ -10355,6 +10343,12 @@
             <w:insideH w:val="single" w:color="auto" w:sz="4" w:space="0"/>
             <w:insideV w:val="single" w:color="auto" w:sz="4" w:space="0"/>
           </w:tblBorders>
+          <w:tblCellMar>
+            <w:top w:w="0" w:type="dxa"/>
+            <w:left w:w="108" w:type="dxa"/>
+            <w:bottom w:w="0" w:type="dxa"/>
+            <w:right w:w="108" w:type="dxa"/>
+          </w:tblCellMar>
         </w:tblPrEx>
         <w:tc>
           <w:tcPr>
@@ -13011,12 +13005,6 @@
             <w:insideH w:val="single" w:color="auto" w:sz="4" w:space="0"/>
             <w:insideV w:val="single" w:color="auto" w:sz="4" w:space="0"/>
           </w:tblBorders>
-          <w:tblCellMar>
-            <w:top w:w="0" w:type="dxa"/>
-            <w:left w:w="108" w:type="dxa"/>
-            <w:bottom w:w="0" w:type="dxa"/>
-            <w:right w:w="108" w:type="dxa"/>
-          </w:tblCellMar>
         </w:tblPrEx>
         <w:tc>
           <w:tcPr>
@@ -14200,6 +14188,12 @@
             <w:insideH w:val="single" w:color="auto" w:sz="4" w:space="0"/>
             <w:insideV w:val="single" w:color="auto" w:sz="4" w:space="0"/>
           </w:tblBorders>
+          <w:tblCellMar>
+            <w:top w:w="0" w:type="dxa"/>
+            <w:left w:w="108" w:type="dxa"/>
+            <w:bottom w:w="0" w:type="dxa"/>
+            <w:right w:w="108" w:type="dxa"/>
+          </w:tblCellMar>
         </w:tblPrEx>
         <w:tc>
           <w:tcPr>
@@ -14246,6 +14240,89 @@
                 </w14:textFill>
               </w:rPr>
               <w:t>文件位置：</w:t>
+            </w:r>
+          </w:p>
+        </w:tc>
+      </w:tr>
+      <w:tr>
+        <w:tblPrEx>
+          <w:tblBorders>
+            <w:top w:val="single" w:color="auto" w:sz="4" w:space="0"/>
+            <w:left w:val="single" w:color="auto" w:sz="4" w:space="0"/>
+            <w:bottom w:val="single" w:color="auto" w:sz="4" w:space="0"/>
+            <w:right w:val="single" w:color="auto" w:sz="4" w:space="0"/>
+            <w:insideH w:val="single" w:color="auto" w:sz="4" w:space="0"/>
+            <w:insideV w:val="single" w:color="auto" w:sz="4" w:space="0"/>
+          </w:tblBorders>
+        </w:tblPrEx>
+        <w:tc>
+          <w:tcPr>
+            <w:tcW w:w="0" w:type="auto"/>
+            <w:gridSpan w:val="2"/>
+          </w:tcPr>
+          <w:p>
+            <w:pPr>
+              <w:bidi w:val="0"/>
+              <w:spacing w:line="240" w:lineRule="auto"/>
+              <w:jc w:val="left"/>
+              <w:rPr>
+                <w:rFonts w:hint="default" w:ascii="华文中宋" w:hAnsi="华文中宋" w:eastAsia="华文中宋" w:cs="华文中宋"/>
+                <w:b/>
+                <w:bCs/>
+                <w:color w:val="FF0000"/>
+                <w:spacing w:val="0"/>
+                <w:sz w:val="21"/>
+                <w:szCs w:val="24"/>
+                <w:vertAlign w:val="baseline"/>
+                <w:lang w:val="en-US" w:eastAsia="zh-CN"/>
+              </w:rPr>
+            </w:pPr>
+            <w:r>
+              <w:rPr>
+                <w:rFonts w:hint="eastAsia" w:ascii="华文中宋" w:hAnsi="华文中宋" w:eastAsia="华文中宋" w:cs="华文中宋"/>
+                <w:b/>
+                <w:bCs/>
+                <w:color w:val="FF0000"/>
+                <w:spacing w:val="0"/>
+                <w:sz w:val="21"/>
+                <w:szCs w:val="24"/>
+                <w:vertAlign w:val="baseline"/>
+                <w:lang w:val="en-US" w:eastAsia="zh-CN"/>
+              </w:rPr>
+              <w:t>/opt</w:t>
+            </w:r>
+          </w:p>
+        </w:tc>
+        <w:tc>
+          <w:tcPr>
+            <w:tcW w:w="0" w:type="auto"/>
+          </w:tcPr>
+          <w:p>
+            <w:pPr>
+              <w:bidi w:val="0"/>
+              <w:spacing w:line="240" w:lineRule="auto"/>
+              <w:jc w:val="left"/>
+              <w:rPr>
+                <w:rFonts w:hint="default" w:ascii="华文中宋" w:hAnsi="华文中宋" w:eastAsia="华文中宋" w:cs="华文中宋"/>
+                <w:b/>
+                <w:bCs/>
+                <w:color w:val="EA82F1"/>
+                <w:sz w:val="21"/>
+                <w:szCs w:val="24"/>
+                <w:lang w:val="en-US" w:eastAsia="zh-CN"/>
+              </w:rPr>
+            </w:pPr>
+            <w:r>
+              <w:rPr>
+                <w:rFonts w:hint="eastAsia" w:ascii="华文中宋" w:hAnsi="华文中宋" w:eastAsia="华文中宋" w:cs="华文中宋"/>
+                <w:b/>
+                <w:bCs/>
+                <w:color w:val="EA82F1"/>
+                <w:sz w:val="21"/>
+                <w:szCs w:val="24"/>
+                <w:lang w:val="en-US" w:eastAsia="zh-CN"/>
+              </w:rPr>
+              <w:t>额外软件</w:t>
             </w:r>
           </w:p>
         </w:tc>
@@ -14271,6 +14348,7 @@
           <w:tcPr>
             <w:tcW w:w="0" w:type="auto"/>
             <w:gridSpan w:val="2"/>
+            <w:vAlign w:val="top"/>
           </w:tcPr>
           <w:p>
             <w:pPr>
@@ -14278,36 +14356,38 @@
               <w:spacing w:line="240" w:lineRule="auto"/>
               <w:jc w:val="left"/>
               <w:rPr>
-                <w:rFonts w:hint="default" w:ascii="华文中宋" w:hAnsi="华文中宋" w:eastAsia="华文中宋" w:cs="华文中宋"/>
-                <w:b/>
-                <w:bCs/>
-                <w:color w:val="FF0000"/>
-                <w:spacing w:val="0"/>
-                <w:sz w:val="21"/>
-                <w:szCs w:val="24"/>
-                <w:vertAlign w:val="baseline"/>
-                <w:lang w:val="en-US" w:eastAsia="zh-CN"/>
-              </w:rPr>
-            </w:pPr>
-            <w:r>
-              <w:rPr>
-                <w:rFonts w:hint="eastAsia" w:ascii="华文中宋" w:hAnsi="华文中宋" w:eastAsia="华文中宋" w:cs="华文中宋"/>
-                <w:b/>
-                <w:bCs/>
-                <w:color w:val="FF0000"/>
-                <w:spacing w:val="0"/>
-                <w:sz w:val="21"/>
-                <w:szCs w:val="24"/>
-                <w:vertAlign w:val="baseline"/>
-                <w:lang w:val="en-US" w:eastAsia="zh-CN"/>
-              </w:rPr>
-              <w:t>/opt</w:t>
-            </w:r>
-          </w:p>
-        </w:tc>
-        <w:tc>
-          <w:tcPr>
-            <w:tcW w:w="0" w:type="auto"/>
+                <w:rFonts w:hint="eastAsia" w:ascii="华文中宋" w:hAnsi="华文中宋" w:eastAsia="华文中宋" w:cs="华文中宋"/>
+                <w:b/>
+                <w:bCs/>
+                <w:color w:val="FF0000"/>
+                <w:spacing w:val="0"/>
+                <w:kern w:val="2"/>
+                <w:sz w:val="21"/>
+                <w:szCs w:val="24"/>
+                <w:vertAlign w:val="baseline"/>
+                <w:lang w:val="en-US" w:eastAsia="zh-CN" w:bidi="ar-SA"/>
+              </w:rPr>
+            </w:pPr>
+            <w:r>
+              <w:rPr>
+                <w:rFonts w:hint="eastAsia" w:ascii="华文中宋" w:hAnsi="华文中宋" w:eastAsia="华文中宋" w:cs="华文中宋"/>
+                <w:b/>
+                <w:bCs/>
+                <w:color w:val="FF0000"/>
+                <w:spacing w:val="0"/>
+                <w:sz w:val="21"/>
+                <w:szCs w:val="24"/>
+                <w:vertAlign w:val="baseline"/>
+                <w:lang w:val="en-US" w:eastAsia="zh-CN"/>
+              </w:rPr>
+              <w:t>/proc/cpuinfo</w:t>
+            </w:r>
+          </w:p>
+        </w:tc>
+        <w:tc>
+          <w:tcPr>
+            <w:tcW w:w="0" w:type="auto"/>
+            <w:vAlign w:val="top"/>
           </w:tcPr>
           <w:p>
             <w:pPr>
@@ -14315,13 +14395,14 @@
               <w:spacing w:line="240" w:lineRule="auto"/>
               <w:jc w:val="left"/>
               <w:rPr>
-                <w:rFonts w:hint="default" w:ascii="华文中宋" w:hAnsi="华文中宋" w:eastAsia="华文中宋" w:cs="华文中宋"/>
+                <w:rFonts w:hint="eastAsia" w:ascii="华文中宋" w:hAnsi="华文中宋" w:eastAsia="华文中宋" w:cs="华文中宋"/>
                 <w:b/>
                 <w:bCs/>
                 <w:color w:val="EA82F1"/>
-                <w:sz w:val="21"/>
-                <w:szCs w:val="24"/>
-                <w:lang w:val="en-US" w:eastAsia="zh-CN"/>
+                <w:kern w:val="2"/>
+                <w:sz w:val="21"/>
+                <w:szCs w:val="24"/>
+                <w:lang w:val="en-US" w:eastAsia="zh-CN" w:bidi="ar-SA"/>
               </w:rPr>
             </w:pPr>
             <w:r>
@@ -14334,7 +14415,26 @@
                 <w:szCs w:val="24"/>
                 <w:lang w:val="en-US" w:eastAsia="zh-CN"/>
               </w:rPr>
-              <w:t>额外软件</w:t>
+              <w:t>CPU</w:t>
+            </w:r>
+            <w:r>
+              <w:rPr>
+                <w:rFonts w:hint="eastAsia" w:ascii="华文中宋" w:hAnsi="华文中宋" w:eastAsia="华文中宋" w:cs="华文中宋"/>
+                <w:b/>
+                <w:bCs/>
+                <w:color w:val="ED7D31" w:themeColor="accent2"/>
+                <w:spacing w:val="0"/>
+                <w:sz w:val="21"/>
+                <w:szCs w:val="24"/>
+                <w:vertAlign w:val="baseline"/>
+                <w:lang w:val="en-US" w:eastAsia="zh-CN"/>
+                <w14:textFill>
+                  <w14:solidFill>
+                    <w14:schemeClr w14:val="accent2"/>
+                  </w14:solidFill>
+                </w14:textFill>
+              </w:rPr>
+              <w:t>配置</w:t>
             </w:r>
           </w:p>
         </w:tc>
@@ -14368,31 +14468,44 @@
               <w:spacing w:line="240" w:lineRule="auto"/>
               <w:jc w:val="left"/>
               <w:rPr>
-                <w:rFonts w:hint="eastAsia" w:ascii="华文中宋" w:hAnsi="华文中宋" w:eastAsia="华文中宋" w:cs="华文中宋"/>
-                <w:b/>
-                <w:bCs/>
-                <w:color w:val="FF0000"/>
-                <w:spacing w:val="0"/>
-                <w:kern w:val="2"/>
-                <w:sz w:val="21"/>
-                <w:szCs w:val="24"/>
-                <w:vertAlign w:val="baseline"/>
-                <w:lang w:val="en-US" w:eastAsia="zh-CN" w:bidi="ar-SA"/>
-              </w:rPr>
-            </w:pPr>
-            <w:r>
-              <w:rPr>
-                <w:rFonts w:hint="eastAsia" w:ascii="华文中宋" w:hAnsi="华文中宋" w:eastAsia="华文中宋" w:cs="华文中宋"/>
-                <w:b/>
-                <w:bCs/>
-                <w:color w:val="FF0000"/>
-                <w:spacing w:val="0"/>
-                <w:sz w:val="21"/>
-                <w:szCs w:val="24"/>
-                <w:vertAlign w:val="baseline"/>
-                <w:lang w:val="en-US" w:eastAsia="zh-CN"/>
-              </w:rPr>
-              <w:t>/proc/cpuinfo</w:t>
+                <w:rFonts w:hint="default" w:ascii="华文中宋" w:hAnsi="华文中宋" w:eastAsia="华文中宋" w:cs="华文中宋"/>
+                <w:b/>
+                <w:bCs/>
+                <w:color w:val="FF0000"/>
+                <w:spacing w:val="0"/>
+                <w:sz w:val="21"/>
+                <w:szCs w:val="24"/>
+                <w:vertAlign w:val="baseline"/>
+                <w:lang w:val="en-US" w:eastAsia="zh-CN"/>
+              </w:rPr>
+            </w:pPr>
+            <w:r>
+              <w:rPr>
+                <w:rFonts w:hint="default" w:ascii="华文中宋" w:hAnsi="华文中宋" w:eastAsia="华文中宋" w:cs="华文中宋"/>
+                <w:b/>
+                <w:bCs/>
+                <w:color w:val="FF0000"/>
+                <w:spacing w:val="0"/>
+                <w:sz w:val="21"/>
+                <w:szCs w:val="24"/>
+                <w:vertAlign w:val="baseline"/>
+                <w:lang w:val="en-US" w:eastAsia="zh-CN"/>
+              </w:rPr>
+              <w:t>/etc/</w:t>
+            </w:r>
+            <w:r>
+              <w:rPr>
+                <w:rFonts w:hint="eastAsia" w:ascii="华文中宋" w:hAnsi="华文中宋" w:cs="华文中宋"/>
+                <w:b/>
+                <w:bCs/>
+                <w:color w:val="FF0000"/>
+                <w:spacing w:val="0"/>
+                <w:sz w:val="21"/>
+                <w:szCs w:val="24"/>
+                <w:vertAlign w:val="baseline"/>
+                <w:lang w:val="en-US" w:eastAsia="zh-CN"/>
+              </w:rPr>
+              <w:t>environment</w:t>
             </w:r>
           </w:p>
         </w:tc>
@@ -14407,19 +14520,18 @@
               <w:spacing w:line="240" w:lineRule="auto"/>
               <w:jc w:val="left"/>
               <w:rPr>
-                <w:rFonts w:hint="eastAsia" w:ascii="华文中宋" w:hAnsi="华文中宋" w:eastAsia="华文中宋" w:cs="华文中宋"/>
+                <w:rFonts w:hint="default" w:ascii="华文中宋" w:hAnsi="华文中宋" w:eastAsia="华文中宋" w:cs="华文中宋"/>
                 <w:b/>
                 <w:bCs/>
                 <w:color w:val="EA82F1"/>
-                <w:kern w:val="2"/>
-                <w:sz w:val="21"/>
-                <w:szCs w:val="24"/>
-                <w:lang w:val="en-US" w:eastAsia="zh-CN" w:bidi="ar-SA"/>
-              </w:rPr>
-            </w:pPr>
-            <w:r>
-              <w:rPr>
-                <w:rFonts w:hint="eastAsia" w:ascii="华文中宋" w:hAnsi="华文中宋" w:eastAsia="华文中宋" w:cs="华文中宋"/>
+                <w:sz w:val="21"/>
+                <w:szCs w:val="24"/>
+                <w:lang w:val="en-US" w:eastAsia="zh-CN"/>
+              </w:rPr>
+            </w:pPr>
+            <w:r>
+              <w:rPr>
+                <w:rFonts w:hint="eastAsia" w:ascii="华文中宋" w:hAnsi="华文中宋" w:cs="华文中宋"/>
                 <w:b/>
                 <w:bCs/>
                 <w:color w:val="EA82F1"/>
@@ -14427,26 +14539,7 @@
                 <w:szCs w:val="24"/>
                 <w:lang w:val="en-US" w:eastAsia="zh-CN"/>
               </w:rPr>
-              <w:t>CPU</w:t>
-            </w:r>
-            <w:r>
-              <w:rPr>
-                <w:rFonts w:hint="eastAsia" w:ascii="华文中宋" w:hAnsi="华文中宋" w:eastAsia="华文中宋" w:cs="华文中宋"/>
-                <w:b/>
-                <w:bCs/>
-                <w:color w:val="ED7D31" w:themeColor="accent2"/>
-                <w:spacing w:val="0"/>
-                <w:sz w:val="21"/>
-                <w:szCs w:val="24"/>
-                <w:vertAlign w:val="baseline"/>
-                <w:lang w:val="en-US" w:eastAsia="zh-CN"/>
-                <w14:textFill>
-                  <w14:solidFill>
-                    <w14:schemeClr w14:val="accent2"/>
-                  </w14:solidFill>
-                </w14:textFill>
-              </w:rPr>
-              <w:t>配置</w:t>
+              <w:t>系统变量</w:t>
             </w:r>
           </w:p>
         </w:tc>
@@ -14472,7 +14565,6 @@
           <w:tcPr>
             <w:tcW w:w="0" w:type="auto"/>
             <w:gridSpan w:val="2"/>
-            <w:vAlign w:val="top"/>
           </w:tcPr>
           <w:p>
             <w:pPr>
@@ -14480,6 +14572,19 @@
               <w:spacing w:line="240" w:lineRule="auto"/>
               <w:jc w:val="left"/>
               <w:rPr>
+                <w:rFonts w:hint="eastAsia" w:ascii="华文中宋" w:hAnsi="华文中宋" w:eastAsia="华文中宋" w:cs="华文中宋"/>
+                <w:b/>
+                <w:bCs/>
+                <w:color w:val="FF0000"/>
+                <w:spacing w:val="0"/>
+                <w:sz w:val="21"/>
+                <w:szCs w:val="24"/>
+                <w:vertAlign w:val="baseline"/>
+                <w:lang w:val="en-US" w:eastAsia="zh-CN"/>
+              </w:rPr>
+            </w:pPr>
+            <w:r>
+              <w:rPr>
                 <w:rFonts w:hint="default" w:ascii="华文中宋" w:hAnsi="华文中宋" w:eastAsia="华文中宋" w:cs="华文中宋"/>
                 <w:b/>
                 <w:bCs/>
@@ -14490,41 +14595,84 @@
                 <w:vertAlign w:val="baseline"/>
                 <w:lang w:val="en-US" w:eastAsia="zh-CN"/>
               </w:rPr>
-            </w:pPr>
-            <w:r>
+              <w:t>/etc/sysconfig/network-scripts/ifcfg-ens33</w:t>
+            </w:r>
+          </w:p>
+        </w:tc>
+        <w:tc>
+          <w:tcPr>
+            <w:tcW w:w="0" w:type="auto"/>
+          </w:tcPr>
+          <w:p>
+            <w:pPr>
+              <w:bidi w:val="0"/>
+              <w:spacing w:line="240" w:lineRule="auto"/>
+              <w:jc w:val="left"/>
               <w:rPr>
                 <w:rFonts w:hint="default" w:ascii="华文中宋" w:hAnsi="华文中宋" w:eastAsia="华文中宋" w:cs="华文中宋"/>
                 <w:b/>
                 <w:bCs/>
-                <w:color w:val="FF0000"/>
-                <w:spacing w:val="0"/>
-                <w:sz w:val="21"/>
-                <w:szCs w:val="24"/>
-                <w:vertAlign w:val="baseline"/>
-                <w:lang w:val="en-US" w:eastAsia="zh-CN"/>
-              </w:rPr>
-              <w:t>/etc/</w:t>
-            </w:r>
-            <w:r>
-              <w:rPr>
-                <w:rFonts w:hint="eastAsia" w:ascii="华文中宋" w:hAnsi="华文中宋" w:cs="华文中宋"/>
-                <w:b/>
-                <w:bCs/>
-                <w:color w:val="FF0000"/>
-                <w:spacing w:val="0"/>
-                <w:sz w:val="21"/>
-                <w:szCs w:val="24"/>
-                <w:vertAlign w:val="baseline"/>
-                <w:lang w:val="en-US" w:eastAsia="zh-CN"/>
-              </w:rPr>
-              <w:t>environment</w:t>
-            </w:r>
-          </w:p>
-        </w:tc>
-        <w:tc>
-          <w:tcPr>
-            <w:tcW w:w="0" w:type="auto"/>
-            <w:vAlign w:val="top"/>
+                <w:color w:val="ED7D31" w:themeColor="accent2"/>
+                <w:spacing w:val="0"/>
+                <w:sz w:val="21"/>
+                <w:szCs w:val="24"/>
+                <w:vertAlign w:val="baseline"/>
+                <w:lang w:val="en-US" w:eastAsia="zh-CN"/>
+                <w14:textFill>
+                  <w14:solidFill>
+                    <w14:schemeClr w14:val="accent2"/>
+                  </w14:solidFill>
+                </w14:textFill>
+              </w:rPr>
+            </w:pPr>
+            <w:r>
+              <w:rPr>
+                <w:rFonts w:hint="eastAsia" w:ascii="华文中宋" w:hAnsi="华文中宋" w:eastAsia="华文中宋" w:cs="华文中宋"/>
+                <w:b/>
+                <w:bCs/>
+                <w:color w:val="EA82F1"/>
+                <w:sz w:val="21"/>
+                <w:szCs w:val="24"/>
+                <w:lang w:val="en-US" w:eastAsia="zh-CN"/>
+              </w:rPr>
+              <w:t>网络</w:t>
+            </w:r>
+            <w:r>
+              <w:rPr>
+                <w:rFonts w:hint="eastAsia" w:ascii="华文中宋" w:hAnsi="华文中宋" w:eastAsia="华文中宋" w:cs="华文中宋"/>
+                <w:b/>
+                <w:bCs/>
+                <w:color w:val="ED7D31" w:themeColor="accent2"/>
+                <w:spacing w:val="0"/>
+                <w:sz w:val="21"/>
+                <w:szCs w:val="24"/>
+                <w:vertAlign w:val="baseline"/>
+                <w:lang w:val="en-US" w:eastAsia="zh-CN"/>
+                <w14:textFill>
+                  <w14:solidFill>
+                    <w14:schemeClr w14:val="accent2"/>
+                  </w14:solidFill>
+                </w14:textFill>
+              </w:rPr>
+              <w:t>配置</w:t>
+            </w:r>
+          </w:p>
+        </w:tc>
+      </w:tr>
+      <w:tr>
+        <w:tblPrEx>
+          <w:tblBorders>
+            <w:top w:val="single" w:color="auto" w:sz="4" w:space="0"/>
+            <w:left w:val="single" w:color="auto" w:sz="4" w:space="0"/>
+            <w:bottom w:val="single" w:color="auto" w:sz="4" w:space="0"/>
+            <w:right w:val="single" w:color="auto" w:sz="4" w:space="0"/>
+            <w:insideH w:val="single" w:color="auto" w:sz="4" w:space="0"/>
+            <w:insideV w:val="single" w:color="auto" w:sz="4" w:space="0"/>
+          </w:tblBorders>
+        </w:tblPrEx>
+        <w:tc>
+          <w:tcPr>
+            <w:tcW w:w="0" w:type="auto"/>
           </w:tcPr>
           <w:p>
             <w:pPr>
@@ -14535,23 +14683,279 @@
                 <w:rFonts w:hint="default" w:ascii="华文中宋" w:hAnsi="华文中宋" w:eastAsia="华文中宋" w:cs="华文中宋"/>
                 <w:b/>
                 <w:bCs/>
-                <w:color w:val="EA82F1"/>
-                <w:sz w:val="21"/>
-                <w:szCs w:val="24"/>
-                <w:lang w:val="en-US" w:eastAsia="zh-CN"/>
-              </w:rPr>
-            </w:pPr>
-            <w:r>
-              <w:rPr>
-                <w:rFonts w:hint="eastAsia" w:ascii="华文中宋" w:hAnsi="华文中宋" w:cs="华文中宋"/>
-                <w:b/>
-                <w:bCs/>
-                <w:color w:val="EA82F1"/>
-                <w:sz w:val="21"/>
-                <w:szCs w:val="24"/>
-                <w:lang w:val="en-US" w:eastAsia="zh-CN"/>
-              </w:rPr>
-              <w:t>系统变量</w:t>
+                <w:color w:val="FF0000"/>
+                <w:spacing w:val="0"/>
+                <w:sz w:val="21"/>
+                <w:szCs w:val="24"/>
+                <w:vertAlign w:val="baseline"/>
+                <w:lang w:val="en-US" w:eastAsia="zh-CN"/>
+              </w:rPr>
+            </w:pPr>
+            <w:r>
+              <w:rPr>
+                <w:rFonts w:hint="eastAsia" w:ascii="华文中宋" w:hAnsi="华文中宋" w:eastAsia="华文中宋" w:cs="华文中宋"/>
+                <w:b/>
+                <w:bCs/>
+                <w:color w:val="ED7D31" w:themeColor="accent2"/>
+                <w:spacing w:val="0"/>
+                <w:sz w:val="21"/>
+                <w:szCs w:val="24"/>
+                <w:vertAlign w:val="baseline"/>
+                <w:lang w:val="en-US" w:eastAsia="zh-CN"/>
+                <w14:textFill>
+                  <w14:solidFill>
+                    <w14:schemeClr w14:val="accent2"/>
+                  </w14:solidFill>
+                </w14:textFill>
+              </w:rPr>
+              <w:t>BOOTPROTO=static</w:t>
+            </w:r>
+          </w:p>
+        </w:tc>
+        <w:tc>
+          <w:tcPr>
+            <w:tcW w:w="0" w:type="auto"/>
+          </w:tcPr>
+          <w:p>
+            <w:pPr>
+              <w:bidi w:val="0"/>
+              <w:spacing w:line="240" w:lineRule="auto"/>
+              <w:jc w:val="left"/>
+              <w:rPr>
+                <w:rFonts w:hint="default" w:ascii="华文中宋" w:hAnsi="华文中宋" w:eastAsia="华文中宋" w:cs="华文中宋"/>
+                <w:b/>
+                <w:bCs/>
+                <w:color w:val="ED7D31" w:themeColor="accent2"/>
+                <w:spacing w:val="0"/>
+                <w:sz w:val="21"/>
+                <w:szCs w:val="24"/>
+                <w:vertAlign w:val="baseline"/>
+                <w:lang w:val="en-US" w:eastAsia="zh-CN"/>
+                <w14:textFill>
+                  <w14:solidFill>
+                    <w14:schemeClr w14:val="accent2"/>
+                  </w14:solidFill>
+                </w14:textFill>
+              </w:rPr>
+            </w:pPr>
+            <w:r>
+              <w:rPr>
+                <w:rFonts w:hint="eastAsia" w:ascii="华文中宋" w:hAnsi="华文中宋" w:eastAsia="华文中宋" w:cs="华文中宋"/>
+                <w:b/>
+                <w:bCs/>
+                <w:color w:val="ED7D31" w:themeColor="accent2"/>
+                <w:spacing w:val="0"/>
+                <w:sz w:val="21"/>
+                <w:szCs w:val="24"/>
+                <w:vertAlign w:val="baseline"/>
+                <w:lang w:val="en-US" w:eastAsia="zh-CN"/>
+                <w14:textFill>
+                  <w14:solidFill>
+                    <w14:schemeClr w14:val="accent2"/>
+                  </w14:solidFill>
+                </w14:textFill>
+              </w:rPr>
+              <w:t>ONBOOT=yes</w:t>
+            </w:r>
+          </w:p>
+        </w:tc>
+        <w:tc>
+          <w:tcPr>
+            <w:tcW w:w="0" w:type="auto"/>
+          </w:tcPr>
+          <w:p>
+            <w:pPr>
+              <w:bidi w:val="0"/>
+              <w:spacing w:line="240" w:lineRule="auto"/>
+              <w:jc w:val="left"/>
+              <w:rPr>
+                <w:rFonts w:hint="default" w:ascii="华文中宋" w:hAnsi="华文中宋" w:eastAsia="华文中宋" w:cs="华文中宋"/>
+                <w:b/>
+                <w:bCs/>
+                <w:color w:val="ED7D31" w:themeColor="accent2"/>
+                <w:spacing w:val="0"/>
+                <w:sz w:val="21"/>
+                <w:szCs w:val="24"/>
+                <w:vertAlign w:val="baseline"/>
+                <w:lang w:val="en-US" w:eastAsia="zh-CN"/>
+                <w14:textFill>
+                  <w14:solidFill>
+                    <w14:schemeClr w14:val="accent2"/>
+                  </w14:solidFill>
+                </w14:textFill>
+              </w:rPr>
+            </w:pPr>
+            <w:r>
+              <w:rPr>
+                <w:rFonts w:hint="eastAsia" w:ascii="华文中宋" w:hAnsi="华文中宋" w:eastAsia="华文中宋" w:cs="华文中宋"/>
+                <w:b/>
+                <w:bCs/>
+                <w:color w:val="ED7D31" w:themeColor="accent2"/>
+                <w:spacing w:val="0"/>
+                <w:sz w:val="21"/>
+                <w:szCs w:val="24"/>
+                <w:vertAlign w:val="baseline"/>
+                <w:lang w:val="en-US" w:eastAsia="zh-CN"/>
+                <w14:textFill>
+                  <w14:solidFill>
+                    <w14:schemeClr w14:val="accent2"/>
+                  </w14:solidFill>
+                </w14:textFill>
+              </w:rPr>
+              <w:t>DNS1=114.114.114.114</w:t>
+            </w:r>
+          </w:p>
+        </w:tc>
+      </w:tr>
+      <w:tr>
+        <w:tblPrEx>
+          <w:tblBorders>
+            <w:top w:val="single" w:color="auto" w:sz="4" w:space="0"/>
+            <w:left w:val="single" w:color="auto" w:sz="4" w:space="0"/>
+            <w:bottom w:val="single" w:color="auto" w:sz="4" w:space="0"/>
+            <w:right w:val="single" w:color="auto" w:sz="4" w:space="0"/>
+            <w:insideH w:val="single" w:color="auto" w:sz="4" w:space="0"/>
+            <w:insideV w:val="single" w:color="auto" w:sz="4" w:space="0"/>
+          </w:tblBorders>
+        </w:tblPrEx>
+        <w:tc>
+          <w:tcPr>
+            <w:tcW w:w="0" w:type="auto"/>
+          </w:tcPr>
+          <w:p>
+            <w:pPr>
+              <w:bidi w:val="0"/>
+              <w:spacing w:line="240" w:lineRule="auto"/>
+              <w:jc w:val="left"/>
+              <w:rPr>
+                <w:rFonts w:hint="default" w:ascii="华文中宋" w:hAnsi="华文中宋" w:eastAsia="华文中宋" w:cs="华文中宋"/>
+                <w:b/>
+                <w:bCs/>
+                <w:color w:val="ED7D31" w:themeColor="accent2"/>
+                <w:spacing w:val="0"/>
+                <w:sz w:val="21"/>
+                <w:szCs w:val="24"/>
+                <w:vertAlign w:val="baseline"/>
+                <w:lang w:val="en-US" w:eastAsia="zh-CN"/>
+                <w14:textFill>
+                  <w14:solidFill>
+                    <w14:schemeClr w14:val="accent2"/>
+                  </w14:solidFill>
+                </w14:textFill>
+              </w:rPr>
+            </w:pPr>
+            <w:r>
+              <w:rPr>
+                <w:rFonts w:hint="eastAsia" w:ascii="华文中宋" w:hAnsi="华文中宋" w:eastAsia="华文中宋" w:cs="华文中宋"/>
+                <w:b/>
+                <w:bCs/>
+                <w:color w:val="ED7D31" w:themeColor="accent2"/>
+                <w:spacing w:val="0"/>
+                <w:sz w:val="21"/>
+                <w:szCs w:val="24"/>
+                <w:vertAlign w:val="baseline"/>
+                <w:lang w:val="en-US" w:eastAsia="zh-CN"/>
+                <w14:textFill>
+                  <w14:solidFill>
+                    <w14:schemeClr w14:val="accent2"/>
+                  </w14:solidFill>
+                </w14:textFill>
+              </w:rPr>
+              <w:t>GATEWAY=(网关)</w:t>
+            </w:r>
+          </w:p>
+        </w:tc>
+        <w:tc>
+          <w:tcPr>
+            <w:tcW w:w="0" w:type="auto"/>
+          </w:tcPr>
+          <w:p>
+            <w:pPr>
+              <w:bidi w:val="0"/>
+              <w:spacing w:line="240" w:lineRule="auto"/>
+              <w:jc w:val="left"/>
+              <w:rPr>
+                <w:rFonts w:hint="default" w:ascii="华文中宋" w:hAnsi="华文中宋" w:eastAsia="华文中宋" w:cs="华文中宋"/>
+                <w:b/>
+                <w:bCs/>
+                <w:color w:val="ED7D31" w:themeColor="accent2"/>
+                <w:spacing w:val="0"/>
+                <w:sz w:val="21"/>
+                <w:szCs w:val="24"/>
+                <w:vertAlign w:val="baseline"/>
+                <w:lang w:val="en-US" w:eastAsia="zh-CN"/>
+                <w14:textFill>
+                  <w14:solidFill>
+                    <w14:schemeClr w14:val="accent2"/>
+                  </w14:solidFill>
+                </w14:textFill>
+              </w:rPr>
+            </w:pPr>
+            <w:r>
+              <w:rPr>
+                <w:rFonts w:hint="eastAsia" w:ascii="华文中宋" w:hAnsi="华文中宋" w:eastAsia="华文中宋" w:cs="华文中宋"/>
+                <w:b/>
+                <w:bCs/>
+                <w:color w:val="ED7D31" w:themeColor="accent2"/>
+                <w:spacing w:val="0"/>
+                <w:sz w:val="21"/>
+                <w:szCs w:val="24"/>
+                <w:vertAlign w:val="baseline"/>
+                <w:lang w:val="en-US" w:eastAsia="zh-CN"/>
+                <w14:textFill>
+                  <w14:solidFill>
+                    <w14:schemeClr w14:val="accent2"/>
+                  </w14:solidFill>
+                </w14:textFill>
+              </w:rPr>
+              <w:t>IPADDR=(子网IP)</w:t>
+            </w:r>
+          </w:p>
+        </w:tc>
+        <w:tc>
+          <w:tcPr>
+            <w:tcW w:w="0" w:type="auto"/>
+          </w:tcPr>
+          <w:p>
+            <w:pPr>
+              <w:bidi w:val="0"/>
+              <w:spacing w:line="240" w:lineRule="auto"/>
+              <w:jc w:val="left"/>
+              <w:rPr>
+                <w:rFonts w:hint="default" w:ascii="华文中宋" w:hAnsi="华文中宋" w:eastAsia="华文中宋" w:cs="华文中宋"/>
+                <w:b/>
+                <w:bCs/>
+                <w:color w:val="ED7D31" w:themeColor="accent2"/>
+                <w:spacing w:val="0"/>
+                <w:sz w:val="21"/>
+                <w:szCs w:val="24"/>
+                <w:vertAlign w:val="baseline"/>
+                <w:lang w:val="en-US" w:eastAsia="zh-CN"/>
+                <w14:textFill>
+                  <w14:solidFill>
+                    <w14:schemeClr w14:val="accent2"/>
+                  </w14:solidFill>
+                </w14:textFill>
+              </w:rPr>
+            </w:pPr>
+            <w:r>
+              <w:rPr>
+                <w:rFonts w:hint="eastAsia" w:ascii="华文中宋" w:hAnsi="华文中宋" w:eastAsia="华文中宋" w:cs="华文中宋"/>
+                <w:b/>
+                <w:bCs/>
+                <w:color w:val="ED7D31" w:themeColor="accent2"/>
+                <w:spacing w:val="0"/>
+                <w:sz w:val="21"/>
+                <w:szCs w:val="24"/>
+                <w:vertAlign w:val="baseline"/>
+                <w:lang w:val="en-US" w:eastAsia="zh-CN"/>
+                <w14:textFill>
+                  <w14:solidFill>
+                    <w14:schemeClr w14:val="accent2"/>
+                  </w14:solidFill>
+                </w14:textFill>
+              </w:rPr>
+              <w:t>NETMASK=(子网掩码)</w:t>
             </w:r>
           </w:p>
         </w:tc>
@@ -14584,19 +14988,6 @@
               <w:spacing w:line="240" w:lineRule="auto"/>
               <w:jc w:val="left"/>
               <w:rPr>
-                <w:rFonts w:hint="eastAsia" w:ascii="华文中宋" w:hAnsi="华文中宋" w:eastAsia="华文中宋" w:cs="华文中宋"/>
-                <w:b/>
-                <w:bCs/>
-                <w:color w:val="FF0000"/>
-                <w:spacing w:val="0"/>
-                <w:sz w:val="21"/>
-                <w:szCs w:val="24"/>
-                <w:vertAlign w:val="baseline"/>
-                <w:lang w:val="en-US" w:eastAsia="zh-CN"/>
-              </w:rPr>
-            </w:pPr>
-            <w:r>
-              <w:rPr>
                 <w:rFonts w:hint="default" w:ascii="华文中宋" w:hAnsi="华文中宋" w:eastAsia="华文中宋" w:cs="华文中宋"/>
                 <w:b/>
                 <w:bCs/>
@@ -14607,7 +14998,20 @@
                 <w:vertAlign w:val="baseline"/>
                 <w:lang w:val="en-US" w:eastAsia="zh-CN"/>
               </w:rPr>
-              <w:t>/etc/sysconfig/network-scripts/ifcfg-ens33</w:t>
+            </w:pPr>
+            <w:r>
+              <w:rPr>
+                <w:rFonts w:hint="eastAsia" w:ascii="华文中宋" w:hAnsi="华文中宋" w:eastAsia="华文中宋" w:cs="华文中宋"/>
+                <w:b/>
+                <w:bCs/>
+                <w:color w:val="FF0000"/>
+                <w:spacing w:val="0"/>
+                <w:sz w:val="21"/>
+                <w:szCs w:val="24"/>
+                <w:vertAlign w:val="baseline"/>
+                <w:lang w:val="en-US" w:eastAsia="zh-CN"/>
+              </w:rPr>
+              <w:t>/etc/resolv.conf</w:t>
             </w:r>
           </w:p>
         </w:tc>
@@ -14624,30 +15028,23 @@
                 <w:rFonts w:hint="default" w:ascii="华文中宋" w:hAnsi="华文中宋" w:eastAsia="华文中宋" w:cs="华文中宋"/>
                 <w:b/>
                 <w:bCs/>
-                <w:color w:val="ED7D31" w:themeColor="accent2"/>
-                <w:spacing w:val="0"/>
-                <w:sz w:val="21"/>
-                <w:szCs w:val="24"/>
-                <w:vertAlign w:val="baseline"/>
-                <w:lang w:val="en-US" w:eastAsia="zh-CN"/>
-                <w14:textFill>
-                  <w14:solidFill>
-                    <w14:schemeClr w14:val="accent2"/>
-                  </w14:solidFill>
-                </w14:textFill>
-              </w:rPr>
-            </w:pPr>
-            <w:r>
-              <w:rPr>
-                <w:rFonts w:hint="eastAsia" w:ascii="华文中宋" w:hAnsi="华文中宋" w:eastAsia="华文中宋" w:cs="华文中宋"/>
-                <w:b/>
-                <w:bCs/>
                 <w:color w:val="EA82F1"/>
                 <w:sz w:val="21"/>
                 <w:szCs w:val="24"/>
                 <w:lang w:val="en-US" w:eastAsia="zh-CN"/>
               </w:rPr>
-              <w:t>网络</w:t>
+            </w:pPr>
+            <w:r>
+              <w:rPr>
+                <w:rFonts w:hint="eastAsia" w:ascii="华文中宋" w:hAnsi="华文中宋" w:eastAsia="华文中宋" w:cs="华文中宋"/>
+                <w:b/>
+                <w:bCs/>
+                <w:color w:val="EA82F1"/>
+                <w:sz w:val="21"/>
+                <w:szCs w:val="24"/>
+                <w:lang w:val="en-US" w:eastAsia="zh-CN"/>
+              </w:rPr>
+              <w:t>网关</w:t>
             </w:r>
             <w:r>
               <w:rPr>
@@ -14691,6 +15088,7 @@
         <w:tc>
           <w:tcPr>
             <w:tcW w:w="0" w:type="auto"/>
+            <w:gridSpan w:val="2"/>
           </w:tcPr>
           <w:p>
             <w:pPr>
@@ -14726,7 +15124,7 @@
                   </w14:solidFill>
                 </w14:textFill>
               </w:rPr>
-              <w:t>BOOTPROTO=static</w:t>
+              <w:t>nameserver (网关)</w:t>
             </w:r>
           </w:p>
         </w:tc>
@@ -14740,88 +15138,15 @@
               <w:spacing w:line="240" w:lineRule="auto"/>
               <w:jc w:val="left"/>
               <w:rPr>
-                <w:rFonts w:hint="default" w:ascii="华文中宋" w:hAnsi="华文中宋" w:eastAsia="华文中宋" w:cs="华文中宋"/>
-                <w:b/>
-                <w:bCs/>
-                <w:color w:val="ED7D31" w:themeColor="accent2"/>
-                <w:spacing w:val="0"/>
-                <w:sz w:val="21"/>
-                <w:szCs w:val="24"/>
-                <w:vertAlign w:val="baseline"/>
-                <w:lang w:val="en-US" w:eastAsia="zh-CN"/>
-                <w14:textFill>
-                  <w14:solidFill>
-                    <w14:schemeClr w14:val="accent2"/>
-                  </w14:solidFill>
-                </w14:textFill>
-              </w:rPr>
-            </w:pPr>
-            <w:r>
-              <w:rPr>
-                <w:rFonts w:hint="eastAsia" w:ascii="华文中宋" w:hAnsi="华文中宋" w:eastAsia="华文中宋" w:cs="华文中宋"/>
-                <w:b/>
-                <w:bCs/>
-                <w:color w:val="ED7D31" w:themeColor="accent2"/>
-                <w:spacing w:val="0"/>
-                <w:sz w:val="21"/>
-                <w:szCs w:val="24"/>
-                <w:vertAlign w:val="baseline"/>
-                <w:lang w:val="en-US" w:eastAsia="zh-CN"/>
-                <w14:textFill>
-                  <w14:solidFill>
-                    <w14:schemeClr w14:val="accent2"/>
-                  </w14:solidFill>
-                </w14:textFill>
-              </w:rPr>
-              <w:t>ONBOOT=yes</w:t>
-            </w:r>
-          </w:p>
-        </w:tc>
-        <w:tc>
-          <w:tcPr>
-            <w:tcW w:w="0" w:type="auto"/>
-          </w:tcPr>
-          <w:p>
-            <w:pPr>
-              <w:bidi w:val="0"/>
-              <w:spacing w:line="240" w:lineRule="auto"/>
-              <w:jc w:val="left"/>
-              <w:rPr>
-                <w:rFonts w:hint="default" w:ascii="华文中宋" w:hAnsi="华文中宋" w:eastAsia="华文中宋" w:cs="华文中宋"/>
-                <w:b/>
-                <w:bCs/>
-                <w:color w:val="ED7D31" w:themeColor="accent2"/>
-                <w:spacing w:val="0"/>
-                <w:sz w:val="21"/>
-                <w:szCs w:val="24"/>
-                <w:vertAlign w:val="baseline"/>
-                <w:lang w:val="en-US" w:eastAsia="zh-CN"/>
-                <w14:textFill>
-                  <w14:solidFill>
-                    <w14:schemeClr w14:val="accent2"/>
-                  </w14:solidFill>
-                </w14:textFill>
-              </w:rPr>
-            </w:pPr>
-            <w:r>
-              <w:rPr>
-                <w:rFonts w:hint="eastAsia" w:ascii="华文中宋" w:hAnsi="华文中宋" w:eastAsia="华文中宋" w:cs="华文中宋"/>
-                <w:b/>
-                <w:bCs/>
-                <w:color w:val="ED7D31" w:themeColor="accent2"/>
-                <w:spacing w:val="0"/>
-                <w:sz w:val="21"/>
-                <w:szCs w:val="24"/>
-                <w:vertAlign w:val="baseline"/>
-                <w:lang w:val="en-US" w:eastAsia="zh-CN"/>
-                <w14:textFill>
-                  <w14:solidFill>
-                    <w14:schemeClr w14:val="accent2"/>
-                  </w14:solidFill>
-                </w14:textFill>
-              </w:rPr>
-              <w:t>DNS1=114.114.114.114</w:t>
-            </w:r>
+                <w:rFonts w:hint="eastAsia" w:ascii="华文中宋" w:hAnsi="华文中宋" w:eastAsia="华文中宋" w:cs="华文中宋"/>
+                <w:b/>
+                <w:bCs/>
+                <w:color w:val="EA82F1"/>
+                <w:sz w:val="21"/>
+                <w:szCs w:val="24"/>
+                <w:lang w:val="en-US" w:eastAsia="zh-CN"/>
+              </w:rPr>
+            </w:pPr>
           </w:p>
         </w:tc>
       </w:tr>
@@ -14845,6 +15170,7 @@
         <w:tc>
           <w:tcPr>
             <w:tcW w:w="0" w:type="auto"/>
+            <w:gridSpan w:val="2"/>
           </w:tcPr>
           <w:p>
             <w:pPr>
@@ -14852,40 +15178,30 @@
               <w:spacing w:line="240" w:lineRule="auto"/>
               <w:jc w:val="left"/>
               <w:rPr>
-                <w:rFonts w:hint="default" w:ascii="华文中宋" w:hAnsi="华文中宋" w:eastAsia="华文中宋" w:cs="华文中宋"/>
-                <w:b/>
-                <w:bCs/>
-                <w:color w:val="ED7D31" w:themeColor="accent2"/>
-                <w:spacing w:val="0"/>
-                <w:sz w:val="21"/>
-                <w:szCs w:val="24"/>
-                <w:vertAlign w:val="baseline"/>
-                <w:lang w:val="en-US" w:eastAsia="zh-CN"/>
-                <w14:textFill>
-                  <w14:solidFill>
-                    <w14:schemeClr w14:val="accent2"/>
-                  </w14:solidFill>
-                </w14:textFill>
-              </w:rPr>
-            </w:pPr>
-            <w:r>
-              <w:rPr>
-                <w:rFonts w:hint="eastAsia" w:ascii="华文中宋" w:hAnsi="华文中宋" w:eastAsia="华文中宋" w:cs="华文中宋"/>
-                <w:b/>
-                <w:bCs/>
-                <w:color w:val="ED7D31" w:themeColor="accent2"/>
-                <w:spacing w:val="0"/>
-                <w:sz w:val="21"/>
-                <w:szCs w:val="24"/>
-                <w:vertAlign w:val="baseline"/>
-                <w:lang w:val="en-US" w:eastAsia="zh-CN"/>
-                <w14:textFill>
-                  <w14:solidFill>
-                    <w14:schemeClr w14:val="accent2"/>
-                  </w14:solidFill>
-                </w14:textFill>
-              </w:rPr>
-              <w:t>GATEWAY=(网关)</w:t>
+                <w:rFonts w:hint="eastAsia" w:ascii="华文中宋" w:hAnsi="华文中宋" w:eastAsia="华文中宋" w:cs="华文中宋"/>
+                <w:b/>
+                <w:bCs/>
+                <w:color w:val="FF0000"/>
+                <w:spacing w:val="0"/>
+                <w:sz w:val="21"/>
+                <w:szCs w:val="24"/>
+                <w:vertAlign w:val="baseline"/>
+                <w:lang w:val="en-US" w:eastAsia="zh-CN"/>
+              </w:rPr>
+            </w:pPr>
+            <w:r>
+              <w:rPr>
+                <w:rFonts w:hint="eastAsia" w:ascii="华文中宋" w:hAnsi="华文中宋" w:eastAsia="华文中宋" w:cs="华文中宋"/>
+                <w:b/>
+                <w:bCs/>
+                <w:color w:val="FF0000"/>
+                <w:spacing w:val="0"/>
+                <w:sz w:val="21"/>
+                <w:szCs w:val="24"/>
+                <w:vertAlign w:val="baseline"/>
+                <w:lang w:val="en-US" w:eastAsia="zh-CN"/>
+              </w:rPr>
+              <w:t>/etc/selinux/config</w:t>
             </w:r>
           </w:p>
         </w:tc>
@@ -14899,87 +15215,52 @@
               <w:spacing w:line="240" w:lineRule="auto"/>
               <w:jc w:val="left"/>
               <w:rPr>
-                <w:rFonts w:hint="default" w:ascii="华文中宋" w:hAnsi="华文中宋" w:eastAsia="华文中宋" w:cs="华文中宋"/>
-                <w:b/>
-                <w:bCs/>
-                <w:color w:val="ED7D31" w:themeColor="accent2"/>
-                <w:spacing w:val="0"/>
-                <w:sz w:val="21"/>
-                <w:szCs w:val="24"/>
-                <w:vertAlign w:val="baseline"/>
-                <w:lang w:val="en-US" w:eastAsia="zh-CN"/>
-                <w14:textFill>
-                  <w14:solidFill>
-                    <w14:schemeClr w14:val="accent2"/>
-                  </w14:solidFill>
-                </w14:textFill>
-              </w:rPr>
-            </w:pPr>
-            <w:r>
-              <w:rPr>
-                <w:rFonts w:hint="eastAsia" w:ascii="华文中宋" w:hAnsi="华文中宋" w:eastAsia="华文中宋" w:cs="华文中宋"/>
-                <w:b/>
-                <w:bCs/>
-                <w:color w:val="ED7D31" w:themeColor="accent2"/>
-                <w:spacing w:val="0"/>
-                <w:sz w:val="21"/>
-                <w:szCs w:val="24"/>
-                <w:vertAlign w:val="baseline"/>
-                <w:lang w:val="en-US" w:eastAsia="zh-CN"/>
-                <w14:textFill>
-                  <w14:solidFill>
-                    <w14:schemeClr w14:val="accent2"/>
-                  </w14:solidFill>
-                </w14:textFill>
-              </w:rPr>
-              <w:t>IPADDR=(子网IP)</w:t>
-            </w:r>
-          </w:p>
-        </w:tc>
-        <w:tc>
-          <w:tcPr>
-            <w:tcW w:w="0" w:type="auto"/>
-          </w:tcPr>
-          <w:p>
-            <w:pPr>
-              <w:bidi w:val="0"/>
-              <w:spacing w:line="240" w:lineRule="auto"/>
-              <w:jc w:val="left"/>
-              <w:rPr>
-                <w:rFonts w:hint="default" w:ascii="华文中宋" w:hAnsi="华文中宋" w:eastAsia="华文中宋" w:cs="华文中宋"/>
-                <w:b/>
-                <w:bCs/>
-                <w:color w:val="ED7D31" w:themeColor="accent2"/>
-                <w:spacing w:val="0"/>
-                <w:sz w:val="21"/>
-                <w:szCs w:val="24"/>
-                <w:vertAlign w:val="baseline"/>
-                <w:lang w:val="en-US" w:eastAsia="zh-CN"/>
-                <w14:textFill>
-                  <w14:solidFill>
-                    <w14:schemeClr w14:val="accent2"/>
-                  </w14:solidFill>
-                </w14:textFill>
-              </w:rPr>
-            </w:pPr>
-            <w:r>
-              <w:rPr>
-                <w:rFonts w:hint="eastAsia" w:ascii="华文中宋" w:hAnsi="华文中宋" w:eastAsia="华文中宋" w:cs="华文中宋"/>
-                <w:b/>
-                <w:bCs/>
-                <w:color w:val="ED7D31" w:themeColor="accent2"/>
-                <w:spacing w:val="0"/>
-                <w:sz w:val="21"/>
-                <w:szCs w:val="24"/>
-                <w:vertAlign w:val="baseline"/>
-                <w:lang w:val="en-US" w:eastAsia="zh-CN"/>
-                <w14:textFill>
-                  <w14:solidFill>
-                    <w14:schemeClr w14:val="accent2"/>
-                  </w14:solidFill>
-                </w14:textFill>
-              </w:rPr>
-              <w:t>NETMASK=(子网掩码)</w:t>
+                <w:rFonts w:hint="eastAsia" w:ascii="华文中宋" w:hAnsi="华文中宋" w:eastAsia="华文中宋" w:cs="华文中宋"/>
+                <w:b/>
+                <w:bCs/>
+                <w:color w:val="ED7D31" w:themeColor="accent2"/>
+                <w:spacing w:val="0"/>
+                <w:sz w:val="21"/>
+                <w:szCs w:val="24"/>
+                <w:vertAlign w:val="baseline"/>
+                <w:lang w:val="en-US" w:eastAsia="zh-CN"/>
+                <w14:textFill>
+                  <w14:solidFill>
+                    <w14:schemeClr w14:val="accent2"/>
+                  </w14:solidFill>
+                </w14:textFill>
+              </w:rPr>
+            </w:pPr>
+            <w:r>
+              <w:rPr>
+                <w:rFonts w:hint="eastAsia" w:ascii="华文中宋" w:hAnsi="华文中宋" w:eastAsia="华文中宋" w:cs="华文中宋"/>
+                <w:b/>
+                <w:bCs/>
+                <w:color w:val="EA82F1"/>
+                <w:sz w:val="21"/>
+                <w:szCs w:val="24"/>
+                <w:lang w:val="en-US" w:eastAsia="zh-CN"/>
+              </w:rPr>
+              <w:t>安装</w:t>
+            </w:r>
+            <w:r>
+              <w:rPr>
+                <w:rFonts w:hint="eastAsia" w:ascii="华文中宋" w:hAnsi="华文中宋" w:eastAsia="华文中宋" w:cs="华文中宋"/>
+                <w:b/>
+                <w:bCs/>
+                <w:color w:val="ED7D31" w:themeColor="accent2"/>
+                <w:spacing w:val="0"/>
+                <w:sz w:val="21"/>
+                <w:szCs w:val="24"/>
+                <w:vertAlign w:val="baseline"/>
+                <w:lang w:val="en-US" w:eastAsia="zh-CN"/>
+                <w14:textFill>
+                  <w14:solidFill>
+                    <w14:schemeClr w14:val="accent2"/>
+                  </w14:solidFill>
+                </w14:textFill>
+              </w:rPr>
+              <w:t>限制</w:t>
             </w:r>
           </w:p>
         </w:tc>
@@ -14994,317 +15275,6 @@
             <w:insideH w:val="single" w:color="auto" w:sz="4" w:space="0"/>
             <w:insideV w:val="single" w:color="auto" w:sz="4" w:space="0"/>
           </w:tblBorders>
-          <w:tblCellMar>
-            <w:top w:w="0" w:type="dxa"/>
-            <w:left w:w="108" w:type="dxa"/>
-            <w:bottom w:w="0" w:type="dxa"/>
-            <w:right w:w="108" w:type="dxa"/>
-          </w:tblCellMar>
-        </w:tblPrEx>
-        <w:tc>
-          <w:tcPr>
-            <w:tcW w:w="0" w:type="auto"/>
-            <w:gridSpan w:val="2"/>
-          </w:tcPr>
-          <w:p>
-            <w:pPr>
-              <w:bidi w:val="0"/>
-              <w:spacing w:line="240" w:lineRule="auto"/>
-              <w:jc w:val="left"/>
-              <w:rPr>
-                <w:rFonts w:hint="default" w:ascii="华文中宋" w:hAnsi="华文中宋" w:eastAsia="华文中宋" w:cs="华文中宋"/>
-                <w:b/>
-                <w:bCs/>
-                <w:color w:val="FF0000"/>
-                <w:spacing w:val="0"/>
-                <w:sz w:val="21"/>
-                <w:szCs w:val="24"/>
-                <w:vertAlign w:val="baseline"/>
-                <w:lang w:val="en-US" w:eastAsia="zh-CN"/>
-              </w:rPr>
-            </w:pPr>
-            <w:r>
-              <w:rPr>
-                <w:rFonts w:hint="eastAsia" w:ascii="华文中宋" w:hAnsi="华文中宋" w:eastAsia="华文中宋" w:cs="华文中宋"/>
-                <w:b/>
-                <w:bCs/>
-                <w:color w:val="FF0000"/>
-                <w:spacing w:val="0"/>
-                <w:sz w:val="21"/>
-                <w:szCs w:val="24"/>
-                <w:vertAlign w:val="baseline"/>
-                <w:lang w:val="en-US" w:eastAsia="zh-CN"/>
-              </w:rPr>
-              <w:t>/etc/resolv.conf</w:t>
-            </w:r>
-          </w:p>
-        </w:tc>
-        <w:tc>
-          <w:tcPr>
-            <w:tcW w:w="0" w:type="auto"/>
-          </w:tcPr>
-          <w:p>
-            <w:pPr>
-              <w:bidi w:val="0"/>
-              <w:spacing w:line="240" w:lineRule="auto"/>
-              <w:jc w:val="left"/>
-              <w:rPr>
-                <w:rFonts w:hint="default" w:ascii="华文中宋" w:hAnsi="华文中宋" w:eastAsia="华文中宋" w:cs="华文中宋"/>
-                <w:b/>
-                <w:bCs/>
-                <w:color w:val="EA82F1"/>
-                <w:sz w:val="21"/>
-                <w:szCs w:val="24"/>
-                <w:lang w:val="en-US" w:eastAsia="zh-CN"/>
-              </w:rPr>
-            </w:pPr>
-            <w:r>
-              <w:rPr>
-                <w:rFonts w:hint="eastAsia" w:ascii="华文中宋" w:hAnsi="华文中宋" w:eastAsia="华文中宋" w:cs="华文中宋"/>
-                <w:b/>
-                <w:bCs/>
-                <w:color w:val="EA82F1"/>
-                <w:sz w:val="21"/>
-                <w:szCs w:val="24"/>
-                <w:lang w:val="en-US" w:eastAsia="zh-CN"/>
-              </w:rPr>
-              <w:t>网关</w:t>
-            </w:r>
-            <w:r>
-              <w:rPr>
-                <w:rFonts w:hint="eastAsia" w:ascii="华文中宋" w:hAnsi="华文中宋" w:eastAsia="华文中宋" w:cs="华文中宋"/>
-                <w:b/>
-                <w:bCs/>
-                <w:color w:val="ED7D31" w:themeColor="accent2"/>
-                <w:spacing w:val="0"/>
-                <w:sz w:val="21"/>
-                <w:szCs w:val="24"/>
-                <w:vertAlign w:val="baseline"/>
-                <w:lang w:val="en-US" w:eastAsia="zh-CN"/>
-                <w14:textFill>
-                  <w14:solidFill>
-                    <w14:schemeClr w14:val="accent2"/>
-                  </w14:solidFill>
-                </w14:textFill>
-              </w:rPr>
-              <w:t>配置</w:t>
-            </w:r>
-          </w:p>
-        </w:tc>
-      </w:tr>
-      <w:tr>
-        <w:tblPrEx>
-          <w:tblBorders>
-            <w:top w:val="single" w:color="auto" w:sz="4" w:space="0"/>
-            <w:left w:val="single" w:color="auto" w:sz="4" w:space="0"/>
-            <w:bottom w:val="single" w:color="auto" w:sz="4" w:space="0"/>
-            <w:right w:val="single" w:color="auto" w:sz="4" w:space="0"/>
-            <w:insideH w:val="single" w:color="auto" w:sz="4" w:space="0"/>
-            <w:insideV w:val="single" w:color="auto" w:sz="4" w:space="0"/>
-          </w:tblBorders>
-          <w:tblCellMar>
-            <w:top w:w="0" w:type="dxa"/>
-            <w:left w:w="108" w:type="dxa"/>
-            <w:bottom w:w="0" w:type="dxa"/>
-            <w:right w:w="108" w:type="dxa"/>
-          </w:tblCellMar>
-        </w:tblPrEx>
-        <w:tc>
-          <w:tcPr>
-            <w:tcW w:w="0" w:type="auto"/>
-            <w:gridSpan w:val="2"/>
-          </w:tcPr>
-          <w:p>
-            <w:pPr>
-              <w:bidi w:val="0"/>
-              <w:spacing w:line="240" w:lineRule="auto"/>
-              <w:jc w:val="left"/>
-              <w:rPr>
-                <w:rFonts w:hint="default" w:ascii="华文中宋" w:hAnsi="华文中宋" w:eastAsia="华文中宋" w:cs="华文中宋"/>
-                <w:b/>
-                <w:bCs/>
-                <w:color w:val="FF0000"/>
-                <w:spacing w:val="0"/>
-                <w:sz w:val="21"/>
-                <w:szCs w:val="24"/>
-                <w:vertAlign w:val="baseline"/>
-                <w:lang w:val="en-US" w:eastAsia="zh-CN"/>
-              </w:rPr>
-            </w:pPr>
-            <w:r>
-              <w:rPr>
-                <w:rFonts w:hint="eastAsia" w:ascii="华文中宋" w:hAnsi="华文中宋" w:eastAsia="华文中宋" w:cs="华文中宋"/>
-                <w:b/>
-                <w:bCs/>
-                <w:color w:val="ED7D31" w:themeColor="accent2"/>
-                <w:spacing w:val="0"/>
-                <w:sz w:val="21"/>
-                <w:szCs w:val="24"/>
-                <w:vertAlign w:val="baseline"/>
-                <w:lang w:val="en-US" w:eastAsia="zh-CN"/>
-                <w14:textFill>
-                  <w14:solidFill>
-                    <w14:schemeClr w14:val="accent2"/>
-                  </w14:solidFill>
-                </w14:textFill>
-              </w:rPr>
-              <w:t>nameserver (网关)</w:t>
-            </w:r>
-          </w:p>
-        </w:tc>
-        <w:tc>
-          <w:tcPr>
-            <w:tcW w:w="0" w:type="auto"/>
-          </w:tcPr>
-          <w:p>
-            <w:pPr>
-              <w:bidi w:val="0"/>
-              <w:spacing w:line="240" w:lineRule="auto"/>
-              <w:jc w:val="left"/>
-              <w:rPr>
-                <w:rFonts w:hint="eastAsia" w:ascii="华文中宋" w:hAnsi="华文中宋" w:eastAsia="华文中宋" w:cs="华文中宋"/>
-                <w:b/>
-                <w:bCs/>
-                <w:color w:val="EA82F1"/>
-                <w:sz w:val="21"/>
-                <w:szCs w:val="24"/>
-                <w:lang w:val="en-US" w:eastAsia="zh-CN"/>
-              </w:rPr>
-            </w:pPr>
-          </w:p>
-        </w:tc>
-      </w:tr>
-      <w:tr>
-        <w:tblPrEx>
-          <w:tblBorders>
-            <w:top w:val="single" w:color="auto" w:sz="4" w:space="0"/>
-            <w:left w:val="single" w:color="auto" w:sz="4" w:space="0"/>
-            <w:bottom w:val="single" w:color="auto" w:sz="4" w:space="0"/>
-            <w:right w:val="single" w:color="auto" w:sz="4" w:space="0"/>
-            <w:insideH w:val="single" w:color="auto" w:sz="4" w:space="0"/>
-            <w:insideV w:val="single" w:color="auto" w:sz="4" w:space="0"/>
-          </w:tblBorders>
-          <w:tblCellMar>
-            <w:top w:w="0" w:type="dxa"/>
-            <w:left w:w="108" w:type="dxa"/>
-            <w:bottom w:w="0" w:type="dxa"/>
-            <w:right w:w="108" w:type="dxa"/>
-          </w:tblCellMar>
-        </w:tblPrEx>
-        <w:tc>
-          <w:tcPr>
-            <w:tcW w:w="0" w:type="auto"/>
-            <w:gridSpan w:val="2"/>
-          </w:tcPr>
-          <w:p>
-            <w:pPr>
-              <w:bidi w:val="0"/>
-              <w:spacing w:line="240" w:lineRule="auto"/>
-              <w:jc w:val="left"/>
-              <w:rPr>
-                <w:rFonts w:hint="eastAsia" w:ascii="华文中宋" w:hAnsi="华文中宋" w:eastAsia="华文中宋" w:cs="华文中宋"/>
-                <w:b/>
-                <w:bCs/>
-                <w:color w:val="FF0000"/>
-                <w:spacing w:val="0"/>
-                <w:sz w:val="21"/>
-                <w:szCs w:val="24"/>
-                <w:vertAlign w:val="baseline"/>
-                <w:lang w:val="en-US" w:eastAsia="zh-CN"/>
-              </w:rPr>
-            </w:pPr>
-            <w:r>
-              <w:rPr>
-                <w:rFonts w:hint="eastAsia" w:ascii="华文中宋" w:hAnsi="华文中宋" w:eastAsia="华文中宋" w:cs="华文中宋"/>
-                <w:b/>
-                <w:bCs/>
-                <w:color w:val="FF0000"/>
-                <w:spacing w:val="0"/>
-                <w:sz w:val="21"/>
-                <w:szCs w:val="24"/>
-                <w:vertAlign w:val="baseline"/>
-                <w:lang w:val="en-US" w:eastAsia="zh-CN"/>
-              </w:rPr>
-              <w:t>/etc/selinux/config</w:t>
-            </w:r>
-          </w:p>
-        </w:tc>
-        <w:tc>
-          <w:tcPr>
-            <w:tcW w:w="0" w:type="auto"/>
-          </w:tcPr>
-          <w:p>
-            <w:pPr>
-              <w:bidi w:val="0"/>
-              <w:spacing w:line="240" w:lineRule="auto"/>
-              <w:jc w:val="left"/>
-              <w:rPr>
-                <w:rFonts w:hint="eastAsia" w:ascii="华文中宋" w:hAnsi="华文中宋" w:eastAsia="华文中宋" w:cs="华文中宋"/>
-                <w:b/>
-                <w:bCs/>
-                <w:color w:val="ED7D31" w:themeColor="accent2"/>
-                <w:spacing w:val="0"/>
-                <w:sz w:val="21"/>
-                <w:szCs w:val="24"/>
-                <w:vertAlign w:val="baseline"/>
-                <w:lang w:val="en-US" w:eastAsia="zh-CN"/>
-                <w14:textFill>
-                  <w14:solidFill>
-                    <w14:schemeClr w14:val="accent2"/>
-                  </w14:solidFill>
-                </w14:textFill>
-              </w:rPr>
-            </w:pPr>
-            <w:r>
-              <w:rPr>
-                <w:rFonts w:hint="eastAsia" w:ascii="华文中宋" w:hAnsi="华文中宋" w:eastAsia="华文中宋" w:cs="华文中宋"/>
-                <w:b/>
-                <w:bCs/>
-                <w:color w:val="EA82F1"/>
-                <w:sz w:val="21"/>
-                <w:szCs w:val="24"/>
-                <w:lang w:val="en-US" w:eastAsia="zh-CN"/>
-              </w:rPr>
-              <w:t>安装</w:t>
-            </w:r>
-            <w:r>
-              <w:rPr>
-                <w:rFonts w:hint="eastAsia" w:ascii="华文中宋" w:hAnsi="华文中宋" w:eastAsia="华文中宋" w:cs="华文中宋"/>
-                <w:b/>
-                <w:bCs/>
-                <w:color w:val="ED7D31" w:themeColor="accent2"/>
-                <w:spacing w:val="0"/>
-                <w:sz w:val="21"/>
-                <w:szCs w:val="24"/>
-                <w:vertAlign w:val="baseline"/>
-                <w:lang w:val="en-US" w:eastAsia="zh-CN"/>
-                <w14:textFill>
-                  <w14:solidFill>
-                    <w14:schemeClr w14:val="accent2"/>
-                  </w14:solidFill>
-                </w14:textFill>
-              </w:rPr>
-              <w:t>限制</w:t>
-            </w:r>
-          </w:p>
-        </w:tc>
-      </w:tr>
-      <w:tr>
-        <w:tblPrEx>
-          <w:tblBorders>
-            <w:top w:val="single" w:color="auto" w:sz="4" w:space="0"/>
-            <w:left w:val="single" w:color="auto" w:sz="4" w:space="0"/>
-            <w:bottom w:val="single" w:color="auto" w:sz="4" w:space="0"/>
-            <w:right w:val="single" w:color="auto" w:sz="4" w:space="0"/>
-            <w:insideH w:val="single" w:color="auto" w:sz="4" w:space="0"/>
-            <w:insideV w:val="single" w:color="auto" w:sz="4" w:space="0"/>
-          </w:tblBorders>
-          <w:tblCellMar>
-            <w:top w:w="0" w:type="dxa"/>
-            <w:left w:w="108" w:type="dxa"/>
-            <w:bottom w:w="0" w:type="dxa"/>
-            <w:right w:w="108" w:type="dxa"/>
-          </w:tblCellMar>
         </w:tblPrEx>
         <w:tc>
           <w:tcPr>
@@ -17297,8 +17267,8 @@
           </w14:textFill>
         </w:rPr>
       </w:pPr>
-      <w:bookmarkStart w:id="1" w:name="_Toc131002735"/>
-      <w:bookmarkStart w:id="2" w:name="_Toc12901"/>
+      <w:bookmarkStart w:id="1" w:name="_Toc12901"/>
+      <w:bookmarkStart w:id="2" w:name="_Toc131002735"/>
       <w:r>
         <w:rPr>
           <w:rFonts w:hint="eastAsia" w:ascii="华文中宋" w:hAnsi="华文中宋" w:eastAsia="华文中宋" w:cs="华文中宋"/>
@@ -18658,28 +18628,7 @@
             </w14:solidFill>
           </w14:textFill>
         </w:rPr>
-        <w:t>git config --global http.proxy "</w:t>
-      </w:r>
-      <w:bookmarkStart w:id="9" w:name="_GoBack"/>
-      <w:bookmarkEnd w:id="9"/>
-      <w:r>
-        <w:rPr>
-          <w:rFonts w:hint="eastAsia" w:ascii="华文中宋" w:hAnsi="华文中宋" w:eastAsia="华文中宋" w:cs="华文中宋"/>
-          <w:b/>
-          <w:bCs/>
-          <w:color w:val="ED7D31" w:themeColor="accent2"/>
-          <w:spacing w:val="0"/>
-          <w:sz w:val="21"/>
-          <w:szCs w:val="24"/>
-          <w:vertAlign w:val="baseline"/>
-          <w:lang w:val="en-US" w:eastAsia="zh-CN"/>
-          <w14:textFill>
-            <w14:solidFill>
-              <w14:schemeClr w14:val="accent2"/>
-            </w14:solidFill>
-          </w14:textFill>
-        </w:rPr>
-        <w:t>http://127.0.0.1:8080"</w:t>
+        <w:t>git config --global http.proxy "http://127.0.0.1:8080"</w:t>
       </w:r>
     </w:p>
     <w:p>
@@ -18729,6 +18678,66 @@
         <w:bidi w:val="0"/>
         <w:spacing w:line="240" w:lineRule="auto"/>
         <w:jc w:val="left"/>
+        <w:rPr>
+          <w:rFonts w:hint="eastAsia" w:ascii="华文中宋" w:hAnsi="华文中宋" w:eastAsia="华文中宋" w:cs="华文中宋"/>
+          <w:b/>
+          <w:bCs/>
+          <w:color w:val="ED7D31" w:themeColor="accent2"/>
+          <w:spacing w:val="0"/>
+          <w:sz w:val="21"/>
+          <w:szCs w:val="24"/>
+          <w:vertAlign w:val="baseline"/>
+          <w:lang w:val="en-US" w:eastAsia="zh-CN"/>
+          <w14:textFill>
+            <w14:solidFill>
+              <w14:schemeClr w14:val="accent2"/>
+            </w14:solidFill>
+          </w14:textFill>
+        </w:rPr>
+      </w:pPr>
+      <w:r>
+        <w:rPr>
+          <w:rFonts w:hint="eastAsia" w:ascii="华文中宋" w:hAnsi="华文中宋" w:eastAsia="华文中宋" w:cs="华文中宋"/>
+          <w:b/>
+          <w:bCs/>
+          <w:color w:val="ED7D31" w:themeColor="accent2"/>
+          <w:spacing w:val="0"/>
+          <w:sz w:val="21"/>
+          <w:szCs w:val="24"/>
+          <w:vertAlign w:val="baseline"/>
+          <w:lang w:val="en-US" w:eastAsia="zh-CN"/>
+          <w14:textFill>
+            <w14:solidFill>
+              <w14:schemeClr w14:val="accent2"/>
+            </w14:solidFill>
+          </w14:textFill>
+        </w:rPr>
+        <w:t>git log --pretty=format:"%ad %h %s" --date=short --shortstat</w:t>
+      </w:r>
+      <w:bookmarkStart w:id="9" w:name="_GoBack"/>
+      <w:bookmarkEnd w:id="9"/>
+    </w:p>
+    <w:p>
+      <w:pPr>
+        <w:bidi w:val="0"/>
+        <w:spacing w:line="240" w:lineRule="auto"/>
+        <w:jc w:val="left"/>
+        <w:rPr>
+          <w:rFonts w:hint="eastAsia" w:ascii="华文中宋" w:hAnsi="华文中宋" w:eastAsia="华文中宋" w:cs="华文中宋"/>
+          <w:b/>
+          <w:bCs/>
+          <w:color w:val="ED7D31" w:themeColor="accent2"/>
+          <w:spacing w:val="0"/>
+          <w:sz w:val="21"/>
+          <w:szCs w:val="24"/>
+          <w:vertAlign w:val="baseline"/>
+          <w:lang w:val="en-US" w:eastAsia="zh-CN"/>
+          <w14:textFill>
+            <w14:solidFill>
+              <w14:schemeClr w14:val="accent2"/>
+            </w14:solidFill>
+          </w14:textFill>
+        </w:rPr>
       </w:pPr>
     </w:p>
     <w:p>
@@ -29867,12 +29876,6 @@
             <w:insideH w:val="single" w:color="auto" w:sz="4" w:space="0"/>
             <w:insideV w:val="single" w:color="auto" w:sz="4" w:space="0"/>
           </w:tblBorders>
-          <w:tblCellMar>
-            <w:top w:w="0" w:type="dxa"/>
-            <w:left w:w="108" w:type="dxa"/>
-            <w:bottom w:w="0" w:type="dxa"/>
-            <w:right w:w="108" w:type="dxa"/>
-          </w:tblCellMar>
         </w:tblPrEx>
         <w:tc>
           <w:tcPr>
@@ -38023,12 +38026,6 @@
             <w:insideH w:val="single" w:color="auto" w:sz="4" w:space="0"/>
             <w:insideV w:val="single" w:color="auto" w:sz="4" w:space="0"/>
           </w:tblBorders>
-          <w:tblCellMar>
-            <w:top w:w="0" w:type="dxa"/>
-            <w:left w:w="108" w:type="dxa"/>
-            <w:bottom w:w="0" w:type="dxa"/>
-            <w:right w:w="108" w:type="dxa"/>
-          </w:tblCellMar>
         </w:tblPrEx>
         <w:tc>
           <w:tcPr>
@@ -38244,6 +38241,12 @@
             <w:insideH w:val="single" w:color="auto" w:sz="4" w:space="0"/>
             <w:insideV w:val="single" w:color="auto" w:sz="4" w:space="0"/>
           </w:tblBorders>
+          <w:tblCellMar>
+            <w:top w:w="0" w:type="dxa"/>
+            <w:left w:w="108" w:type="dxa"/>
+            <w:bottom w:w="0" w:type="dxa"/>
+            <w:right w:w="108" w:type="dxa"/>
+          </w:tblCellMar>
         </w:tblPrEx>
         <w:tc>
           <w:tcPr>
@@ -38402,12 +38405,6 @@
             <w:insideH w:val="single" w:color="auto" w:sz="4" w:space="0"/>
             <w:insideV w:val="single" w:color="auto" w:sz="4" w:space="0"/>
           </w:tblBorders>
-          <w:tblCellMar>
-            <w:top w:w="0" w:type="dxa"/>
-            <w:left w:w="108" w:type="dxa"/>
-            <w:bottom w:w="0" w:type="dxa"/>
-            <w:right w:w="108" w:type="dxa"/>
-          </w:tblCellMar>
         </w:tblPrEx>
         <w:tc>
           <w:tcPr>
@@ -38900,6 +38897,12 @@
             <w:insideH w:val="single" w:color="auto" w:sz="4" w:space="0"/>
             <w:insideV w:val="single" w:color="auto" w:sz="4" w:space="0"/>
           </w:tblBorders>
+          <w:tblCellMar>
+            <w:top w:w="0" w:type="dxa"/>
+            <w:left w:w="108" w:type="dxa"/>
+            <w:bottom w:w="0" w:type="dxa"/>
+            <w:right w:w="108" w:type="dxa"/>
+          </w:tblCellMar>
         </w:tblPrEx>
         <w:tc>
           <w:tcPr>
@@ -39185,12 +39188,6 @@
             <w:insideH w:val="single" w:color="auto" w:sz="4" w:space="0"/>
             <w:insideV w:val="single" w:color="auto" w:sz="4" w:space="0"/>
           </w:tblBorders>
-          <w:tblCellMar>
-            <w:top w:w="0" w:type="dxa"/>
-            <w:left w:w="108" w:type="dxa"/>
-            <w:bottom w:w="0" w:type="dxa"/>
-            <w:right w:w="108" w:type="dxa"/>
-          </w:tblCellMar>
         </w:tblPrEx>
         <w:tc>
           <w:tcPr>
@@ -40320,6 +40317,12 @@
             <w:insideH w:val="single" w:color="auto" w:sz="4" w:space="0"/>
             <w:insideV w:val="single" w:color="auto" w:sz="4" w:space="0"/>
           </w:tblBorders>
+          <w:tblCellMar>
+            <w:top w:w="0" w:type="dxa"/>
+            <w:left w:w="108" w:type="dxa"/>
+            <w:bottom w:w="0" w:type="dxa"/>
+            <w:right w:w="108" w:type="dxa"/>
+          </w:tblCellMar>
         </w:tblPrEx>
         <w:tc>
           <w:tcPr>
@@ -40979,12 +40982,6 @@
             <w:insideH w:val="single" w:color="auto" w:sz="4" w:space="0"/>
             <w:insideV w:val="single" w:color="auto" w:sz="4" w:space="0"/>
           </w:tblBorders>
-          <w:tblCellMar>
-            <w:top w:w="0" w:type="dxa"/>
-            <w:left w:w="108" w:type="dxa"/>
-            <w:bottom w:w="0" w:type="dxa"/>
-            <w:right w:w="108" w:type="dxa"/>
-          </w:tblCellMar>
         </w:tblPrEx>
         <w:tc>
           <w:tcPr>
@@ -41795,6 +41792,12 @@
             <w:insideH w:val="single" w:color="auto" w:sz="4" w:space="0"/>
             <w:insideV w:val="single" w:color="auto" w:sz="4" w:space="0"/>
           </w:tblBorders>
+          <w:tblCellMar>
+            <w:top w:w="0" w:type="dxa"/>
+            <w:left w:w="108" w:type="dxa"/>
+            <w:bottom w:w="0" w:type="dxa"/>
+            <w:right w:w="108" w:type="dxa"/>
+          </w:tblCellMar>
         </w:tblPrEx>
         <w:tc>
           <w:tcPr>
@@ -42869,12 +42872,6 @@
             <w:insideH w:val="single" w:color="auto" w:sz="4" w:space="0"/>
             <w:insideV w:val="single" w:color="auto" w:sz="4" w:space="0"/>
           </w:tblBorders>
-          <w:tblCellMar>
-            <w:top w:w="0" w:type="dxa"/>
-            <w:left w:w="108" w:type="dxa"/>
-            <w:bottom w:w="0" w:type="dxa"/>
-            <w:right w:w="108" w:type="dxa"/>
-          </w:tblCellMar>
         </w:tblPrEx>
         <w:tc>
           <w:tcPr>
@@ -43243,12 +43240,6 @@
             <w:insideH w:val="single" w:color="auto" w:sz="4" w:space="0"/>
             <w:insideV w:val="single" w:color="auto" w:sz="4" w:space="0"/>
           </w:tblBorders>
-          <w:tblCellMar>
-            <w:top w:w="0" w:type="dxa"/>
-            <w:left w:w="108" w:type="dxa"/>
-            <w:bottom w:w="0" w:type="dxa"/>
-            <w:right w:w="108" w:type="dxa"/>
-          </w:tblCellMar>
         </w:tblPrEx>
         <w:tc>
           <w:tcPr>
@@ -46243,6 +46234,12 @@
             <w:insideH w:val="single" w:color="auto" w:sz="4" w:space="0"/>
             <w:insideV w:val="single" w:color="auto" w:sz="4" w:space="0"/>
           </w:tblBorders>
+          <w:tblCellMar>
+            <w:top w:w="0" w:type="dxa"/>
+            <w:left w:w="108" w:type="dxa"/>
+            <w:bottom w:w="0" w:type="dxa"/>
+            <w:right w:w="108" w:type="dxa"/>
+          </w:tblCellMar>
         </w:tblPrEx>
         <w:tc>
           <w:tcPr>
@@ -46998,12 +46995,6 @@
             <w:insideH w:val="single" w:color="auto" w:sz="4" w:space="0"/>
             <w:insideV w:val="single" w:color="auto" w:sz="4" w:space="0"/>
           </w:tblBorders>
-          <w:tblCellMar>
-            <w:top w:w="0" w:type="dxa"/>
-            <w:left w:w="108" w:type="dxa"/>
-            <w:bottom w:w="0" w:type="dxa"/>
-            <w:right w:w="108" w:type="dxa"/>
-          </w:tblCellMar>
         </w:tblPrEx>
         <w:tc>
           <w:tcPr>
@@ -47107,12 +47098,6 @@
             <w:insideH w:val="single" w:color="auto" w:sz="4" w:space="0"/>
             <w:insideV w:val="single" w:color="auto" w:sz="4" w:space="0"/>
           </w:tblBorders>
-          <w:tblCellMar>
-            <w:top w:w="0" w:type="dxa"/>
-            <w:left w:w="108" w:type="dxa"/>
-            <w:bottom w:w="0" w:type="dxa"/>
-            <w:right w:w="108" w:type="dxa"/>
-          </w:tblCellMar>
         </w:tblPrEx>
         <w:tc>
           <w:tcPr>
@@ -47216,12 +47201,6 @@
             <w:insideH w:val="single" w:color="auto" w:sz="4" w:space="0"/>
             <w:insideV w:val="single" w:color="auto" w:sz="4" w:space="0"/>
           </w:tblBorders>
-          <w:tblCellMar>
-            <w:top w:w="0" w:type="dxa"/>
-            <w:left w:w="108" w:type="dxa"/>
-            <w:bottom w:w="0" w:type="dxa"/>
-            <w:right w:w="108" w:type="dxa"/>
-          </w:tblCellMar>
         </w:tblPrEx>
         <w:tc>
           <w:tcPr>

</xml_diff>

<commit_message>
update on 2025-11-16 21:39:28.572160
</commit_message>
<xml_diff>
--- a/cfg - system.docx
+++ b/cfg - system.docx
@@ -5544,6 +5544,48 @@
               <w:spacing w:line="240" w:lineRule="auto"/>
               <w:jc w:val="left"/>
               <w:rPr>
+                <w:rFonts w:hint="eastAsia" w:ascii="华文中宋" w:hAnsi="华文中宋" w:eastAsia="华文中宋" w:cs="华文中宋"/>
+                <w:b/>
+                <w:bCs/>
+                <w:color w:val="ED7D31" w:themeColor="accent2"/>
+                <w:spacing w:val="0"/>
+                <w:sz w:val="21"/>
+                <w:szCs w:val="24"/>
+                <w:vertAlign w:val="baseline"/>
+                <w:lang w:val="en-US" w:eastAsia="zh-CN"/>
+                <w14:textFill>
+                  <w14:solidFill>
+                    <w14:schemeClr w14:val="accent2"/>
+                  </w14:solidFill>
+                </w14:textFill>
+              </w:rPr>
+            </w:pPr>
+            <w:r>
+              <w:rPr>
+                <w:rFonts w:hint="eastAsia" w:ascii="华文中宋" w:hAnsi="华文中宋" w:eastAsia="华文中宋" w:cs="华文中宋"/>
+                <w:b/>
+                <w:bCs/>
+                <w:color w:val="ED7D31" w:themeColor="accent2"/>
+                <w:spacing w:val="0"/>
+                <w:sz w:val="21"/>
+                <w:szCs w:val="24"/>
+                <w:vertAlign w:val="baseline"/>
+                <w:lang w:val="en-US" w:eastAsia="zh-CN"/>
+                <w14:textFill>
+                  <w14:solidFill>
+                    <w14:schemeClr w14:val="accent2"/>
+                  </w14:solidFill>
+                </w14:textFill>
+              </w:rPr>
+              <w:t>文件</w:t>
+            </w:r>
+          </w:p>
+          <w:p>
+            <w:pPr>
+              <w:bidi w:val="0"/>
+              <w:spacing w:line="240" w:lineRule="auto"/>
+              <w:jc w:val="left"/>
+              <w:rPr>
                 <w:rFonts w:hint="default" w:ascii="华文中宋" w:hAnsi="华文中宋" w:eastAsia="华文中宋" w:cs="华文中宋"/>
                 <w:b/>
                 <w:bCs/>
@@ -5562,22 +5604,22 @@
             </w:pPr>
             <w:r>
               <w:rPr>
-                <w:rFonts w:hint="eastAsia" w:ascii="华文中宋" w:hAnsi="华文中宋" w:eastAsia="华文中宋" w:cs="华文中宋"/>
-                <w:b/>
-                <w:bCs/>
-                <w:color w:val="ED7D31" w:themeColor="accent2"/>
-                <w:spacing w:val="0"/>
-                <w:sz w:val="21"/>
-                <w:szCs w:val="24"/>
-                <w:vertAlign w:val="baseline"/>
-                <w:lang w:val="en-US" w:eastAsia="zh-CN"/>
-                <w14:textFill>
-                  <w14:solidFill>
-                    <w14:schemeClr w14:val="accent2"/>
-                  </w14:solidFill>
-                </w14:textFill>
-              </w:rPr>
-              <w:t>文件</w:t>
+                <w:rFonts w:hint="eastAsia" w:ascii="华文中宋" w:hAnsi="华文中宋" w:cs="华文中宋"/>
+                <w:b/>
+                <w:bCs/>
+                <w:color w:val="ED7D31" w:themeColor="accent2"/>
+                <w:spacing w:val="0"/>
+                <w:sz w:val="21"/>
+                <w:szCs w:val="24"/>
+                <w:vertAlign w:val="baseline"/>
+                <w:lang w:val="en-US" w:eastAsia="zh-CN"/>
+                <w14:textFill>
+                  <w14:solidFill>
+                    <w14:schemeClr w14:val="accent2"/>
+                  </w14:solidFill>
+                </w14:textFill>
+              </w:rPr>
+              <w:t>+</w:t>
             </w:r>
           </w:p>
         </w:tc>
@@ -5729,6 +5771,7 @@
           <w:tcPr>
             <w:tcW w:w="0" w:type="auto"/>
             <w:vMerge w:val="continue"/>
+            <w:tcBorders/>
             <w:vAlign w:val="center"/>
           </w:tcPr>
           <w:p>
@@ -5877,6 +5920,7 @@
           <w:tcPr>
             <w:tcW w:w="0" w:type="auto"/>
             <w:vMerge w:val="continue"/>
+            <w:tcBorders/>
             <w:vAlign w:val="center"/>
           </w:tcPr>
           <w:p>
@@ -5901,25 +5945,6 @@
                 </w14:textFill>
               </w:rPr>
             </w:pPr>
-            <w:r>
-              <w:rPr>
-                <w:rFonts w:hint="eastAsia" w:ascii="华文中宋" w:hAnsi="华文中宋" w:cs="华文中宋"/>
-                <w:b/>
-                <w:bCs/>
-                <w:color w:val="ED7D31" w:themeColor="accent2"/>
-                <w:spacing w:val="0"/>
-                <w:sz w:val="21"/>
-                <w:szCs w:val="24"/>
-                <w:vertAlign w:val="baseline"/>
-                <w:lang w:val="en-US" w:eastAsia="zh-CN"/>
-                <w14:textFill>
-                  <w14:solidFill>
-                    <w14:schemeClr w14:val="accent2"/>
-                  </w14:solidFill>
-                </w14:textFill>
-              </w:rPr>
-              <w:t>+</w:t>
-            </w:r>
           </w:p>
         </w:tc>
         <w:tc>
@@ -6055,6 +6080,7 @@
           <w:tcPr>
             <w:tcW w:w="0" w:type="auto"/>
             <w:vMerge w:val="continue"/>
+            <w:tcBorders/>
             <w:vAlign w:val="center"/>
           </w:tcPr>
           <w:p>
@@ -6164,6 +6190,7 @@
           <w:tcPr>
             <w:tcW w:w="0" w:type="auto"/>
             <w:vMerge w:val="continue"/>
+            <w:tcBorders/>
             <w:vAlign w:val="center"/>
           </w:tcPr>
           <w:p>
@@ -6310,6 +6337,7 @@
           <w:tcPr>
             <w:tcW w:w="0" w:type="auto"/>
             <w:vMerge w:val="continue"/>
+            <w:tcBorders/>
             <w:vAlign w:val="center"/>
           </w:tcPr>
           <w:p>
@@ -6370,7 +6398,7 @@
                 <w:vertAlign w:val="baseline"/>
                 <w:lang w:val="en-US" w:eastAsia="zh-CN"/>
               </w:rPr>
-              <w:t>du -sh &lt;dir&gt;</w:t>
+              <w:t>du -h &lt;dir&gt;</w:t>
             </w:r>
           </w:p>
         </w:tc>
@@ -6424,176 +6452,6 @@
                 </w14:textFill>
               </w:rPr>
               <w:t>大小</w:t>
-            </w:r>
-          </w:p>
-        </w:tc>
-      </w:tr>
-      <w:tr>
-        <w:tblPrEx>
-          <w:tblBorders>
-            <w:top w:val="single" w:color="auto" w:sz="4" w:space="0"/>
-            <w:left w:val="single" w:color="auto" w:sz="4" w:space="0"/>
-            <w:bottom w:val="single" w:color="auto" w:sz="4" w:space="0"/>
-            <w:right w:val="single" w:color="auto" w:sz="4" w:space="0"/>
-            <w:insideH w:val="single" w:color="auto" w:sz="4" w:space="0"/>
-            <w:insideV w:val="single" w:color="auto" w:sz="4" w:space="0"/>
-          </w:tblBorders>
-        </w:tblPrEx>
-        <w:tc>
-          <w:tcPr>
-            <w:tcW w:w="0" w:type="auto"/>
-            <w:vMerge w:val="continue"/>
-            <w:vAlign w:val="center"/>
-          </w:tcPr>
-          <w:p>
-            <w:pPr>
-              <w:bidi w:val="0"/>
-              <w:spacing w:line="240" w:lineRule="auto"/>
-              <w:jc w:val="left"/>
-              <w:rPr>
-                <w:rFonts w:hint="eastAsia" w:ascii="华文中宋" w:hAnsi="华文中宋" w:eastAsia="华文中宋" w:cs="华文中宋"/>
-                <w:b/>
-                <w:bCs/>
-                <w:color w:val="ED7D31" w:themeColor="accent2"/>
-                <w:spacing w:val="0"/>
-                <w:sz w:val="21"/>
-                <w:szCs w:val="24"/>
-                <w:vertAlign w:val="baseline"/>
-                <w:lang w:val="en-US" w:eastAsia="zh-CN"/>
-                <w14:textFill>
-                  <w14:solidFill>
-                    <w14:schemeClr w14:val="accent2"/>
-                  </w14:solidFill>
-                </w14:textFill>
-              </w:rPr>
-            </w:pPr>
-          </w:p>
-        </w:tc>
-        <w:tc>
-          <w:tcPr>
-            <w:tcW w:w="0" w:type="auto"/>
-            <w:vAlign w:val="center"/>
-          </w:tcPr>
-          <w:p>
-            <w:pPr>
-              <w:bidi w:val="0"/>
-              <w:spacing w:line="240" w:lineRule="auto"/>
-              <w:jc w:val="left"/>
-              <w:rPr>
-                <w:rFonts w:hint="default" w:ascii="华文中宋" w:hAnsi="华文中宋" w:eastAsia="华文中宋" w:cs="华文中宋"/>
-                <w:b/>
-                <w:bCs/>
-                <w:color w:val="ED7D31" w:themeColor="accent2"/>
-                <w:spacing w:val="0"/>
-                <w:kern w:val="2"/>
-                <w:sz w:val="21"/>
-                <w:szCs w:val="24"/>
-                <w:vertAlign w:val="baseline"/>
-                <w:lang w:val="en-US" w:eastAsia="zh-CN" w:bidi="ar-SA"/>
-                <w14:textFill>
-                  <w14:solidFill>
-                    <w14:schemeClr w14:val="accent2"/>
-                  </w14:solidFill>
-                </w14:textFill>
-              </w:rPr>
-            </w:pPr>
-            <w:r>
-              <w:rPr>
-                <w:rFonts w:hint="eastAsia" w:ascii="华文中宋" w:hAnsi="华文中宋" w:eastAsia="华文中宋" w:cs="华文中宋"/>
-                <w:b/>
-                <w:bCs/>
-                <w:color w:val="FF0000"/>
-                <w:spacing w:val="0"/>
-                <w:sz w:val="21"/>
-                <w:szCs w:val="24"/>
-                <w:vertAlign w:val="baseline"/>
-                <w:lang w:val="en-US" w:eastAsia="zh-CN"/>
-              </w:rPr>
-              <w:t>cp &lt;old&gt; &lt;new&gt;</w:t>
-            </w:r>
-          </w:p>
-        </w:tc>
-        <w:tc>
-          <w:tcPr>
-            <w:tcW w:w="0" w:type="auto"/>
-            <w:vMerge w:val="restart"/>
-            <w:vAlign w:val="center"/>
-          </w:tcPr>
-          <w:p>
-            <w:pPr>
-              <w:bidi w:val="0"/>
-              <w:spacing w:line="240" w:lineRule="auto"/>
-              <w:jc w:val="left"/>
-              <w:rPr>
-                <w:rFonts w:hint="eastAsia" w:ascii="华文中宋" w:hAnsi="华文中宋" w:eastAsia="华文中宋" w:cs="华文中宋"/>
-                <w:b/>
-                <w:bCs/>
-                <w:color w:val="ED7D31" w:themeColor="accent2"/>
-                <w:spacing w:val="0"/>
-                <w:kern w:val="2"/>
-                <w:sz w:val="21"/>
-                <w:szCs w:val="24"/>
-                <w:vertAlign w:val="baseline"/>
-                <w:lang w:val="en-US" w:eastAsia="zh-CN" w:bidi="ar-SA"/>
-                <w14:textFill>
-                  <w14:solidFill>
-                    <w14:schemeClr w14:val="accent2"/>
-                  </w14:solidFill>
-                </w14:textFill>
-              </w:rPr>
-            </w:pPr>
-            <w:r>
-              <w:rPr>
-                <w:rFonts w:hint="eastAsia" w:ascii="华文中宋" w:hAnsi="华文中宋" w:eastAsia="华文中宋" w:cs="华文中宋"/>
-                <w:b/>
-                <w:bCs/>
-                <w:color w:val="EA82F1"/>
-                <w:sz w:val="21"/>
-                <w:szCs w:val="24"/>
-                <w:lang w:val="en-US" w:eastAsia="zh-CN"/>
-              </w:rPr>
-              <w:t>拷贝</w:t>
-            </w:r>
-          </w:p>
-        </w:tc>
-        <w:tc>
-          <w:tcPr>
-            <w:tcW w:w="0" w:type="auto"/>
-            <w:vAlign w:val="center"/>
-          </w:tcPr>
-          <w:p>
-            <w:pPr>
-              <w:bidi w:val="0"/>
-              <w:spacing w:line="240" w:lineRule="auto"/>
-              <w:jc w:val="left"/>
-              <w:rPr>
-                <w:rFonts w:hint="eastAsia" w:ascii="华文中宋" w:hAnsi="华文中宋" w:eastAsia="华文中宋" w:cs="华文中宋"/>
-                <w:b/>
-                <w:bCs/>
-                <w:color w:val="EA82F1"/>
-                <w:sz w:val="21"/>
-                <w:szCs w:val="24"/>
-                <w:lang w:val="en-US" w:eastAsia="zh-CN"/>
-              </w:rPr>
-            </w:pPr>
-            <w:r>
-              <w:rPr>
-                <w:rFonts w:hint="eastAsia" w:ascii="华文中宋" w:hAnsi="华文中宋" w:eastAsia="华文中宋" w:cs="华文中宋"/>
-                <w:b/>
-                <w:bCs/>
-                <w:color w:val="ED7D31" w:themeColor="accent2"/>
-                <w:spacing w:val="0"/>
-                <w:sz w:val="21"/>
-                <w:szCs w:val="24"/>
-                <w:vertAlign w:val="baseline"/>
-                <w:lang w:val="en-US" w:eastAsia="zh-CN"/>
-                <w14:textFill>
-                  <w14:solidFill>
-                    <w14:schemeClr w14:val="accent2"/>
-                  </w14:solidFill>
-                </w14:textFill>
-              </w:rPr>
-              <w:t>文件</w:t>
             </w:r>
           </w:p>
         </w:tc>
@@ -6619,6 +6477,184 @@
           <w:tcPr>
             <w:tcW w:w="0" w:type="auto"/>
             <w:vMerge w:val="continue"/>
+            <w:tcBorders/>
+            <w:vAlign w:val="center"/>
+          </w:tcPr>
+          <w:p>
+            <w:pPr>
+              <w:bidi w:val="0"/>
+              <w:spacing w:line="240" w:lineRule="auto"/>
+              <w:jc w:val="left"/>
+              <w:rPr>
+                <w:rFonts w:hint="eastAsia" w:ascii="华文中宋" w:hAnsi="华文中宋" w:eastAsia="华文中宋" w:cs="华文中宋"/>
+                <w:b/>
+                <w:bCs/>
+                <w:color w:val="ED7D31" w:themeColor="accent2"/>
+                <w:spacing w:val="0"/>
+                <w:sz w:val="21"/>
+                <w:szCs w:val="24"/>
+                <w:vertAlign w:val="baseline"/>
+                <w:lang w:val="en-US" w:eastAsia="zh-CN"/>
+                <w14:textFill>
+                  <w14:solidFill>
+                    <w14:schemeClr w14:val="accent2"/>
+                  </w14:solidFill>
+                </w14:textFill>
+              </w:rPr>
+            </w:pPr>
+          </w:p>
+        </w:tc>
+        <w:tc>
+          <w:tcPr>
+            <w:tcW w:w="0" w:type="auto"/>
+            <w:vAlign w:val="center"/>
+          </w:tcPr>
+          <w:p>
+            <w:pPr>
+              <w:bidi w:val="0"/>
+              <w:spacing w:line="240" w:lineRule="auto"/>
+              <w:jc w:val="left"/>
+              <w:rPr>
+                <w:rFonts w:hint="default" w:ascii="华文中宋" w:hAnsi="华文中宋" w:eastAsia="华文中宋" w:cs="华文中宋"/>
+                <w:b/>
+                <w:bCs/>
+                <w:color w:val="ED7D31" w:themeColor="accent2"/>
+                <w:spacing w:val="0"/>
+                <w:kern w:val="2"/>
+                <w:sz w:val="21"/>
+                <w:szCs w:val="24"/>
+                <w:vertAlign w:val="baseline"/>
+                <w:lang w:val="en-US" w:eastAsia="zh-CN" w:bidi="ar-SA"/>
+                <w14:textFill>
+                  <w14:solidFill>
+                    <w14:schemeClr w14:val="accent2"/>
+                  </w14:solidFill>
+                </w14:textFill>
+              </w:rPr>
+            </w:pPr>
+            <w:r>
+              <w:rPr>
+                <w:rFonts w:hint="eastAsia" w:ascii="华文中宋" w:hAnsi="华文中宋" w:eastAsia="华文中宋" w:cs="华文中宋"/>
+                <w:b/>
+                <w:bCs/>
+                <w:color w:val="FF0000"/>
+                <w:spacing w:val="0"/>
+                <w:sz w:val="21"/>
+                <w:szCs w:val="24"/>
+                <w:vertAlign w:val="baseline"/>
+                <w:lang w:val="en-US" w:eastAsia="zh-CN"/>
+              </w:rPr>
+              <w:t>cp &lt;old&gt; &lt;new&gt;</w:t>
+            </w:r>
+          </w:p>
+        </w:tc>
+        <w:tc>
+          <w:tcPr>
+            <w:tcW w:w="0" w:type="auto"/>
+            <w:vMerge w:val="restart"/>
+            <w:vAlign w:val="center"/>
+          </w:tcPr>
+          <w:p>
+            <w:pPr>
+              <w:bidi w:val="0"/>
+              <w:spacing w:line="240" w:lineRule="auto"/>
+              <w:jc w:val="left"/>
+              <w:rPr>
+                <w:rFonts w:hint="eastAsia" w:ascii="华文中宋" w:hAnsi="华文中宋" w:eastAsia="华文中宋" w:cs="华文中宋"/>
+                <w:b/>
+                <w:bCs/>
+                <w:color w:val="ED7D31" w:themeColor="accent2"/>
+                <w:spacing w:val="0"/>
+                <w:kern w:val="2"/>
+                <w:sz w:val="21"/>
+                <w:szCs w:val="24"/>
+                <w:vertAlign w:val="baseline"/>
+                <w:lang w:val="en-US" w:eastAsia="zh-CN" w:bidi="ar-SA"/>
+                <w14:textFill>
+                  <w14:solidFill>
+                    <w14:schemeClr w14:val="accent2"/>
+                  </w14:solidFill>
+                </w14:textFill>
+              </w:rPr>
+            </w:pPr>
+            <w:r>
+              <w:rPr>
+                <w:rFonts w:hint="eastAsia" w:ascii="华文中宋" w:hAnsi="华文中宋" w:eastAsia="华文中宋" w:cs="华文中宋"/>
+                <w:b/>
+                <w:bCs/>
+                <w:color w:val="EA82F1"/>
+                <w:sz w:val="21"/>
+                <w:szCs w:val="24"/>
+                <w:lang w:val="en-US" w:eastAsia="zh-CN"/>
+              </w:rPr>
+              <w:t>拷贝</w:t>
+            </w:r>
+          </w:p>
+        </w:tc>
+        <w:tc>
+          <w:tcPr>
+            <w:tcW w:w="0" w:type="auto"/>
+            <w:vAlign w:val="center"/>
+          </w:tcPr>
+          <w:p>
+            <w:pPr>
+              <w:bidi w:val="0"/>
+              <w:spacing w:line="240" w:lineRule="auto"/>
+              <w:jc w:val="left"/>
+              <w:rPr>
+                <w:rFonts w:hint="eastAsia" w:ascii="华文中宋" w:hAnsi="华文中宋" w:eastAsia="华文中宋" w:cs="华文中宋"/>
+                <w:b/>
+                <w:bCs/>
+                <w:color w:val="EA82F1"/>
+                <w:sz w:val="21"/>
+                <w:szCs w:val="24"/>
+                <w:lang w:val="en-US" w:eastAsia="zh-CN"/>
+              </w:rPr>
+            </w:pPr>
+            <w:r>
+              <w:rPr>
+                <w:rFonts w:hint="eastAsia" w:ascii="华文中宋" w:hAnsi="华文中宋" w:eastAsia="华文中宋" w:cs="华文中宋"/>
+                <w:b/>
+                <w:bCs/>
+                <w:color w:val="ED7D31" w:themeColor="accent2"/>
+                <w:spacing w:val="0"/>
+                <w:sz w:val="21"/>
+                <w:szCs w:val="24"/>
+                <w:vertAlign w:val="baseline"/>
+                <w:lang w:val="en-US" w:eastAsia="zh-CN"/>
+                <w14:textFill>
+                  <w14:solidFill>
+                    <w14:schemeClr w14:val="accent2"/>
+                  </w14:solidFill>
+                </w14:textFill>
+              </w:rPr>
+              <w:t>文件</w:t>
+            </w:r>
+          </w:p>
+        </w:tc>
+      </w:tr>
+      <w:tr>
+        <w:tblPrEx>
+          <w:tblBorders>
+            <w:top w:val="single" w:color="auto" w:sz="4" w:space="0"/>
+            <w:left w:val="single" w:color="auto" w:sz="4" w:space="0"/>
+            <w:bottom w:val="single" w:color="auto" w:sz="4" w:space="0"/>
+            <w:right w:val="single" w:color="auto" w:sz="4" w:space="0"/>
+            <w:insideH w:val="single" w:color="auto" w:sz="4" w:space="0"/>
+            <w:insideV w:val="single" w:color="auto" w:sz="4" w:space="0"/>
+          </w:tblBorders>
+          <w:tblCellMar>
+            <w:top w:w="0" w:type="dxa"/>
+            <w:left w:w="108" w:type="dxa"/>
+            <w:bottom w:w="0" w:type="dxa"/>
+            <w:right w:w="108" w:type="dxa"/>
+          </w:tblCellMar>
+        </w:tblPrEx>
+        <w:tc>
+          <w:tcPr>
+            <w:tcW w:w="0" w:type="auto"/>
+            <w:vMerge w:val="continue"/>
+            <w:tcBorders/>
             <w:vAlign w:val="center"/>
           </w:tcPr>
           <w:p>
@@ -6772,6 +6808,7 @@
           <w:tcPr>
             <w:tcW w:w="0" w:type="auto"/>
             <w:vMerge w:val="continue"/>
+            <w:tcBorders/>
             <w:vAlign w:val="center"/>
           </w:tcPr>
           <w:p>
@@ -6951,6 +6988,7 @@
           <w:tcPr>
             <w:tcW w:w="0" w:type="auto"/>
             <w:vMerge w:val="continue"/>
+            <w:tcBorders/>
             <w:vAlign w:val="center"/>
           </w:tcPr>
           <w:p>
@@ -7092,6 +7130,7 @@
           <w:tcPr>
             <w:tcW w:w="0" w:type="auto"/>
             <w:vMerge w:val="continue"/>
+            <w:tcBorders/>
             <w:vAlign w:val="center"/>
           </w:tcPr>
           <w:p>
@@ -7252,6 +7291,7 @@
           <w:tcPr>
             <w:tcW w:w="0" w:type="auto"/>
             <w:vMerge w:val="continue"/>
+            <w:tcBorders/>
             <w:vAlign w:val="center"/>
           </w:tcPr>
           <w:p>
@@ -7400,6 +7440,7 @@
           <w:tcPr>
             <w:tcW w:w="0" w:type="auto"/>
             <w:vMerge w:val="continue"/>
+            <w:tcBorders/>
             <w:vAlign w:val="center"/>
           </w:tcPr>
           <w:p>
@@ -7565,6 +7606,7 @@
           <w:tcPr>
             <w:tcW w:w="0" w:type="auto"/>
             <w:vMerge w:val="continue"/>
+            <w:tcBorders/>
             <w:vAlign w:val="center"/>
           </w:tcPr>
           <w:p>
@@ -7715,6 +7757,129 @@
               </w:rPr>
               <w:t>文件</w:t>
             </w:r>
+          </w:p>
+        </w:tc>
+      </w:tr>
+      <w:tr>
+        <w:tblPrEx>
+          <w:tblBorders>
+            <w:top w:val="single" w:color="auto" w:sz="4" w:space="0"/>
+            <w:left w:val="single" w:color="auto" w:sz="4" w:space="0"/>
+            <w:bottom w:val="single" w:color="auto" w:sz="4" w:space="0"/>
+            <w:right w:val="single" w:color="auto" w:sz="4" w:space="0"/>
+            <w:insideH w:val="single" w:color="auto" w:sz="4" w:space="0"/>
+            <w:insideV w:val="single" w:color="auto" w:sz="4" w:space="0"/>
+          </w:tblBorders>
+          <w:tblCellMar>
+            <w:top w:w="0" w:type="dxa"/>
+            <w:left w:w="108" w:type="dxa"/>
+            <w:bottom w:w="0" w:type="dxa"/>
+            <w:right w:w="108" w:type="dxa"/>
+          </w:tblCellMar>
+        </w:tblPrEx>
+        <w:tc>
+          <w:tcPr>
+            <w:tcW w:w="0" w:type="auto"/>
+            <w:vMerge w:val="continue"/>
+            <w:tcBorders/>
+            <w:vAlign w:val="center"/>
+          </w:tcPr>
+          <w:p>
+            <w:pPr>
+              <w:bidi w:val="0"/>
+              <w:spacing w:line="240" w:lineRule="auto"/>
+              <w:jc w:val="left"/>
+              <w:rPr>
+                <w:rFonts w:hint="eastAsia" w:ascii="华文中宋" w:hAnsi="华文中宋" w:eastAsia="华文中宋" w:cs="华文中宋"/>
+                <w:b/>
+                <w:bCs/>
+                <w:color w:val="ED7D31" w:themeColor="accent2"/>
+                <w:spacing w:val="0"/>
+                <w:sz w:val="21"/>
+                <w:szCs w:val="24"/>
+                <w:vertAlign w:val="baseline"/>
+                <w:lang w:val="en-US" w:eastAsia="zh-CN"/>
+                <w14:textFill>
+                  <w14:solidFill>
+                    <w14:schemeClr w14:val="accent2"/>
+                  </w14:solidFill>
+                </w14:textFill>
+              </w:rPr>
+            </w:pPr>
+          </w:p>
+        </w:tc>
+        <w:tc>
+          <w:tcPr>
+            <w:tcW w:w="0" w:type="auto"/>
+            <w:vAlign w:val="center"/>
+          </w:tcPr>
+          <w:p>
+            <w:pPr>
+              <w:bidi w:val="0"/>
+              <w:spacing w:line="240" w:lineRule="auto"/>
+              <w:jc w:val="left"/>
+              <w:rPr>
+                <w:rFonts w:hint="default" w:ascii="华文中宋" w:hAnsi="华文中宋" w:eastAsia="华文中宋" w:cs="华文中宋"/>
+                <w:b/>
+                <w:bCs/>
+                <w:color w:val="FF0000"/>
+                <w:spacing w:val="0"/>
+                <w:sz w:val="21"/>
+                <w:szCs w:val="24"/>
+                <w:vertAlign w:val="baseline"/>
+                <w:lang w:val="en-US" w:eastAsia="zh-CN"/>
+              </w:rPr>
+            </w:pPr>
+            <w:r>
+              <w:rPr>
+                <w:rFonts w:hint="eastAsia" w:ascii="华文中宋" w:hAnsi="华文中宋" w:cs="华文中宋"/>
+                <w:b/>
+                <w:bCs/>
+                <w:color w:val="FF0000"/>
+                <w:spacing w:val="0"/>
+                <w:sz w:val="21"/>
+                <w:szCs w:val="24"/>
+                <w:vertAlign w:val="baseline"/>
+                <w:lang w:val="en-US" w:eastAsia="zh-CN"/>
+              </w:rPr>
+              <w:t>rsync -avz &lt;user&gt;@&lt;ip&gt;:&lt;path&gt; &lt;path&gt;</w:t>
+            </w:r>
+          </w:p>
+        </w:tc>
+        <w:tc>
+          <w:tcPr>
+            <w:tcW w:w="0" w:type="auto"/>
+            <w:gridSpan w:val="2"/>
+            <w:vAlign w:val="center"/>
+          </w:tcPr>
+          <w:p>
+            <w:pPr>
+              <w:spacing w:line="240" w:lineRule="auto"/>
+              <w:outlineLvl w:val="9"/>
+              <w:rPr>
+                <w:rFonts w:hint="eastAsia" w:ascii="华文中宋" w:hAnsi="华文中宋" w:eastAsia="华文中宋" w:cs="华文中宋"/>
+                <w:b/>
+                <w:bCs/>
+                <w:color w:val="EA82F1"/>
+                <w:sz w:val="21"/>
+                <w:szCs w:val="24"/>
+                <w:lang w:val="en-US" w:eastAsia="zh-CN"/>
+              </w:rPr>
+            </w:pPr>
+            <w:r>
+              <w:rPr>
+                <w:rFonts w:hint="eastAsia" w:ascii="华文中宋" w:hAnsi="华文中宋" w:cs="华文中宋"/>
+                <w:b/>
+                <w:bCs/>
+                <w:color w:val="EA82F1"/>
+                <w:sz w:val="21"/>
+                <w:szCs w:val="24"/>
+                <w:lang w:val="en-US" w:eastAsia="zh-CN"/>
+              </w:rPr>
+              <w:t>远程同步</w:t>
+            </w:r>
+            <w:bookmarkStart w:id="9" w:name="_GoBack"/>
+            <w:bookmarkEnd w:id="9"/>
           </w:p>
         </w:tc>
       </w:tr>
@@ -14254,6 +14419,12 @@
             <w:insideH w:val="single" w:color="auto" w:sz="4" w:space="0"/>
             <w:insideV w:val="single" w:color="auto" w:sz="4" w:space="0"/>
           </w:tblBorders>
+          <w:tblCellMar>
+            <w:top w:w="0" w:type="dxa"/>
+            <w:left w:w="108" w:type="dxa"/>
+            <w:bottom w:w="0" w:type="dxa"/>
+            <w:right w:w="108" w:type="dxa"/>
+          </w:tblCellMar>
         </w:tblPrEx>
         <w:tc>
           <w:tcPr>
@@ -14669,6 +14840,12 @@
             <w:insideH w:val="single" w:color="auto" w:sz="4" w:space="0"/>
             <w:insideV w:val="single" w:color="auto" w:sz="4" w:space="0"/>
           </w:tblBorders>
+          <w:tblCellMar>
+            <w:top w:w="0" w:type="dxa"/>
+            <w:left w:w="108" w:type="dxa"/>
+            <w:bottom w:w="0" w:type="dxa"/>
+            <w:right w:w="108" w:type="dxa"/>
+          </w:tblCellMar>
         </w:tblPrEx>
         <w:tc>
           <w:tcPr>
@@ -15275,6 +15452,12 @@
             <w:insideH w:val="single" w:color="auto" w:sz="4" w:space="0"/>
             <w:insideV w:val="single" w:color="auto" w:sz="4" w:space="0"/>
           </w:tblBorders>
+          <w:tblCellMar>
+            <w:top w:w="0" w:type="dxa"/>
+            <w:left w:w="108" w:type="dxa"/>
+            <w:bottom w:w="0" w:type="dxa"/>
+            <w:right w:w="108" w:type="dxa"/>
+          </w:tblCellMar>
         </w:tblPrEx>
         <w:tc>
           <w:tcPr>
@@ -17267,8 +17450,8 @@
           </w14:textFill>
         </w:rPr>
       </w:pPr>
-      <w:bookmarkStart w:id="1" w:name="_Toc12901"/>
-      <w:bookmarkStart w:id="2" w:name="_Toc131002735"/>
+      <w:bookmarkStart w:id="1" w:name="_Toc131002735"/>
+      <w:bookmarkStart w:id="2" w:name="_Toc12901"/>
       <w:r>
         <w:rPr>
           <w:rFonts w:hint="eastAsia" w:ascii="华文中宋" w:hAnsi="华文中宋" w:eastAsia="华文中宋" w:cs="华文中宋"/>
@@ -18714,8 +18897,6 @@
         </w:rPr>
         <w:t>git log --pretty=format:"%ad %h %s" --date=short --shortstat</w:t>
       </w:r>
-      <w:bookmarkStart w:id="9" w:name="_GoBack"/>
-      <w:bookmarkEnd w:id="9"/>
     </w:p>
     <w:p>
       <w:pPr>
@@ -29876,6 +30057,12 @@
             <w:insideH w:val="single" w:color="auto" w:sz="4" w:space="0"/>
             <w:insideV w:val="single" w:color="auto" w:sz="4" w:space="0"/>
           </w:tblBorders>
+          <w:tblCellMar>
+            <w:top w:w="0" w:type="dxa"/>
+            <w:left w:w="108" w:type="dxa"/>
+            <w:bottom w:w="0" w:type="dxa"/>
+            <w:right w:w="108" w:type="dxa"/>
+          </w:tblCellMar>
         </w:tblPrEx>
         <w:tc>
           <w:tcPr>
@@ -38026,6 +38213,12 @@
             <w:insideH w:val="single" w:color="auto" w:sz="4" w:space="0"/>
             <w:insideV w:val="single" w:color="auto" w:sz="4" w:space="0"/>
           </w:tblBorders>
+          <w:tblCellMar>
+            <w:top w:w="0" w:type="dxa"/>
+            <w:left w:w="108" w:type="dxa"/>
+            <w:bottom w:w="0" w:type="dxa"/>
+            <w:right w:w="108" w:type="dxa"/>
+          </w:tblCellMar>
         </w:tblPrEx>
         <w:tc>
           <w:tcPr>
@@ -39188,6 +39381,12 @@
             <w:insideH w:val="single" w:color="auto" w:sz="4" w:space="0"/>
             <w:insideV w:val="single" w:color="auto" w:sz="4" w:space="0"/>
           </w:tblBorders>
+          <w:tblCellMar>
+            <w:top w:w="0" w:type="dxa"/>
+            <w:left w:w="108" w:type="dxa"/>
+            <w:bottom w:w="0" w:type="dxa"/>
+            <w:right w:w="108" w:type="dxa"/>
+          </w:tblCellMar>
         </w:tblPrEx>
         <w:tc>
           <w:tcPr>
@@ -42872,6 +43071,12 @@
             <w:insideH w:val="single" w:color="auto" w:sz="4" w:space="0"/>
             <w:insideV w:val="single" w:color="auto" w:sz="4" w:space="0"/>
           </w:tblBorders>
+          <w:tblCellMar>
+            <w:top w:w="0" w:type="dxa"/>
+            <w:left w:w="108" w:type="dxa"/>
+            <w:bottom w:w="0" w:type="dxa"/>
+            <w:right w:w="108" w:type="dxa"/>
+          </w:tblCellMar>
         </w:tblPrEx>
         <w:tc>
           <w:tcPr>
@@ -46995,6 +47200,12 @@
             <w:insideH w:val="single" w:color="auto" w:sz="4" w:space="0"/>
             <w:insideV w:val="single" w:color="auto" w:sz="4" w:space="0"/>
           </w:tblBorders>
+          <w:tblCellMar>
+            <w:top w:w="0" w:type="dxa"/>
+            <w:left w:w="108" w:type="dxa"/>
+            <w:bottom w:w="0" w:type="dxa"/>
+            <w:right w:w="108" w:type="dxa"/>
+          </w:tblCellMar>
         </w:tblPrEx>
         <w:tc>
           <w:tcPr>
@@ -47098,6 +47309,12 @@
             <w:insideH w:val="single" w:color="auto" w:sz="4" w:space="0"/>
             <w:insideV w:val="single" w:color="auto" w:sz="4" w:space="0"/>
           </w:tblBorders>
+          <w:tblCellMar>
+            <w:top w:w="0" w:type="dxa"/>
+            <w:left w:w="108" w:type="dxa"/>
+            <w:bottom w:w="0" w:type="dxa"/>
+            <w:right w:w="108" w:type="dxa"/>
+          </w:tblCellMar>
         </w:tblPrEx>
         <w:tc>
           <w:tcPr>
@@ -47201,6 +47418,12 @@
             <w:insideH w:val="single" w:color="auto" w:sz="4" w:space="0"/>
             <w:insideV w:val="single" w:color="auto" w:sz="4" w:space="0"/>
           </w:tblBorders>
+          <w:tblCellMar>
+            <w:top w:w="0" w:type="dxa"/>
+            <w:left w:w="108" w:type="dxa"/>
+            <w:bottom w:w="0" w:type="dxa"/>
+            <w:right w:w="108" w:type="dxa"/>
+          </w:tblCellMar>
         </w:tblPrEx>
         <w:tc>
           <w:tcPr>

</xml_diff>

<commit_message>
update on 2026-03-12 11:36:58.067757
</commit_message>
<xml_diff>
--- a/cfg - system.docx
+++ b/cfg - system.docx
@@ -2600,6 +2600,25 @@
       <w:bookmarkStart w:id="0" w:name="_Toc23259"/>
       <w:r>
         <w:rPr>
+          <w:rFonts w:hint="eastAsia" w:ascii="华文中宋" w:hAnsi="华文中宋" w:cs="华文中宋"/>
+          <w:b/>
+          <w:bCs/>
+          <w:color w:val="70AD47" w:themeColor="accent6"/>
+          <w:spacing w:val="0"/>
+          <w:sz w:val="21"/>
+          <w:szCs w:val="24"/>
+          <w:vertAlign w:val="baseline"/>
+          <w:lang w:val="en-US" w:eastAsia="zh-CN"/>
+          <w14:textFill>
+            <w14:solidFill>
+              <w14:schemeClr w14:val="accent6"/>
+            </w14:solidFill>
+          </w14:textFill>
+        </w:rPr>
+        <w:t>Ubuntu</w:t>
+      </w:r>
+      <w:r>
+        <w:rPr>
           <w:rFonts w:hint="eastAsia" w:ascii="华文中宋" w:hAnsi="华文中宋" w:eastAsia="华文中宋" w:cs="华文中宋"/>
           <w:b/>
           <w:bCs/>
@@ -2615,7 +2634,7 @@
             </w14:solidFill>
           </w14:textFill>
         </w:rPr>
-        <w:t>Linux：</w:t>
+        <w:t>：</w:t>
       </w:r>
       <w:bookmarkEnd w:id="0"/>
     </w:p>
@@ -2988,410 +3007,6 @@
         </w:tblCellMar>
       </w:tblPr>
       <w:tblGrid>
-        <w:gridCol w:w="1025"/>
-        <w:gridCol w:w="637"/>
-        <w:gridCol w:w="1189"/>
-        <w:gridCol w:w="637"/>
-        <w:gridCol w:w="1286"/>
-        <w:gridCol w:w="637"/>
-      </w:tblGrid>
-      <w:tr>
-        <w:tblPrEx>
-          <w:tblBorders>
-            <w:top w:val="single" w:color="auto" w:sz="4" w:space="0"/>
-            <w:left w:val="single" w:color="auto" w:sz="4" w:space="0"/>
-            <w:bottom w:val="single" w:color="auto" w:sz="4" w:space="0"/>
-            <w:right w:val="single" w:color="auto" w:sz="4" w:space="0"/>
-            <w:insideH w:val="single" w:color="auto" w:sz="4" w:space="0"/>
-            <w:insideV w:val="single" w:color="auto" w:sz="4" w:space="0"/>
-          </w:tblBorders>
-          <w:tblCellMar>
-            <w:top w:w="0" w:type="dxa"/>
-            <w:left w:w="108" w:type="dxa"/>
-            <w:bottom w:w="0" w:type="dxa"/>
-            <w:right w:w="108" w:type="dxa"/>
-          </w:tblCellMar>
-        </w:tblPrEx>
-        <w:tc>
-          <w:tcPr>
-            <w:tcW w:w="0" w:type="auto"/>
-            <w:gridSpan w:val="6"/>
-          </w:tcPr>
-          <w:p>
-            <w:pPr>
-              <w:bidi w:val="0"/>
-              <w:spacing w:line="240" w:lineRule="auto"/>
-              <w:jc w:val="left"/>
-              <w:rPr>
-                <w:rFonts w:hint="eastAsia" w:ascii="华文中宋" w:hAnsi="华文中宋" w:eastAsia="华文中宋" w:cs="华文中宋"/>
-                <w:b/>
-                <w:bCs/>
-                <w:color w:val="ED7D31" w:themeColor="accent2"/>
-                <w:spacing w:val="0"/>
-                <w:sz w:val="21"/>
-                <w:szCs w:val="24"/>
-                <w:vertAlign w:val="baseline"/>
-                <w:lang w:val="en-US" w:eastAsia="zh-CN"/>
-                <w14:textFill>
-                  <w14:solidFill>
-                    <w14:schemeClr w14:val="accent2"/>
-                  </w14:solidFill>
-                </w14:textFill>
-              </w:rPr>
-            </w:pPr>
-            <w:r>
-              <w:rPr>
-                <w:rFonts w:hint="eastAsia" w:ascii="华文中宋" w:hAnsi="华文中宋" w:eastAsia="华文中宋" w:cs="华文中宋"/>
-                <w:b/>
-                <w:bCs/>
-                <w:color w:val="ED7D31" w:themeColor="accent2"/>
-                <w:spacing w:val="0"/>
-                <w:sz w:val="21"/>
-                <w:szCs w:val="24"/>
-                <w:vertAlign w:val="baseline"/>
-                <w:lang w:val="en-US" w:eastAsia="zh-CN"/>
-                <w14:textFill>
-                  <w14:solidFill>
-                    <w14:schemeClr w14:val="accent2"/>
-                  </w14:solidFill>
-                </w14:textFill>
-              </w:rPr>
-              <w:t>Xshell快捷键：</w:t>
-            </w:r>
-          </w:p>
-        </w:tc>
-      </w:tr>
-      <w:tr>
-        <w:tblPrEx>
-          <w:tblBorders>
-            <w:top w:val="single" w:color="auto" w:sz="4" w:space="0"/>
-            <w:left w:val="single" w:color="auto" w:sz="4" w:space="0"/>
-            <w:bottom w:val="single" w:color="auto" w:sz="4" w:space="0"/>
-            <w:right w:val="single" w:color="auto" w:sz="4" w:space="0"/>
-            <w:insideH w:val="single" w:color="auto" w:sz="4" w:space="0"/>
-            <w:insideV w:val="single" w:color="auto" w:sz="4" w:space="0"/>
-          </w:tblBorders>
-          <w:tblCellMar>
-            <w:top w:w="0" w:type="dxa"/>
-            <w:left w:w="108" w:type="dxa"/>
-            <w:bottom w:w="0" w:type="dxa"/>
-            <w:right w:w="108" w:type="dxa"/>
-          </w:tblCellMar>
-        </w:tblPrEx>
-        <w:tc>
-          <w:tcPr>
-            <w:tcW w:w="0" w:type="auto"/>
-          </w:tcPr>
-          <w:p>
-            <w:pPr>
-              <w:bidi w:val="0"/>
-              <w:spacing w:line="240" w:lineRule="auto"/>
-              <w:jc w:val="left"/>
-              <w:rPr>
-                <w:rFonts w:hint="default" w:ascii="华文中宋" w:hAnsi="华文中宋" w:eastAsia="华文中宋" w:cs="华文中宋"/>
-                <w:b/>
-                <w:bCs/>
-                <w:color w:val="ED7D31" w:themeColor="accent2"/>
-                <w:spacing w:val="0"/>
-                <w:sz w:val="21"/>
-                <w:szCs w:val="24"/>
-                <w:vertAlign w:val="baseline"/>
-                <w:lang w:val="en-US" w:eastAsia="zh-CN"/>
-                <w14:textFill>
-                  <w14:solidFill>
-                    <w14:schemeClr w14:val="accent2"/>
-                  </w14:solidFill>
-                </w14:textFill>
-              </w:rPr>
-            </w:pPr>
-            <w:r>
-              <w:rPr>
-                <w:rFonts w:hint="eastAsia" w:ascii="华文中宋" w:hAnsi="华文中宋" w:eastAsia="华文中宋" w:cs="华文中宋"/>
-                <w:b/>
-                <w:bCs/>
-                <w:color w:val="FF0000"/>
-                <w:spacing w:val="0"/>
-                <w:sz w:val="21"/>
-                <w:szCs w:val="24"/>
-                <w:vertAlign w:val="baseline"/>
-                <w:lang w:val="en-US" w:eastAsia="zh-CN"/>
-              </w:rPr>
-              <w:t>Ctrl + C</w:t>
-            </w:r>
-          </w:p>
-        </w:tc>
-        <w:tc>
-          <w:tcPr>
-            <w:tcW w:w="0" w:type="auto"/>
-          </w:tcPr>
-          <w:p>
-            <w:pPr>
-              <w:bidi w:val="0"/>
-              <w:spacing w:line="240" w:lineRule="auto"/>
-              <w:jc w:val="left"/>
-              <w:rPr>
-                <w:rFonts w:hint="default" w:ascii="华文中宋" w:hAnsi="华文中宋" w:eastAsia="华文中宋" w:cs="华文中宋"/>
-                <w:b/>
-                <w:bCs/>
-                <w:color w:val="ED7D31" w:themeColor="accent2"/>
-                <w:spacing w:val="0"/>
-                <w:sz w:val="21"/>
-                <w:szCs w:val="24"/>
-                <w:vertAlign w:val="baseline"/>
-                <w:lang w:val="en-US" w:eastAsia="zh-CN"/>
-                <w14:textFill>
-                  <w14:solidFill>
-                    <w14:schemeClr w14:val="accent2"/>
-                  </w14:solidFill>
-                </w14:textFill>
-              </w:rPr>
-            </w:pPr>
-            <w:r>
-              <w:rPr>
-                <w:rFonts w:hint="eastAsia" w:ascii="华文中宋" w:hAnsi="华文中宋" w:eastAsia="华文中宋" w:cs="华文中宋"/>
-                <w:b/>
-                <w:bCs/>
-                <w:color w:val="ED7D31" w:themeColor="accent2"/>
-                <w:spacing w:val="0"/>
-                <w:sz w:val="21"/>
-                <w:szCs w:val="24"/>
-                <w:vertAlign w:val="baseline"/>
-                <w:lang w:val="en-US" w:eastAsia="zh-CN"/>
-                <w14:textFill>
-                  <w14:solidFill>
-                    <w14:schemeClr w14:val="accent2"/>
-                  </w14:solidFill>
-                </w14:textFill>
-              </w:rPr>
-              <w:t>终止</w:t>
-            </w:r>
-          </w:p>
-        </w:tc>
-        <w:tc>
-          <w:tcPr>
-            <w:tcW w:w="0" w:type="auto"/>
-          </w:tcPr>
-          <w:p>
-            <w:pPr>
-              <w:bidi w:val="0"/>
-              <w:spacing w:line="240" w:lineRule="auto"/>
-              <w:jc w:val="left"/>
-              <w:rPr>
-                <w:rFonts w:hint="default" w:ascii="华文中宋" w:hAnsi="华文中宋" w:eastAsia="华文中宋" w:cs="华文中宋"/>
-                <w:b/>
-                <w:bCs/>
-                <w:color w:val="ED7D31" w:themeColor="accent2"/>
-                <w:spacing w:val="0"/>
-                <w:sz w:val="21"/>
-                <w:szCs w:val="24"/>
-                <w:vertAlign w:val="baseline"/>
-                <w:lang w:val="en-US" w:eastAsia="zh-CN"/>
-                <w14:textFill>
-                  <w14:solidFill>
-                    <w14:schemeClr w14:val="accent2"/>
-                  </w14:solidFill>
-                </w14:textFill>
-              </w:rPr>
-            </w:pPr>
-            <w:r>
-              <w:rPr>
-                <w:rFonts w:hint="eastAsia" w:ascii="华文中宋" w:hAnsi="华文中宋" w:eastAsia="华文中宋" w:cs="华文中宋"/>
-                <w:b/>
-                <w:bCs/>
-                <w:color w:val="FF0000"/>
-                <w:spacing w:val="0"/>
-                <w:sz w:val="21"/>
-                <w:szCs w:val="24"/>
-                <w:vertAlign w:val="baseline"/>
-                <w:lang w:val="en-US" w:eastAsia="zh-CN"/>
-              </w:rPr>
-              <w:t>Ctrl + Ins</w:t>
-            </w:r>
-          </w:p>
-        </w:tc>
-        <w:tc>
-          <w:tcPr>
-            <w:tcW w:w="0" w:type="auto"/>
-          </w:tcPr>
-          <w:p>
-            <w:pPr>
-              <w:bidi w:val="0"/>
-              <w:spacing w:line="240" w:lineRule="auto"/>
-              <w:jc w:val="left"/>
-              <w:rPr>
-                <w:rFonts w:hint="default" w:ascii="华文中宋" w:hAnsi="华文中宋" w:eastAsia="华文中宋" w:cs="华文中宋"/>
-                <w:b/>
-                <w:bCs/>
-                <w:color w:val="ED7D31" w:themeColor="accent2"/>
-                <w:spacing w:val="0"/>
-                <w:sz w:val="21"/>
-                <w:szCs w:val="24"/>
-                <w:vertAlign w:val="baseline"/>
-                <w:lang w:val="en-US" w:eastAsia="zh-CN"/>
-                <w14:textFill>
-                  <w14:solidFill>
-                    <w14:schemeClr w14:val="accent2"/>
-                  </w14:solidFill>
-                </w14:textFill>
-              </w:rPr>
-            </w:pPr>
-            <w:r>
-              <w:rPr>
-                <w:rFonts w:hint="eastAsia" w:ascii="华文中宋" w:hAnsi="华文中宋" w:eastAsia="华文中宋" w:cs="华文中宋"/>
-                <w:b/>
-                <w:bCs/>
-                <w:color w:val="ED7D31" w:themeColor="accent2"/>
-                <w:spacing w:val="0"/>
-                <w:sz w:val="21"/>
-                <w:szCs w:val="24"/>
-                <w:vertAlign w:val="baseline"/>
-                <w:lang w:val="en-US" w:eastAsia="zh-CN"/>
-                <w14:textFill>
-                  <w14:solidFill>
-                    <w14:schemeClr w14:val="accent2"/>
-                  </w14:solidFill>
-                </w14:textFill>
-              </w:rPr>
-              <w:t>复制</w:t>
-            </w:r>
-          </w:p>
-        </w:tc>
-        <w:tc>
-          <w:tcPr>
-            <w:tcW w:w="0" w:type="auto"/>
-          </w:tcPr>
-          <w:p>
-            <w:pPr>
-              <w:bidi w:val="0"/>
-              <w:spacing w:line="240" w:lineRule="auto"/>
-              <w:jc w:val="left"/>
-              <w:rPr>
-                <w:rFonts w:hint="default" w:ascii="华文中宋" w:hAnsi="华文中宋" w:eastAsia="华文中宋" w:cs="华文中宋"/>
-                <w:b/>
-                <w:bCs/>
-                <w:color w:val="ED7D31" w:themeColor="accent2"/>
-                <w:spacing w:val="0"/>
-                <w:sz w:val="21"/>
-                <w:szCs w:val="24"/>
-                <w:vertAlign w:val="baseline"/>
-                <w:lang w:val="en-US" w:eastAsia="zh-CN"/>
-                <w14:textFill>
-                  <w14:solidFill>
-                    <w14:schemeClr w14:val="accent2"/>
-                  </w14:solidFill>
-                </w14:textFill>
-              </w:rPr>
-            </w:pPr>
-            <w:r>
-              <w:rPr>
-                <w:rFonts w:hint="eastAsia" w:ascii="华文中宋" w:hAnsi="华文中宋" w:eastAsia="华文中宋" w:cs="华文中宋"/>
-                <w:b/>
-                <w:bCs/>
-                <w:color w:val="FF0000"/>
-                <w:spacing w:val="0"/>
-                <w:sz w:val="21"/>
-                <w:szCs w:val="24"/>
-                <w:vertAlign w:val="baseline"/>
-                <w:lang w:val="en-US" w:eastAsia="zh-CN"/>
-              </w:rPr>
-              <w:t>Shift + Ins</w:t>
-            </w:r>
-          </w:p>
-        </w:tc>
-        <w:tc>
-          <w:tcPr>
-            <w:tcW w:w="0" w:type="auto"/>
-          </w:tcPr>
-          <w:p>
-            <w:pPr>
-              <w:bidi w:val="0"/>
-              <w:spacing w:line="240" w:lineRule="auto"/>
-              <w:jc w:val="left"/>
-              <w:rPr>
-                <w:rFonts w:hint="default" w:ascii="华文中宋" w:hAnsi="华文中宋" w:eastAsia="华文中宋" w:cs="华文中宋"/>
-                <w:b/>
-                <w:bCs/>
-                <w:color w:val="ED7D31" w:themeColor="accent2"/>
-                <w:spacing w:val="0"/>
-                <w:sz w:val="21"/>
-                <w:szCs w:val="24"/>
-                <w:vertAlign w:val="baseline"/>
-                <w:lang w:val="en-US" w:eastAsia="zh-CN"/>
-                <w14:textFill>
-                  <w14:solidFill>
-                    <w14:schemeClr w14:val="accent2"/>
-                  </w14:solidFill>
-                </w14:textFill>
-              </w:rPr>
-            </w:pPr>
-            <w:r>
-              <w:rPr>
-                <w:rFonts w:hint="eastAsia" w:ascii="华文中宋" w:hAnsi="华文中宋" w:eastAsia="华文中宋" w:cs="华文中宋"/>
-                <w:b/>
-                <w:bCs/>
-                <w:color w:val="ED7D31" w:themeColor="accent2"/>
-                <w:spacing w:val="0"/>
-                <w:sz w:val="21"/>
-                <w:szCs w:val="24"/>
-                <w:vertAlign w:val="baseline"/>
-                <w:lang w:val="en-US" w:eastAsia="zh-CN"/>
-                <w14:textFill>
-                  <w14:solidFill>
-                    <w14:schemeClr w14:val="accent2"/>
-                  </w14:solidFill>
-                </w14:textFill>
-              </w:rPr>
-              <w:t>粘贴</w:t>
-            </w:r>
-          </w:p>
-        </w:tc>
-      </w:tr>
-    </w:tbl>
-    <w:p>
-      <w:pPr>
-        <w:bidi w:val="0"/>
-        <w:spacing w:line="240" w:lineRule="auto"/>
-        <w:jc w:val="left"/>
-        <w:rPr>
-          <w:rFonts w:hint="default" w:ascii="华文中宋" w:hAnsi="华文中宋" w:eastAsia="华文中宋" w:cs="华文中宋"/>
-          <w:b/>
-          <w:bCs/>
-          <w:color w:val="ED7D31" w:themeColor="accent2"/>
-          <w:spacing w:val="0"/>
-          <w:sz w:val="21"/>
-          <w:szCs w:val="24"/>
-          <w:vertAlign w:val="baseline"/>
-          <w:lang w:val="en-US" w:eastAsia="zh-CN"/>
-          <w14:textFill>
-            <w14:solidFill>
-              <w14:schemeClr w14:val="accent2"/>
-            </w14:solidFill>
-          </w14:textFill>
-        </w:rPr>
-      </w:pPr>
-    </w:p>
-    <w:tbl>
-      <w:tblPr>
-        <w:tblStyle w:val="7"/>
-        <w:tblW w:w="0" w:type="auto"/>
-        <w:tblInd w:w="0" w:type="dxa"/>
-        <w:tblBorders>
-          <w:top w:val="single" w:color="auto" w:sz="4" w:space="0"/>
-          <w:left w:val="single" w:color="auto" w:sz="4" w:space="0"/>
-          <w:bottom w:val="single" w:color="auto" w:sz="4" w:space="0"/>
-          <w:right w:val="single" w:color="auto" w:sz="4" w:space="0"/>
-          <w:insideH w:val="single" w:color="auto" w:sz="4" w:space="0"/>
-          <w:insideV w:val="single" w:color="auto" w:sz="4" w:space="0"/>
-        </w:tblBorders>
-        <w:tblLayout w:type="autofit"/>
-        <w:tblCellMar>
-          <w:top w:w="0" w:type="dxa"/>
-          <w:left w:w="108" w:type="dxa"/>
-          <w:bottom w:w="0" w:type="dxa"/>
-          <w:right w:w="108" w:type="dxa"/>
-        </w:tblCellMar>
-      </w:tblPr>
-      <w:tblGrid>
         <w:gridCol w:w="637"/>
         <w:gridCol w:w="6025"/>
         <w:gridCol w:w="784"/>
@@ -4164,6 +3779,12 @@
             <w:insideH w:val="single" w:color="auto" w:sz="4" w:space="0"/>
             <w:insideV w:val="single" w:color="auto" w:sz="4" w:space="0"/>
           </w:tblBorders>
+          <w:tblCellMar>
+            <w:top w:w="0" w:type="dxa"/>
+            <w:left w:w="108" w:type="dxa"/>
+            <w:bottom w:w="0" w:type="dxa"/>
+            <w:right w:w="108" w:type="dxa"/>
+          </w:tblCellMar>
         </w:tblPrEx>
         <w:tc>
           <w:tcPr>
@@ -5771,7 +5392,6 @@
           <w:tcPr>
             <w:tcW w:w="0" w:type="auto"/>
             <w:vMerge w:val="continue"/>
-            <w:tcBorders/>
             <w:vAlign w:val="center"/>
           </w:tcPr>
           <w:p>
@@ -5920,7 +5540,6 @@
           <w:tcPr>
             <w:tcW w:w="0" w:type="auto"/>
             <w:vMerge w:val="continue"/>
-            <w:tcBorders/>
             <w:vAlign w:val="center"/>
           </w:tcPr>
           <w:p>
@@ -6080,7 +5699,6 @@
           <w:tcPr>
             <w:tcW w:w="0" w:type="auto"/>
             <w:vMerge w:val="continue"/>
-            <w:tcBorders/>
             <w:vAlign w:val="center"/>
           </w:tcPr>
           <w:p>
@@ -6190,7 +5808,6 @@
           <w:tcPr>
             <w:tcW w:w="0" w:type="auto"/>
             <w:vMerge w:val="continue"/>
-            <w:tcBorders/>
             <w:vAlign w:val="center"/>
           </w:tcPr>
           <w:p>
@@ -6337,7 +5954,6 @@
           <w:tcPr>
             <w:tcW w:w="0" w:type="auto"/>
             <w:vMerge w:val="continue"/>
-            <w:tcBorders/>
             <w:vAlign w:val="center"/>
           </w:tcPr>
           <w:p>
@@ -6477,7 +6093,6 @@
           <w:tcPr>
             <w:tcW w:w="0" w:type="auto"/>
             <w:vMerge w:val="continue"/>
-            <w:tcBorders/>
             <w:vAlign w:val="center"/>
           </w:tcPr>
           <w:p>
@@ -6654,7 +6269,6 @@
           <w:tcPr>
             <w:tcW w:w="0" w:type="auto"/>
             <w:vMerge w:val="continue"/>
-            <w:tcBorders/>
             <w:vAlign w:val="center"/>
           </w:tcPr>
           <w:p>
@@ -6808,7 +6422,6 @@
           <w:tcPr>
             <w:tcW w:w="0" w:type="auto"/>
             <w:vMerge w:val="continue"/>
-            <w:tcBorders/>
             <w:vAlign w:val="center"/>
           </w:tcPr>
           <w:p>
@@ -6988,7 +6601,6 @@
           <w:tcPr>
             <w:tcW w:w="0" w:type="auto"/>
             <w:vMerge w:val="continue"/>
-            <w:tcBorders/>
             <w:vAlign w:val="center"/>
           </w:tcPr>
           <w:p>
@@ -7130,7 +6742,6 @@
           <w:tcPr>
             <w:tcW w:w="0" w:type="auto"/>
             <w:vMerge w:val="continue"/>
-            <w:tcBorders/>
             <w:vAlign w:val="center"/>
           </w:tcPr>
           <w:p>
@@ -7291,7 +6902,6 @@
           <w:tcPr>
             <w:tcW w:w="0" w:type="auto"/>
             <w:vMerge w:val="continue"/>
-            <w:tcBorders/>
             <w:vAlign w:val="center"/>
           </w:tcPr>
           <w:p>
@@ -7440,7 +7050,6 @@
           <w:tcPr>
             <w:tcW w:w="0" w:type="auto"/>
             <w:vMerge w:val="continue"/>
-            <w:tcBorders/>
             <w:vAlign w:val="center"/>
           </w:tcPr>
           <w:p>
@@ -7606,7 +7215,6 @@
           <w:tcPr>
             <w:tcW w:w="0" w:type="auto"/>
             <w:vMerge w:val="continue"/>
-            <w:tcBorders/>
             <w:vAlign w:val="center"/>
           </w:tcPr>
           <w:p>
@@ -7781,7 +7389,6 @@
           <w:tcPr>
             <w:tcW w:w="0" w:type="auto"/>
             <w:vMerge w:val="continue"/>
-            <w:tcBorders/>
             <w:vAlign w:val="center"/>
           </w:tcPr>
           <w:p>
@@ -7878,8 +7485,6 @@
               </w:rPr>
               <w:t>远程同步</w:t>
             </w:r>
-            <w:bookmarkStart w:id="9" w:name="_GoBack"/>
-            <w:bookmarkEnd w:id="9"/>
           </w:p>
         </w:tc>
       </w:tr>
@@ -13170,6 +12775,12 @@
             <w:insideH w:val="single" w:color="auto" w:sz="4" w:space="0"/>
             <w:insideV w:val="single" w:color="auto" w:sz="4" w:space="0"/>
           </w:tblBorders>
+          <w:tblCellMar>
+            <w:top w:w="0" w:type="dxa"/>
+            <w:left w:w="108" w:type="dxa"/>
+            <w:bottom w:w="0" w:type="dxa"/>
+            <w:right w:w="108" w:type="dxa"/>
+          </w:tblCellMar>
         </w:tblPrEx>
         <w:tc>
           <w:tcPr>
@@ -14994,6 +14605,12 @@
             <w:insideH w:val="single" w:color="auto" w:sz="4" w:space="0"/>
             <w:insideV w:val="single" w:color="auto" w:sz="4" w:space="0"/>
           </w:tblBorders>
+          <w:tblCellMar>
+            <w:top w:w="0" w:type="dxa"/>
+            <w:left w:w="108" w:type="dxa"/>
+            <w:bottom w:w="0" w:type="dxa"/>
+            <w:right w:w="108" w:type="dxa"/>
+          </w:tblCellMar>
         </w:tblPrEx>
         <w:tc>
           <w:tcPr>
@@ -17353,6 +16970,1483 @@
                 </w14:textFill>
               </w:rPr>
               <w:t>文件夹</w:t>
+            </w:r>
+          </w:p>
+        </w:tc>
+      </w:tr>
+    </w:tbl>
+    <w:p>
+      <w:pPr>
+        <w:bidi w:val="0"/>
+        <w:spacing w:line="240" w:lineRule="auto"/>
+        <w:jc w:val="left"/>
+        <w:rPr>
+          <w:rFonts w:hint="eastAsia" w:ascii="华文中宋" w:hAnsi="华文中宋" w:eastAsia="华文中宋" w:cs="华文中宋"/>
+          <w:b/>
+          <w:bCs/>
+          <w:color w:val="ED7D31" w:themeColor="accent2"/>
+          <w:spacing w:val="0"/>
+          <w:sz w:val="21"/>
+          <w:szCs w:val="24"/>
+          <w:vertAlign w:val="baseline"/>
+          <w:lang w:val="en-US" w:eastAsia="zh-CN"/>
+          <w14:textFill>
+            <w14:solidFill>
+              <w14:schemeClr w14:val="accent2"/>
+            </w14:solidFill>
+          </w14:textFill>
+        </w:rPr>
+      </w:pPr>
+    </w:p>
+    <w:tbl>
+      <w:tblPr>
+        <w:tblStyle w:val="7"/>
+        <w:tblW w:w="0" w:type="auto"/>
+        <w:tblInd w:w="0" w:type="dxa"/>
+        <w:tblBorders>
+          <w:top w:val="single" w:color="auto" w:sz="4" w:space="0"/>
+          <w:left w:val="single" w:color="auto" w:sz="4" w:space="0"/>
+          <w:bottom w:val="single" w:color="auto" w:sz="4" w:space="0"/>
+          <w:right w:val="single" w:color="auto" w:sz="4" w:space="0"/>
+          <w:insideH w:val="single" w:color="auto" w:sz="4" w:space="0"/>
+          <w:insideV w:val="single" w:color="auto" w:sz="4" w:space="0"/>
+        </w:tblBorders>
+        <w:tblLayout w:type="autofit"/>
+        <w:tblCellMar>
+          <w:top w:w="0" w:type="dxa"/>
+          <w:left w:w="108" w:type="dxa"/>
+          <w:bottom w:w="0" w:type="dxa"/>
+          <w:right w:w="108" w:type="dxa"/>
+        </w:tblCellMar>
+      </w:tblPr>
+      <w:tblGrid>
+        <w:gridCol w:w="654"/>
+        <w:gridCol w:w="3588"/>
+        <w:gridCol w:w="1786"/>
+      </w:tblGrid>
+      <w:tr>
+        <w:tblPrEx>
+          <w:tblBorders>
+            <w:top w:val="single" w:color="auto" w:sz="4" w:space="0"/>
+            <w:left w:val="single" w:color="auto" w:sz="4" w:space="0"/>
+            <w:bottom w:val="single" w:color="auto" w:sz="4" w:space="0"/>
+            <w:right w:val="single" w:color="auto" w:sz="4" w:space="0"/>
+            <w:insideH w:val="single" w:color="auto" w:sz="4" w:space="0"/>
+            <w:insideV w:val="single" w:color="auto" w:sz="4" w:space="0"/>
+          </w:tblBorders>
+          <w:tblCellMar>
+            <w:top w:w="0" w:type="dxa"/>
+            <w:left w:w="108" w:type="dxa"/>
+            <w:bottom w:w="0" w:type="dxa"/>
+            <w:right w:w="108" w:type="dxa"/>
+          </w:tblCellMar>
+        </w:tblPrEx>
+        <w:tc>
+          <w:tcPr>
+            <w:tcW w:w="6028" w:type="dxa"/>
+            <w:gridSpan w:val="3"/>
+            <w:vAlign w:val="center"/>
+          </w:tcPr>
+          <w:p>
+            <w:pPr>
+              <w:bidi w:val="0"/>
+              <w:spacing w:line="240" w:lineRule="auto"/>
+              <w:jc w:val="both"/>
+              <w:rPr>
+                <w:rFonts w:hint="default" w:ascii="华文中宋" w:hAnsi="华文中宋" w:cs="华文中宋"/>
+                <w:b/>
+                <w:bCs/>
+                <w:color w:val="ED7D31" w:themeColor="accent2"/>
+                <w:spacing w:val="0"/>
+                <w:sz w:val="21"/>
+                <w:szCs w:val="24"/>
+                <w:vertAlign w:val="baseline"/>
+                <w:lang w:val="en-US" w:eastAsia="zh-CN"/>
+                <w14:textFill>
+                  <w14:solidFill>
+                    <w14:schemeClr w14:val="accent2"/>
+                  </w14:solidFill>
+                </w14:textFill>
+              </w:rPr>
+            </w:pPr>
+            <w:r>
+              <w:rPr>
+                <w:rFonts w:hint="eastAsia" w:ascii="华文中宋" w:hAnsi="华文中宋" w:cs="华文中宋"/>
+                <w:b/>
+                <w:bCs/>
+                <w:color w:val="ED7D31" w:themeColor="accent2"/>
+                <w:spacing w:val="0"/>
+                <w:sz w:val="21"/>
+                <w:szCs w:val="24"/>
+                <w:vertAlign w:val="baseline"/>
+                <w:lang w:val="en-US" w:eastAsia="zh-CN"/>
+                <w14:textFill>
+                  <w14:solidFill>
+                    <w14:schemeClr w14:val="accent2"/>
+                  </w14:solidFill>
+                </w14:textFill>
+              </w:rPr>
+              <w:t>wsl：</w:t>
+            </w:r>
+          </w:p>
+        </w:tc>
+      </w:tr>
+      <w:tr>
+        <w:tblPrEx>
+          <w:tblBorders>
+            <w:top w:val="single" w:color="auto" w:sz="4" w:space="0"/>
+            <w:left w:val="single" w:color="auto" w:sz="4" w:space="0"/>
+            <w:bottom w:val="single" w:color="auto" w:sz="4" w:space="0"/>
+            <w:right w:val="single" w:color="auto" w:sz="4" w:space="0"/>
+            <w:insideH w:val="single" w:color="auto" w:sz="4" w:space="0"/>
+            <w:insideV w:val="single" w:color="auto" w:sz="4" w:space="0"/>
+          </w:tblBorders>
+          <w:tblCellMar>
+            <w:top w:w="0" w:type="dxa"/>
+            <w:left w:w="108" w:type="dxa"/>
+            <w:bottom w:w="0" w:type="dxa"/>
+            <w:right w:w="108" w:type="dxa"/>
+          </w:tblCellMar>
+        </w:tblPrEx>
+        <w:tc>
+          <w:tcPr>
+            <w:tcW w:w="654" w:type="dxa"/>
+            <w:vMerge w:val="restart"/>
+            <w:shd w:val="clear" w:color="auto" w:fill="auto"/>
+            <w:vAlign w:val="center"/>
+          </w:tcPr>
+          <w:p>
+            <w:pPr>
+              <w:bidi w:val="0"/>
+              <w:spacing w:line="240" w:lineRule="auto"/>
+              <w:jc w:val="both"/>
+              <w:rPr>
+                <w:rFonts w:hint="eastAsia" w:ascii="华文中宋" w:hAnsi="华文中宋" w:eastAsia="华文中宋" w:cs="华文中宋"/>
+                <w:b/>
+                <w:bCs/>
+                <w:color w:val="ED7D31" w:themeColor="accent2"/>
+                <w:spacing w:val="0"/>
+                <w:kern w:val="2"/>
+                <w:sz w:val="21"/>
+                <w:szCs w:val="24"/>
+                <w:vertAlign w:val="baseline"/>
+                <w:lang w:val="en-US" w:eastAsia="zh-CN" w:bidi="ar-SA"/>
+                <w14:textFill>
+                  <w14:solidFill>
+                    <w14:schemeClr w14:val="accent2"/>
+                  </w14:solidFill>
+                </w14:textFill>
+              </w:rPr>
+            </w:pPr>
+            <w:r>
+              <w:rPr>
+                <w:rFonts w:hint="eastAsia" w:ascii="华文中宋" w:hAnsi="华文中宋" w:cs="华文中宋"/>
+                <w:b/>
+                <w:bCs/>
+                <w:color w:val="ED7D31" w:themeColor="accent2"/>
+                <w:spacing w:val="0"/>
+                <w:sz w:val="21"/>
+                <w:szCs w:val="24"/>
+                <w:vertAlign w:val="baseline"/>
+                <w:lang w:val="en-US" w:eastAsia="zh-CN"/>
+                <w14:textFill>
+                  <w14:solidFill>
+                    <w14:schemeClr w14:val="accent2"/>
+                  </w14:solidFill>
+                </w14:textFill>
+              </w:rPr>
+              <w:t>file</w:t>
+            </w:r>
+          </w:p>
+        </w:tc>
+        <w:tc>
+          <w:tcPr>
+            <w:tcW w:w="0" w:type="auto"/>
+            <w:shd w:val="clear" w:color="auto" w:fill="auto"/>
+            <w:vAlign w:val="center"/>
+          </w:tcPr>
+          <w:p>
+            <w:pPr>
+              <w:bidi w:val="0"/>
+              <w:spacing w:line="240" w:lineRule="auto"/>
+              <w:jc w:val="both"/>
+              <w:rPr>
+                <w:rFonts w:hint="eastAsia" w:ascii="华文中宋" w:hAnsi="华文中宋" w:eastAsia="华文中宋" w:cs="华文中宋"/>
+                <w:b/>
+                <w:bCs/>
+                <w:color w:val="FF0000"/>
+                <w:spacing w:val="0"/>
+                <w:kern w:val="2"/>
+                <w:sz w:val="21"/>
+                <w:szCs w:val="24"/>
+                <w:vertAlign w:val="baseline"/>
+                <w:lang w:val="en-US" w:eastAsia="zh-CN" w:bidi="ar-SA"/>
+              </w:rPr>
+            </w:pPr>
+            <w:r>
+              <w:rPr>
+                <w:rFonts w:hint="eastAsia" w:ascii="华文中宋" w:hAnsi="华文中宋" w:cs="华文中宋"/>
+                <w:b/>
+                <w:bCs/>
+                <w:color w:val="FF0000"/>
+                <w:spacing w:val="0"/>
+                <w:sz w:val="21"/>
+                <w:szCs w:val="24"/>
+                <w:vertAlign w:val="baseline"/>
+                <w:lang w:val="en-US" w:eastAsia="zh-CN"/>
+              </w:rPr>
+              <w:t>/mnt</w:t>
+            </w:r>
+          </w:p>
+        </w:tc>
+        <w:tc>
+          <w:tcPr>
+            <w:tcW w:w="0" w:type="auto"/>
+            <w:shd w:val="clear" w:color="auto" w:fill="auto"/>
+            <w:vAlign w:val="center"/>
+          </w:tcPr>
+          <w:p>
+            <w:pPr>
+              <w:bidi w:val="0"/>
+              <w:spacing w:line="240" w:lineRule="auto"/>
+              <w:jc w:val="both"/>
+              <w:rPr>
+                <w:rFonts w:hint="default" w:ascii="华文中宋" w:hAnsi="华文中宋" w:cs="华文中宋"/>
+                <w:b/>
+                <w:bCs/>
+                <w:color w:val="ED7D31" w:themeColor="accent2"/>
+                <w:spacing w:val="0"/>
+                <w:sz w:val="21"/>
+                <w:szCs w:val="24"/>
+                <w:vertAlign w:val="baseline"/>
+                <w:lang w:val="en-US" w:eastAsia="zh-CN"/>
+                <w14:textFill>
+                  <w14:solidFill>
+                    <w14:schemeClr w14:val="accent2"/>
+                  </w14:solidFill>
+                </w14:textFill>
+              </w:rPr>
+            </w:pPr>
+            <w:r>
+              <w:rPr>
+                <w:rFonts w:hint="eastAsia" w:ascii="华文中宋" w:hAnsi="华文中宋" w:cs="华文中宋"/>
+                <w:b/>
+                <w:bCs/>
+                <w:color w:val="ED7D31" w:themeColor="accent2"/>
+                <w:spacing w:val="0"/>
+                <w:sz w:val="21"/>
+                <w:szCs w:val="24"/>
+                <w:vertAlign w:val="baseline"/>
+                <w:lang w:val="en-US" w:eastAsia="zh-CN"/>
+                <w14:textFill>
+                  <w14:solidFill>
+                    <w14:schemeClr w14:val="accent2"/>
+                  </w14:solidFill>
+                </w14:textFill>
+              </w:rPr>
+              <w:t>linux → win</w:t>
+            </w:r>
+          </w:p>
+        </w:tc>
+      </w:tr>
+      <w:tr>
+        <w:tblPrEx>
+          <w:tblBorders>
+            <w:top w:val="single" w:color="auto" w:sz="4" w:space="0"/>
+            <w:left w:val="single" w:color="auto" w:sz="4" w:space="0"/>
+            <w:bottom w:val="single" w:color="auto" w:sz="4" w:space="0"/>
+            <w:right w:val="single" w:color="auto" w:sz="4" w:space="0"/>
+            <w:insideH w:val="single" w:color="auto" w:sz="4" w:space="0"/>
+            <w:insideV w:val="single" w:color="auto" w:sz="4" w:space="0"/>
+          </w:tblBorders>
+          <w:tblCellMar>
+            <w:top w:w="0" w:type="dxa"/>
+            <w:left w:w="108" w:type="dxa"/>
+            <w:bottom w:w="0" w:type="dxa"/>
+            <w:right w:w="108" w:type="dxa"/>
+          </w:tblCellMar>
+        </w:tblPrEx>
+        <w:tc>
+          <w:tcPr>
+            <w:tcW w:w="654" w:type="dxa"/>
+            <w:vMerge w:val="continue"/>
+            <w:shd w:val="clear" w:color="auto" w:fill="auto"/>
+            <w:vAlign w:val="center"/>
+          </w:tcPr>
+          <w:p>
+            <w:pPr>
+              <w:bidi w:val="0"/>
+              <w:spacing w:line="240" w:lineRule="auto"/>
+              <w:jc w:val="both"/>
+              <w:rPr>
+                <w:rFonts w:hint="eastAsia" w:ascii="华文中宋" w:hAnsi="华文中宋" w:eastAsia="华文中宋" w:cs="华文中宋"/>
+                <w:b/>
+                <w:bCs/>
+                <w:color w:val="ED7D31" w:themeColor="accent2"/>
+                <w:spacing w:val="0"/>
+                <w:kern w:val="2"/>
+                <w:sz w:val="21"/>
+                <w:szCs w:val="24"/>
+                <w:vertAlign w:val="baseline"/>
+                <w:lang w:val="en-US" w:eastAsia="zh-CN" w:bidi="ar-SA"/>
+                <w14:textFill>
+                  <w14:solidFill>
+                    <w14:schemeClr w14:val="accent2"/>
+                  </w14:solidFill>
+                </w14:textFill>
+              </w:rPr>
+            </w:pPr>
+          </w:p>
+        </w:tc>
+        <w:tc>
+          <w:tcPr>
+            <w:tcW w:w="0" w:type="auto"/>
+            <w:shd w:val="clear" w:color="auto" w:fill="auto"/>
+            <w:vAlign w:val="center"/>
+          </w:tcPr>
+          <w:p>
+            <w:pPr>
+              <w:bidi w:val="0"/>
+              <w:spacing w:line="240" w:lineRule="auto"/>
+              <w:jc w:val="both"/>
+              <w:rPr>
+                <w:rFonts w:hint="eastAsia" w:ascii="华文中宋" w:hAnsi="华文中宋" w:eastAsia="华文中宋" w:cs="华文中宋"/>
+                <w:b/>
+                <w:bCs/>
+                <w:color w:val="FF0000"/>
+                <w:spacing w:val="0"/>
+                <w:kern w:val="2"/>
+                <w:sz w:val="21"/>
+                <w:szCs w:val="24"/>
+                <w:vertAlign w:val="baseline"/>
+                <w:lang w:val="en-US" w:eastAsia="zh-CN" w:bidi="ar-SA"/>
+              </w:rPr>
+            </w:pPr>
+            <w:r>
+              <w:rPr>
+                <w:rFonts w:hint="eastAsia" w:ascii="华文中宋" w:hAnsi="华文中宋" w:cs="华文中宋"/>
+                <w:b/>
+                <w:bCs/>
+                <w:color w:val="FF0000"/>
+                <w:spacing w:val="0"/>
+                <w:sz w:val="21"/>
+                <w:szCs w:val="24"/>
+                <w:vertAlign w:val="baseline"/>
+                <w:lang w:val="en-US" w:eastAsia="zh-CN"/>
+              </w:rPr>
+              <w:t>\\wsl.localhost</w:t>
+            </w:r>
+          </w:p>
+        </w:tc>
+        <w:tc>
+          <w:tcPr>
+            <w:tcW w:w="0" w:type="auto"/>
+            <w:shd w:val="clear" w:color="auto" w:fill="auto"/>
+            <w:vAlign w:val="center"/>
+          </w:tcPr>
+          <w:p>
+            <w:pPr>
+              <w:bidi w:val="0"/>
+              <w:spacing w:line="240" w:lineRule="auto"/>
+              <w:jc w:val="both"/>
+              <w:rPr>
+                <w:rFonts w:hint="default" w:ascii="华文中宋" w:hAnsi="华文中宋" w:cs="华文中宋"/>
+                <w:b/>
+                <w:bCs/>
+                <w:color w:val="ED7D31" w:themeColor="accent2"/>
+                <w:spacing w:val="0"/>
+                <w:sz w:val="21"/>
+                <w:szCs w:val="24"/>
+                <w:vertAlign w:val="baseline"/>
+                <w:lang w:val="en-US" w:eastAsia="zh-CN"/>
+                <w14:textFill>
+                  <w14:solidFill>
+                    <w14:schemeClr w14:val="accent2"/>
+                  </w14:solidFill>
+                </w14:textFill>
+              </w:rPr>
+            </w:pPr>
+            <w:r>
+              <w:rPr>
+                <w:rFonts w:hint="eastAsia" w:ascii="华文中宋" w:hAnsi="华文中宋" w:cs="华文中宋"/>
+                <w:b/>
+                <w:bCs/>
+                <w:color w:val="ED7D31" w:themeColor="accent2"/>
+                <w:spacing w:val="0"/>
+                <w:sz w:val="21"/>
+                <w:szCs w:val="24"/>
+                <w:vertAlign w:val="baseline"/>
+                <w:lang w:val="en-US" w:eastAsia="zh-CN"/>
+                <w14:textFill>
+                  <w14:solidFill>
+                    <w14:schemeClr w14:val="accent2"/>
+                  </w14:solidFill>
+                </w14:textFill>
+              </w:rPr>
+              <w:t>win → linux</w:t>
+            </w:r>
+          </w:p>
+        </w:tc>
+      </w:tr>
+      <w:tr>
+        <w:tblPrEx>
+          <w:tblBorders>
+            <w:top w:val="single" w:color="auto" w:sz="4" w:space="0"/>
+            <w:left w:val="single" w:color="auto" w:sz="4" w:space="0"/>
+            <w:bottom w:val="single" w:color="auto" w:sz="4" w:space="0"/>
+            <w:right w:val="single" w:color="auto" w:sz="4" w:space="0"/>
+            <w:insideH w:val="single" w:color="auto" w:sz="4" w:space="0"/>
+            <w:insideV w:val="single" w:color="auto" w:sz="4" w:space="0"/>
+          </w:tblBorders>
+          <w:tblCellMar>
+            <w:top w:w="0" w:type="dxa"/>
+            <w:left w:w="108" w:type="dxa"/>
+            <w:bottom w:w="0" w:type="dxa"/>
+            <w:right w:w="108" w:type="dxa"/>
+          </w:tblCellMar>
+        </w:tblPrEx>
+        <w:tc>
+          <w:tcPr>
+            <w:tcW w:w="654" w:type="dxa"/>
+            <w:vMerge w:val="restart"/>
+            <w:vAlign w:val="center"/>
+          </w:tcPr>
+          <w:p>
+            <w:pPr>
+              <w:bidi w:val="0"/>
+              <w:spacing w:line="240" w:lineRule="auto"/>
+              <w:jc w:val="both"/>
+              <w:rPr>
+                <w:rFonts w:hint="default" w:ascii="华文中宋" w:hAnsi="华文中宋" w:cs="华文中宋"/>
+                <w:b/>
+                <w:bCs/>
+                <w:color w:val="ED7D31" w:themeColor="accent2"/>
+                <w:spacing w:val="0"/>
+                <w:sz w:val="21"/>
+                <w:szCs w:val="24"/>
+                <w:vertAlign w:val="baseline"/>
+                <w:lang w:val="en-US" w:eastAsia="zh-CN"/>
+                <w14:textFill>
+                  <w14:solidFill>
+                    <w14:schemeClr w14:val="accent2"/>
+                  </w14:solidFill>
+                </w14:textFill>
+              </w:rPr>
+            </w:pPr>
+            <w:bookmarkStart w:id="9" w:name="_GoBack" w:colFirst="0" w:colLast="0"/>
+            <w:r>
+              <w:rPr>
+                <w:rFonts w:hint="eastAsia" w:ascii="华文中宋" w:hAnsi="华文中宋" w:cs="华文中宋"/>
+                <w:b/>
+                <w:bCs/>
+                <w:color w:val="ED7D31" w:themeColor="accent2"/>
+                <w:spacing w:val="0"/>
+                <w:sz w:val="21"/>
+                <w:szCs w:val="24"/>
+                <w:vertAlign w:val="baseline"/>
+                <w:lang w:val="en-US" w:eastAsia="zh-CN"/>
+                <w14:textFill>
+                  <w14:solidFill>
+                    <w14:schemeClr w14:val="accent2"/>
+                  </w14:solidFill>
+                </w14:textFill>
+              </w:rPr>
+              <w:t>cmd</w:t>
+            </w:r>
+          </w:p>
+        </w:tc>
+        <w:tc>
+          <w:tcPr>
+            <w:tcW w:w="0" w:type="auto"/>
+            <w:vAlign w:val="center"/>
+          </w:tcPr>
+          <w:p>
+            <w:pPr>
+              <w:bidi w:val="0"/>
+              <w:spacing w:line="240" w:lineRule="auto"/>
+              <w:jc w:val="both"/>
+              <w:rPr>
+                <w:rFonts w:hint="default" w:ascii="华文中宋" w:hAnsi="华文中宋" w:eastAsia="华文中宋" w:cs="华文中宋"/>
+                <w:b/>
+                <w:bCs/>
+                <w:color w:val="ED7D31" w:themeColor="accent2"/>
+                <w:spacing w:val="0"/>
+                <w:sz w:val="21"/>
+                <w:szCs w:val="24"/>
+                <w:vertAlign w:val="baseline"/>
+                <w:lang w:val="en-US" w:eastAsia="zh-CN"/>
+                <w14:textFill>
+                  <w14:solidFill>
+                    <w14:schemeClr w14:val="accent2"/>
+                  </w14:solidFill>
+                </w14:textFill>
+              </w:rPr>
+            </w:pPr>
+            <w:r>
+              <w:rPr>
+                <w:rFonts w:hint="eastAsia" w:ascii="华文中宋" w:hAnsi="华文中宋" w:cs="华文中宋"/>
+                <w:b/>
+                <w:bCs/>
+                <w:color w:val="FF0000"/>
+                <w:spacing w:val="0"/>
+                <w:sz w:val="21"/>
+                <w:szCs w:val="24"/>
+                <w:vertAlign w:val="baseline"/>
+                <w:lang w:val="en-US" w:eastAsia="zh-CN"/>
+              </w:rPr>
+              <w:t xml:space="preserve">winget install Microsoft.WSL </w:t>
+            </w:r>
+          </w:p>
+        </w:tc>
+        <w:tc>
+          <w:tcPr>
+            <w:tcW w:w="0" w:type="auto"/>
+            <w:vAlign w:val="center"/>
+          </w:tcPr>
+          <w:p>
+            <w:pPr>
+              <w:bidi w:val="0"/>
+              <w:spacing w:line="240" w:lineRule="auto"/>
+              <w:jc w:val="both"/>
+              <w:rPr>
+                <w:rFonts w:hint="default" w:ascii="华文中宋" w:hAnsi="华文中宋" w:eastAsia="华文中宋" w:cs="华文中宋"/>
+                <w:b/>
+                <w:bCs/>
+                <w:color w:val="ED7D31" w:themeColor="accent2"/>
+                <w:spacing w:val="0"/>
+                <w:sz w:val="21"/>
+                <w:szCs w:val="24"/>
+                <w:vertAlign w:val="baseline"/>
+                <w:lang w:val="en-US" w:eastAsia="zh-CN"/>
+                <w14:textFill>
+                  <w14:solidFill>
+                    <w14:schemeClr w14:val="accent2"/>
+                  </w14:solidFill>
+                </w14:textFill>
+              </w:rPr>
+            </w:pPr>
+            <w:r>
+              <w:rPr>
+                <w:rFonts w:hint="eastAsia" w:ascii="华文中宋" w:hAnsi="华文中宋" w:cs="华文中宋"/>
+                <w:b/>
+                <w:bCs/>
+                <w:color w:val="ED7D31" w:themeColor="accent2"/>
+                <w:spacing w:val="0"/>
+                <w:sz w:val="21"/>
+                <w:szCs w:val="24"/>
+                <w:vertAlign w:val="baseline"/>
+                <w:lang w:val="en-US" w:eastAsia="zh-CN"/>
+                <w14:textFill>
+                  <w14:solidFill>
+                    <w14:schemeClr w14:val="accent2"/>
+                  </w14:solidFill>
+                </w14:textFill>
+              </w:rPr>
+              <w:t>安装wsl</w:t>
+            </w:r>
+          </w:p>
+        </w:tc>
+      </w:tr>
+      <w:bookmarkEnd w:id="9"/>
+      <w:tr>
+        <w:tblPrEx>
+          <w:tblBorders>
+            <w:top w:val="single" w:color="auto" w:sz="4" w:space="0"/>
+            <w:left w:val="single" w:color="auto" w:sz="4" w:space="0"/>
+            <w:bottom w:val="single" w:color="auto" w:sz="4" w:space="0"/>
+            <w:right w:val="single" w:color="auto" w:sz="4" w:space="0"/>
+            <w:insideH w:val="single" w:color="auto" w:sz="4" w:space="0"/>
+            <w:insideV w:val="single" w:color="auto" w:sz="4" w:space="0"/>
+          </w:tblBorders>
+          <w:tblCellMar>
+            <w:top w:w="0" w:type="dxa"/>
+            <w:left w:w="108" w:type="dxa"/>
+            <w:bottom w:w="0" w:type="dxa"/>
+            <w:right w:w="108" w:type="dxa"/>
+          </w:tblCellMar>
+        </w:tblPrEx>
+        <w:tc>
+          <w:tcPr>
+            <w:tcW w:w="654" w:type="dxa"/>
+            <w:vMerge w:val="continue"/>
+            <w:tcBorders/>
+            <w:vAlign w:val="center"/>
+          </w:tcPr>
+          <w:p>
+            <w:pPr>
+              <w:bidi w:val="0"/>
+              <w:spacing w:line="240" w:lineRule="auto"/>
+              <w:jc w:val="both"/>
+              <w:rPr>
+                <w:rFonts w:hint="eastAsia" w:ascii="华文中宋" w:hAnsi="华文中宋" w:cs="华文中宋"/>
+                <w:b/>
+                <w:bCs/>
+                <w:color w:val="ED7D31" w:themeColor="accent2"/>
+                <w:spacing w:val="0"/>
+                <w:sz w:val="21"/>
+                <w:szCs w:val="24"/>
+                <w:vertAlign w:val="baseline"/>
+                <w:lang w:val="en-US" w:eastAsia="zh-CN"/>
+                <w14:textFill>
+                  <w14:solidFill>
+                    <w14:schemeClr w14:val="accent2"/>
+                  </w14:solidFill>
+                </w14:textFill>
+              </w:rPr>
+            </w:pPr>
+          </w:p>
+        </w:tc>
+        <w:tc>
+          <w:tcPr>
+            <w:tcW w:w="0" w:type="auto"/>
+            <w:vAlign w:val="center"/>
+          </w:tcPr>
+          <w:p>
+            <w:pPr>
+              <w:bidi w:val="0"/>
+              <w:spacing w:line="240" w:lineRule="auto"/>
+              <w:jc w:val="both"/>
+              <w:rPr>
+                <w:rFonts w:hint="default" w:ascii="华文中宋" w:hAnsi="华文中宋" w:cs="华文中宋"/>
+                <w:b/>
+                <w:bCs/>
+                <w:color w:val="FF0000"/>
+                <w:spacing w:val="0"/>
+                <w:sz w:val="21"/>
+                <w:szCs w:val="24"/>
+                <w:vertAlign w:val="baseline"/>
+                <w:lang w:val="en-US" w:eastAsia="zh-CN"/>
+              </w:rPr>
+            </w:pPr>
+            <w:r>
+              <w:rPr>
+                <w:rFonts w:hint="eastAsia" w:ascii="华文中宋" w:hAnsi="华文中宋" w:cs="华文中宋"/>
+                <w:b/>
+                <w:bCs/>
+                <w:color w:val="FF0000"/>
+                <w:spacing w:val="0"/>
+                <w:sz w:val="21"/>
+                <w:szCs w:val="24"/>
+                <w:vertAlign w:val="baseline"/>
+                <w:lang w:val="en-US" w:eastAsia="zh-CN"/>
+              </w:rPr>
+              <w:t>wsl -l -o</w:t>
+            </w:r>
+          </w:p>
+        </w:tc>
+        <w:tc>
+          <w:tcPr>
+            <w:tcW w:w="0" w:type="auto"/>
+            <w:vAlign w:val="center"/>
+          </w:tcPr>
+          <w:p>
+            <w:pPr>
+              <w:bidi w:val="0"/>
+              <w:spacing w:line="240" w:lineRule="auto"/>
+              <w:jc w:val="both"/>
+              <w:rPr>
+                <w:rFonts w:hint="default" w:ascii="华文中宋" w:hAnsi="华文中宋" w:cs="华文中宋"/>
+                <w:b/>
+                <w:bCs/>
+                <w:color w:val="ED7D31" w:themeColor="accent2"/>
+                <w:spacing w:val="0"/>
+                <w:sz w:val="21"/>
+                <w:szCs w:val="24"/>
+                <w:vertAlign w:val="baseline"/>
+                <w:lang w:val="en-US" w:eastAsia="zh-CN"/>
+                <w14:textFill>
+                  <w14:solidFill>
+                    <w14:schemeClr w14:val="accent2"/>
+                  </w14:solidFill>
+                </w14:textFill>
+              </w:rPr>
+            </w:pPr>
+            <w:r>
+              <w:rPr>
+                <w:rFonts w:hint="eastAsia" w:ascii="华文中宋" w:hAnsi="华文中宋" w:eastAsia="华文中宋" w:cs="华文中宋"/>
+                <w:bCs/>
+                <w:color w:val="E182F1"/>
+                <w:spacing w:val="7"/>
+                <w:lang w:val="en-US" w:eastAsia="zh-CN"/>
+              </w:rPr>
+              <w:t>可用的</w:t>
+            </w:r>
+            <w:r>
+              <w:rPr>
+                <w:rFonts w:hint="eastAsia" w:ascii="华文中宋" w:hAnsi="华文中宋" w:cs="华文中宋"/>
+                <w:b/>
+                <w:bCs/>
+                <w:color w:val="ED7D31" w:themeColor="accent2"/>
+                <w:spacing w:val="0"/>
+                <w:sz w:val="21"/>
+                <w:szCs w:val="24"/>
+                <w:vertAlign w:val="baseline"/>
+                <w:lang w:val="en-US" w:eastAsia="zh-CN"/>
+                <w14:textFill>
+                  <w14:solidFill>
+                    <w14:schemeClr w14:val="accent2"/>
+                  </w14:solidFill>
+                </w14:textFill>
+              </w:rPr>
+              <w:t>发行版</w:t>
+            </w:r>
+          </w:p>
+        </w:tc>
+      </w:tr>
+      <w:tr>
+        <w:tblPrEx>
+          <w:tblBorders>
+            <w:top w:val="single" w:color="auto" w:sz="4" w:space="0"/>
+            <w:left w:val="single" w:color="auto" w:sz="4" w:space="0"/>
+            <w:bottom w:val="single" w:color="auto" w:sz="4" w:space="0"/>
+            <w:right w:val="single" w:color="auto" w:sz="4" w:space="0"/>
+            <w:insideH w:val="single" w:color="auto" w:sz="4" w:space="0"/>
+            <w:insideV w:val="single" w:color="auto" w:sz="4" w:space="0"/>
+          </w:tblBorders>
+          <w:tblCellMar>
+            <w:top w:w="0" w:type="dxa"/>
+            <w:left w:w="108" w:type="dxa"/>
+            <w:bottom w:w="0" w:type="dxa"/>
+            <w:right w:w="108" w:type="dxa"/>
+          </w:tblCellMar>
+        </w:tblPrEx>
+        <w:tc>
+          <w:tcPr>
+            <w:tcW w:w="654" w:type="dxa"/>
+            <w:vMerge w:val="continue"/>
+            <w:tcBorders/>
+            <w:vAlign w:val="center"/>
+          </w:tcPr>
+          <w:p>
+            <w:pPr>
+              <w:bidi w:val="0"/>
+              <w:spacing w:line="240" w:lineRule="auto"/>
+              <w:jc w:val="both"/>
+              <w:rPr>
+                <w:rFonts w:hint="eastAsia" w:ascii="华文中宋" w:hAnsi="华文中宋" w:cs="华文中宋"/>
+                <w:b/>
+                <w:bCs/>
+                <w:color w:val="ED7D31" w:themeColor="accent2"/>
+                <w:spacing w:val="0"/>
+                <w:sz w:val="21"/>
+                <w:szCs w:val="24"/>
+                <w:vertAlign w:val="baseline"/>
+                <w:lang w:val="en-US" w:eastAsia="zh-CN"/>
+                <w14:textFill>
+                  <w14:solidFill>
+                    <w14:schemeClr w14:val="accent2"/>
+                  </w14:solidFill>
+                </w14:textFill>
+              </w:rPr>
+            </w:pPr>
+          </w:p>
+        </w:tc>
+        <w:tc>
+          <w:tcPr>
+            <w:tcW w:w="0" w:type="auto"/>
+            <w:vAlign w:val="center"/>
+          </w:tcPr>
+          <w:p>
+            <w:pPr>
+              <w:bidi w:val="0"/>
+              <w:spacing w:line="240" w:lineRule="auto"/>
+              <w:jc w:val="both"/>
+              <w:rPr>
+                <w:rFonts w:hint="default" w:ascii="华文中宋" w:hAnsi="华文中宋" w:cs="华文中宋"/>
+                <w:b/>
+                <w:bCs/>
+                <w:color w:val="FF0000"/>
+                <w:spacing w:val="0"/>
+                <w:sz w:val="21"/>
+                <w:szCs w:val="24"/>
+                <w:vertAlign w:val="baseline"/>
+                <w:lang w:val="en-US" w:eastAsia="zh-CN"/>
+              </w:rPr>
+            </w:pPr>
+            <w:r>
+              <w:rPr>
+                <w:rFonts w:hint="eastAsia" w:ascii="华文中宋" w:hAnsi="华文中宋" w:cs="华文中宋"/>
+                <w:b/>
+                <w:bCs/>
+                <w:color w:val="FF0000"/>
+                <w:spacing w:val="0"/>
+                <w:sz w:val="21"/>
+                <w:szCs w:val="24"/>
+                <w:vertAlign w:val="baseline"/>
+                <w:lang w:val="en-US" w:eastAsia="zh-CN"/>
+              </w:rPr>
+              <w:t>wsl --install -d &lt;name&gt;</w:t>
+            </w:r>
+          </w:p>
+        </w:tc>
+        <w:tc>
+          <w:tcPr>
+            <w:tcW w:w="0" w:type="auto"/>
+            <w:vAlign w:val="center"/>
+          </w:tcPr>
+          <w:p>
+            <w:pPr>
+              <w:bidi w:val="0"/>
+              <w:spacing w:line="240" w:lineRule="auto"/>
+              <w:jc w:val="both"/>
+              <w:rPr>
+                <w:rFonts w:hint="default" w:ascii="华文中宋" w:hAnsi="华文中宋" w:cs="华文中宋"/>
+                <w:b/>
+                <w:bCs/>
+                <w:color w:val="ED7D31" w:themeColor="accent2"/>
+                <w:spacing w:val="0"/>
+                <w:sz w:val="21"/>
+                <w:szCs w:val="24"/>
+                <w:vertAlign w:val="baseline"/>
+                <w:lang w:val="en-US" w:eastAsia="zh-CN"/>
+                <w14:textFill>
+                  <w14:solidFill>
+                    <w14:schemeClr w14:val="accent2"/>
+                  </w14:solidFill>
+                </w14:textFill>
+              </w:rPr>
+            </w:pPr>
+            <w:r>
+              <w:rPr>
+                <w:rFonts w:hint="eastAsia" w:ascii="华文中宋" w:hAnsi="华文中宋" w:eastAsia="华文中宋" w:cs="华文中宋"/>
+                <w:bCs/>
+                <w:color w:val="E182F1"/>
+                <w:spacing w:val="7"/>
+                <w:lang w:val="en-US" w:eastAsia="zh-CN"/>
+              </w:rPr>
+              <w:t>安装</w:t>
+            </w:r>
+            <w:r>
+              <w:rPr>
+                <w:rFonts w:hint="eastAsia" w:ascii="华文中宋" w:hAnsi="华文中宋" w:cs="华文中宋"/>
+                <w:b/>
+                <w:bCs/>
+                <w:color w:val="ED7D31" w:themeColor="accent2"/>
+                <w:spacing w:val="0"/>
+                <w:sz w:val="21"/>
+                <w:szCs w:val="24"/>
+                <w:vertAlign w:val="baseline"/>
+                <w:lang w:val="en-US" w:eastAsia="zh-CN"/>
+                <w14:textFill>
+                  <w14:solidFill>
+                    <w14:schemeClr w14:val="accent2"/>
+                  </w14:solidFill>
+                </w14:textFill>
+              </w:rPr>
+              <w:t>发行版</w:t>
+            </w:r>
+          </w:p>
+        </w:tc>
+      </w:tr>
+      <w:tr>
+        <w:tblPrEx>
+          <w:tblBorders>
+            <w:top w:val="single" w:color="auto" w:sz="4" w:space="0"/>
+            <w:left w:val="single" w:color="auto" w:sz="4" w:space="0"/>
+            <w:bottom w:val="single" w:color="auto" w:sz="4" w:space="0"/>
+            <w:right w:val="single" w:color="auto" w:sz="4" w:space="0"/>
+            <w:insideH w:val="single" w:color="auto" w:sz="4" w:space="0"/>
+            <w:insideV w:val="single" w:color="auto" w:sz="4" w:space="0"/>
+          </w:tblBorders>
+          <w:tblCellMar>
+            <w:top w:w="0" w:type="dxa"/>
+            <w:left w:w="108" w:type="dxa"/>
+            <w:bottom w:w="0" w:type="dxa"/>
+            <w:right w:w="108" w:type="dxa"/>
+          </w:tblCellMar>
+        </w:tblPrEx>
+        <w:tc>
+          <w:tcPr>
+            <w:tcW w:w="654" w:type="dxa"/>
+            <w:vMerge w:val="continue"/>
+            <w:tcBorders/>
+            <w:vAlign w:val="center"/>
+          </w:tcPr>
+          <w:p>
+            <w:pPr>
+              <w:bidi w:val="0"/>
+              <w:spacing w:line="240" w:lineRule="auto"/>
+              <w:jc w:val="both"/>
+              <w:rPr>
+                <w:rFonts w:hint="default" w:ascii="华文中宋" w:hAnsi="华文中宋" w:cs="华文中宋"/>
+                <w:b/>
+                <w:bCs/>
+                <w:color w:val="ED7D31" w:themeColor="accent2"/>
+                <w:spacing w:val="0"/>
+                <w:sz w:val="21"/>
+                <w:szCs w:val="24"/>
+                <w:vertAlign w:val="baseline"/>
+                <w:lang w:val="en-US" w:eastAsia="zh-CN"/>
+                <w14:textFill>
+                  <w14:solidFill>
+                    <w14:schemeClr w14:val="accent2"/>
+                  </w14:solidFill>
+                </w14:textFill>
+              </w:rPr>
+            </w:pPr>
+          </w:p>
+        </w:tc>
+        <w:tc>
+          <w:tcPr>
+            <w:tcW w:w="0" w:type="auto"/>
+            <w:vAlign w:val="center"/>
+          </w:tcPr>
+          <w:p>
+            <w:pPr>
+              <w:bidi w:val="0"/>
+              <w:spacing w:line="240" w:lineRule="auto"/>
+              <w:jc w:val="both"/>
+              <w:rPr>
+                <w:rFonts w:hint="default" w:ascii="华文中宋" w:hAnsi="华文中宋" w:cs="华文中宋"/>
+                <w:b/>
+                <w:bCs/>
+                <w:color w:val="FF0000"/>
+                <w:spacing w:val="0"/>
+                <w:sz w:val="21"/>
+                <w:szCs w:val="24"/>
+                <w:vertAlign w:val="baseline"/>
+                <w:lang w:val="en-US" w:eastAsia="zh-CN"/>
+              </w:rPr>
+            </w:pPr>
+            <w:r>
+              <w:rPr>
+                <w:rFonts w:hint="eastAsia" w:ascii="华文中宋" w:hAnsi="华文中宋" w:cs="华文中宋"/>
+                <w:b/>
+                <w:bCs/>
+                <w:color w:val="FF0000"/>
+                <w:spacing w:val="0"/>
+                <w:sz w:val="21"/>
+                <w:szCs w:val="24"/>
+                <w:vertAlign w:val="baseline"/>
+                <w:lang w:val="en-US" w:eastAsia="zh-CN"/>
+              </w:rPr>
+              <w:t>wsl --set-default &lt;name&gt;</w:t>
+            </w:r>
+          </w:p>
+        </w:tc>
+        <w:tc>
+          <w:tcPr>
+            <w:tcW w:w="0" w:type="auto"/>
+            <w:vAlign w:val="center"/>
+          </w:tcPr>
+          <w:p>
+            <w:pPr>
+              <w:bidi w:val="0"/>
+              <w:spacing w:line="240" w:lineRule="auto"/>
+              <w:jc w:val="both"/>
+              <w:rPr>
+                <w:rFonts w:hint="default" w:ascii="华文中宋" w:hAnsi="华文中宋" w:cs="华文中宋"/>
+                <w:b/>
+                <w:bCs/>
+                <w:color w:val="ED7D31" w:themeColor="accent2"/>
+                <w:spacing w:val="0"/>
+                <w:sz w:val="21"/>
+                <w:szCs w:val="24"/>
+                <w:vertAlign w:val="baseline"/>
+                <w:lang w:val="en-US" w:eastAsia="zh-CN"/>
+                <w14:textFill>
+                  <w14:solidFill>
+                    <w14:schemeClr w14:val="accent2"/>
+                  </w14:solidFill>
+                </w14:textFill>
+              </w:rPr>
+            </w:pPr>
+            <w:r>
+              <w:rPr>
+                <w:rFonts w:hint="eastAsia" w:ascii="华文中宋" w:hAnsi="华文中宋" w:eastAsia="华文中宋" w:cs="华文中宋"/>
+                <w:bCs/>
+                <w:color w:val="E182F1"/>
+                <w:spacing w:val="7"/>
+                <w:lang w:val="en-US" w:eastAsia="zh-CN"/>
+              </w:rPr>
+              <w:t>设置默认</w:t>
+            </w:r>
+            <w:r>
+              <w:rPr>
+                <w:rFonts w:hint="eastAsia" w:ascii="华文中宋" w:hAnsi="华文中宋" w:cs="华文中宋"/>
+                <w:b/>
+                <w:bCs/>
+                <w:color w:val="ED7D31" w:themeColor="accent2"/>
+                <w:spacing w:val="0"/>
+                <w:sz w:val="21"/>
+                <w:szCs w:val="24"/>
+                <w:vertAlign w:val="baseline"/>
+                <w:lang w:val="en-US" w:eastAsia="zh-CN"/>
+                <w14:textFill>
+                  <w14:solidFill>
+                    <w14:schemeClr w14:val="accent2"/>
+                  </w14:solidFill>
+                </w14:textFill>
+              </w:rPr>
+              <w:t>发行版</w:t>
+            </w:r>
+          </w:p>
+        </w:tc>
+      </w:tr>
+      <w:tr>
+        <w:tblPrEx>
+          <w:tblBorders>
+            <w:top w:val="single" w:color="auto" w:sz="4" w:space="0"/>
+            <w:left w:val="single" w:color="auto" w:sz="4" w:space="0"/>
+            <w:bottom w:val="single" w:color="auto" w:sz="4" w:space="0"/>
+            <w:right w:val="single" w:color="auto" w:sz="4" w:space="0"/>
+            <w:insideH w:val="single" w:color="auto" w:sz="4" w:space="0"/>
+            <w:insideV w:val="single" w:color="auto" w:sz="4" w:space="0"/>
+          </w:tblBorders>
+          <w:tblCellMar>
+            <w:top w:w="0" w:type="dxa"/>
+            <w:left w:w="108" w:type="dxa"/>
+            <w:bottom w:w="0" w:type="dxa"/>
+            <w:right w:w="108" w:type="dxa"/>
+          </w:tblCellMar>
+        </w:tblPrEx>
+        <w:tc>
+          <w:tcPr>
+            <w:tcW w:w="654" w:type="dxa"/>
+            <w:vMerge w:val="continue"/>
+            <w:tcBorders/>
+            <w:vAlign w:val="center"/>
+          </w:tcPr>
+          <w:p>
+            <w:pPr>
+              <w:bidi w:val="0"/>
+              <w:spacing w:line="240" w:lineRule="auto"/>
+              <w:jc w:val="both"/>
+              <w:rPr>
+                <w:rFonts w:hint="default" w:ascii="华文中宋" w:hAnsi="华文中宋" w:cs="华文中宋"/>
+                <w:b/>
+                <w:bCs/>
+                <w:color w:val="ED7D31" w:themeColor="accent2"/>
+                <w:spacing w:val="0"/>
+                <w:sz w:val="21"/>
+                <w:szCs w:val="24"/>
+                <w:vertAlign w:val="baseline"/>
+                <w:lang w:val="en-US" w:eastAsia="zh-CN"/>
+                <w14:textFill>
+                  <w14:solidFill>
+                    <w14:schemeClr w14:val="accent2"/>
+                  </w14:solidFill>
+                </w14:textFill>
+              </w:rPr>
+            </w:pPr>
+          </w:p>
+        </w:tc>
+        <w:tc>
+          <w:tcPr>
+            <w:tcW w:w="0" w:type="auto"/>
+            <w:vAlign w:val="center"/>
+          </w:tcPr>
+          <w:p>
+            <w:pPr>
+              <w:bidi w:val="0"/>
+              <w:spacing w:line="240" w:lineRule="auto"/>
+              <w:jc w:val="both"/>
+              <w:rPr>
+                <w:rFonts w:hint="default" w:ascii="华文中宋" w:hAnsi="华文中宋" w:cs="华文中宋"/>
+                <w:b/>
+                <w:bCs/>
+                <w:color w:val="FF0000"/>
+                <w:spacing w:val="0"/>
+                <w:sz w:val="21"/>
+                <w:szCs w:val="24"/>
+                <w:vertAlign w:val="baseline"/>
+                <w:lang w:val="en-US" w:eastAsia="zh-CN"/>
+              </w:rPr>
+            </w:pPr>
+            <w:r>
+              <w:rPr>
+                <w:rFonts w:hint="eastAsia" w:ascii="华文中宋" w:hAnsi="华文中宋" w:cs="华文中宋"/>
+                <w:b/>
+                <w:bCs/>
+                <w:color w:val="FF0000"/>
+                <w:spacing w:val="0"/>
+                <w:sz w:val="21"/>
+                <w:szCs w:val="24"/>
+                <w:vertAlign w:val="baseline"/>
+                <w:lang w:val="en-US" w:eastAsia="zh-CN"/>
+              </w:rPr>
+              <w:t>wsl --export &lt;name&gt; &lt;file&gt;</w:t>
+            </w:r>
+          </w:p>
+        </w:tc>
+        <w:tc>
+          <w:tcPr>
+            <w:tcW w:w="0" w:type="auto"/>
+            <w:vAlign w:val="center"/>
+          </w:tcPr>
+          <w:p>
+            <w:pPr>
+              <w:bidi w:val="0"/>
+              <w:spacing w:line="240" w:lineRule="auto"/>
+              <w:jc w:val="both"/>
+              <w:rPr>
+                <w:rFonts w:hint="default" w:ascii="华文中宋" w:hAnsi="华文中宋" w:eastAsia="华文中宋" w:cs="华文中宋"/>
+                <w:bCs/>
+                <w:color w:val="E182F1"/>
+                <w:spacing w:val="7"/>
+                <w:lang w:val="en-US" w:eastAsia="zh-CN"/>
+              </w:rPr>
+            </w:pPr>
+            <w:r>
+              <w:rPr>
+                <w:rFonts w:hint="eastAsia" w:ascii="华文中宋" w:hAnsi="华文中宋" w:cs="华文中宋"/>
+                <w:bCs/>
+                <w:color w:val="E182F1"/>
+                <w:spacing w:val="7"/>
+                <w:lang w:val="en-US" w:eastAsia="zh-CN"/>
+              </w:rPr>
+              <w:t>导出</w:t>
+            </w:r>
+          </w:p>
+        </w:tc>
+      </w:tr>
+      <w:tr>
+        <w:tblPrEx>
+          <w:tblBorders>
+            <w:top w:val="single" w:color="auto" w:sz="4" w:space="0"/>
+            <w:left w:val="single" w:color="auto" w:sz="4" w:space="0"/>
+            <w:bottom w:val="single" w:color="auto" w:sz="4" w:space="0"/>
+            <w:right w:val="single" w:color="auto" w:sz="4" w:space="0"/>
+            <w:insideH w:val="single" w:color="auto" w:sz="4" w:space="0"/>
+            <w:insideV w:val="single" w:color="auto" w:sz="4" w:space="0"/>
+          </w:tblBorders>
+          <w:tblCellMar>
+            <w:top w:w="0" w:type="dxa"/>
+            <w:left w:w="108" w:type="dxa"/>
+            <w:bottom w:w="0" w:type="dxa"/>
+            <w:right w:w="108" w:type="dxa"/>
+          </w:tblCellMar>
+        </w:tblPrEx>
+        <w:tc>
+          <w:tcPr>
+            <w:tcW w:w="654" w:type="dxa"/>
+            <w:vMerge w:val="continue"/>
+            <w:tcBorders/>
+            <w:vAlign w:val="center"/>
+          </w:tcPr>
+          <w:p>
+            <w:pPr>
+              <w:bidi w:val="0"/>
+              <w:spacing w:line="240" w:lineRule="auto"/>
+              <w:jc w:val="both"/>
+              <w:rPr>
+                <w:rFonts w:hint="default" w:ascii="华文中宋" w:hAnsi="华文中宋" w:cs="华文中宋"/>
+                <w:b/>
+                <w:bCs/>
+                <w:color w:val="ED7D31" w:themeColor="accent2"/>
+                <w:spacing w:val="0"/>
+                <w:sz w:val="21"/>
+                <w:szCs w:val="24"/>
+                <w:vertAlign w:val="baseline"/>
+                <w:lang w:val="en-US" w:eastAsia="zh-CN"/>
+                <w14:textFill>
+                  <w14:solidFill>
+                    <w14:schemeClr w14:val="accent2"/>
+                  </w14:solidFill>
+                </w14:textFill>
+              </w:rPr>
+            </w:pPr>
+          </w:p>
+        </w:tc>
+        <w:tc>
+          <w:tcPr>
+            <w:tcW w:w="0" w:type="auto"/>
+            <w:vAlign w:val="center"/>
+          </w:tcPr>
+          <w:p>
+            <w:pPr>
+              <w:bidi w:val="0"/>
+              <w:spacing w:line="240" w:lineRule="auto"/>
+              <w:jc w:val="both"/>
+              <w:rPr>
+                <w:rFonts w:hint="default" w:ascii="华文中宋" w:hAnsi="华文中宋" w:cs="华文中宋"/>
+                <w:b/>
+                <w:bCs/>
+                <w:color w:val="FF0000"/>
+                <w:spacing w:val="0"/>
+                <w:sz w:val="21"/>
+                <w:szCs w:val="24"/>
+                <w:vertAlign w:val="baseline"/>
+                <w:lang w:val="en-US" w:eastAsia="zh-CN"/>
+              </w:rPr>
+            </w:pPr>
+            <w:r>
+              <w:rPr>
+                <w:rFonts w:hint="eastAsia" w:ascii="华文中宋" w:hAnsi="华文中宋" w:cs="华文中宋"/>
+                <w:b/>
+                <w:bCs/>
+                <w:color w:val="FF0000"/>
+                <w:spacing w:val="0"/>
+                <w:sz w:val="21"/>
+                <w:szCs w:val="24"/>
+                <w:vertAlign w:val="baseline"/>
+                <w:lang w:val="en-US" w:eastAsia="zh-CN"/>
+              </w:rPr>
+              <w:t>wsl --import &lt;name&gt; &lt;dir&gt; &lt;file&gt;</w:t>
+            </w:r>
+          </w:p>
+        </w:tc>
+        <w:tc>
+          <w:tcPr>
+            <w:tcW w:w="0" w:type="auto"/>
+            <w:vAlign w:val="center"/>
+          </w:tcPr>
+          <w:p>
+            <w:pPr>
+              <w:bidi w:val="0"/>
+              <w:spacing w:line="240" w:lineRule="auto"/>
+              <w:jc w:val="both"/>
+              <w:rPr>
+                <w:rFonts w:hint="default" w:ascii="华文中宋" w:hAnsi="华文中宋" w:cs="华文中宋"/>
+                <w:bCs/>
+                <w:color w:val="E182F1"/>
+                <w:spacing w:val="7"/>
+                <w:lang w:val="en-US" w:eastAsia="zh-CN"/>
+              </w:rPr>
+            </w:pPr>
+            <w:r>
+              <w:rPr>
+                <w:rFonts w:hint="eastAsia" w:ascii="华文中宋" w:hAnsi="华文中宋" w:cs="华文中宋"/>
+                <w:bCs/>
+                <w:color w:val="E182F1"/>
+                <w:spacing w:val="7"/>
+                <w:lang w:val="en-US" w:eastAsia="zh-CN"/>
+              </w:rPr>
+              <w:t>安装</w:t>
+            </w:r>
+          </w:p>
+        </w:tc>
+      </w:tr>
+      <w:tr>
+        <w:tblPrEx>
+          <w:tblBorders>
+            <w:top w:val="single" w:color="auto" w:sz="4" w:space="0"/>
+            <w:left w:val="single" w:color="auto" w:sz="4" w:space="0"/>
+            <w:bottom w:val="single" w:color="auto" w:sz="4" w:space="0"/>
+            <w:right w:val="single" w:color="auto" w:sz="4" w:space="0"/>
+            <w:insideH w:val="single" w:color="auto" w:sz="4" w:space="0"/>
+            <w:insideV w:val="single" w:color="auto" w:sz="4" w:space="0"/>
+          </w:tblBorders>
+          <w:tblCellMar>
+            <w:top w:w="0" w:type="dxa"/>
+            <w:left w:w="108" w:type="dxa"/>
+            <w:bottom w:w="0" w:type="dxa"/>
+            <w:right w:w="108" w:type="dxa"/>
+          </w:tblCellMar>
+        </w:tblPrEx>
+        <w:tc>
+          <w:tcPr>
+            <w:tcW w:w="654" w:type="dxa"/>
+            <w:vMerge w:val="continue"/>
+            <w:tcBorders/>
+            <w:vAlign w:val="center"/>
+          </w:tcPr>
+          <w:p>
+            <w:pPr>
+              <w:bidi w:val="0"/>
+              <w:spacing w:line="240" w:lineRule="auto"/>
+              <w:jc w:val="both"/>
+              <w:rPr>
+                <w:rFonts w:hint="default" w:ascii="华文中宋" w:hAnsi="华文中宋" w:cs="华文中宋"/>
+                <w:b/>
+                <w:bCs/>
+                <w:color w:val="ED7D31" w:themeColor="accent2"/>
+                <w:spacing w:val="0"/>
+                <w:sz w:val="21"/>
+                <w:szCs w:val="24"/>
+                <w:vertAlign w:val="baseline"/>
+                <w:lang w:val="en-US" w:eastAsia="zh-CN"/>
+                <w14:textFill>
+                  <w14:solidFill>
+                    <w14:schemeClr w14:val="accent2"/>
+                  </w14:solidFill>
+                </w14:textFill>
+              </w:rPr>
+            </w:pPr>
+          </w:p>
+        </w:tc>
+        <w:tc>
+          <w:tcPr>
+            <w:tcW w:w="0" w:type="auto"/>
+            <w:vAlign w:val="center"/>
+          </w:tcPr>
+          <w:p>
+            <w:pPr>
+              <w:bidi w:val="0"/>
+              <w:spacing w:line="240" w:lineRule="auto"/>
+              <w:jc w:val="both"/>
+              <w:rPr>
+                <w:rFonts w:hint="default" w:ascii="华文中宋" w:hAnsi="华文中宋" w:cs="华文中宋"/>
+                <w:b/>
+                <w:bCs/>
+                <w:color w:val="FF0000"/>
+                <w:spacing w:val="0"/>
+                <w:sz w:val="21"/>
+                <w:szCs w:val="24"/>
+                <w:vertAlign w:val="baseline"/>
+                <w:lang w:val="en-US" w:eastAsia="zh-CN"/>
+              </w:rPr>
+            </w:pPr>
+            <w:r>
+              <w:rPr>
+                <w:rFonts w:hint="eastAsia" w:ascii="华文中宋" w:hAnsi="华文中宋" w:cs="华文中宋"/>
+                <w:b/>
+                <w:bCs/>
+                <w:color w:val="FF0000"/>
+                <w:spacing w:val="0"/>
+                <w:sz w:val="21"/>
+                <w:szCs w:val="24"/>
+                <w:vertAlign w:val="baseline"/>
+                <w:lang w:val="en-US" w:eastAsia="zh-CN"/>
+              </w:rPr>
+              <w:t>wsl --unregister &lt;name&gt;</w:t>
+            </w:r>
+          </w:p>
+        </w:tc>
+        <w:tc>
+          <w:tcPr>
+            <w:tcW w:w="0" w:type="auto"/>
+            <w:vAlign w:val="center"/>
+          </w:tcPr>
+          <w:p>
+            <w:pPr>
+              <w:bidi w:val="0"/>
+              <w:spacing w:line="240" w:lineRule="auto"/>
+              <w:jc w:val="both"/>
+              <w:rPr>
+                <w:rFonts w:hint="default" w:ascii="华文中宋" w:hAnsi="华文中宋" w:cs="华文中宋"/>
+                <w:bCs/>
+                <w:color w:val="E182F1"/>
+                <w:spacing w:val="7"/>
+                <w:lang w:val="en-US" w:eastAsia="zh-CN"/>
+              </w:rPr>
+            </w:pPr>
+            <w:r>
+              <w:rPr>
+                <w:rFonts w:hint="eastAsia" w:ascii="华文中宋" w:hAnsi="华文中宋" w:cs="华文中宋"/>
+                <w:bCs/>
+                <w:color w:val="E182F1"/>
+                <w:spacing w:val="7"/>
+                <w:lang w:val="en-US" w:eastAsia="zh-CN"/>
+              </w:rPr>
+              <w:t>卸载</w:t>
+            </w:r>
+          </w:p>
+        </w:tc>
+      </w:tr>
+      <w:tr>
+        <w:tblPrEx>
+          <w:tblBorders>
+            <w:top w:val="single" w:color="auto" w:sz="4" w:space="0"/>
+            <w:left w:val="single" w:color="auto" w:sz="4" w:space="0"/>
+            <w:bottom w:val="single" w:color="auto" w:sz="4" w:space="0"/>
+            <w:right w:val="single" w:color="auto" w:sz="4" w:space="0"/>
+            <w:insideH w:val="single" w:color="auto" w:sz="4" w:space="0"/>
+            <w:insideV w:val="single" w:color="auto" w:sz="4" w:space="0"/>
+          </w:tblBorders>
+          <w:tblCellMar>
+            <w:top w:w="0" w:type="dxa"/>
+            <w:left w:w="108" w:type="dxa"/>
+            <w:bottom w:w="0" w:type="dxa"/>
+            <w:right w:w="108" w:type="dxa"/>
+          </w:tblCellMar>
+        </w:tblPrEx>
+        <w:tc>
+          <w:tcPr>
+            <w:tcW w:w="654" w:type="dxa"/>
+            <w:vMerge w:val="continue"/>
+            <w:tcBorders/>
+            <w:vAlign w:val="center"/>
+          </w:tcPr>
+          <w:p>
+            <w:pPr>
+              <w:bidi w:val="0"/>
+              <w:spacing w:line="240" w:lineRule="auto"/>
+              <w:jc w:val="both"/>
+              <w:rPr>
+                <w:rFonts w:hint="default" w:ascii="华文中宋" w:hAnsi="华文中宋" w:cs="华文中宋"/>
+                <w:b/>
+                <w:bCs/>
+                <w:color w:val="ED7D31" w:themeColor="accent2"/>
+                <w:spacing w:val="0"/>
+                <w:sz w:val="21"/>
+                <w:szCs w:val="24"/>
+                <w:vertAlign w:val="baseline"/>
+                <w:lang w:val="en-US" w:eastAsia="zh-CN"/>
+                <w14:textFill>
+                  <w14:solidFill>
+                    <w14:schemeClr w14:val="accent2"/>
+                  </w14:solidFill>
+                </w14:textFill>
+              </w:rPr>
+            </w:pPr>
+          </w:p>
+        </w:tc>
+        <w:tc>
+          <w:tcPr>
+            <w:tcW w:w="0" w:type="auto"/>
+            <w:vAlign w:val="center"/>
+          </w:tcPr>
+          <w:p>
+            <w:pPr>
+              <w:bidi w:val="0"/>
+              <w:spacing w:line="240" w:lineRule="auto"/>
+              <w:jc w:val="both"/>
+              <w:rPr>
+                <w:rFonts w:hint="default" w:ascii="华文中宋" w:hAnsi="华文中宋" w:cs="华文中宋"/>
+                <w:b/>
+                <w:bCs/>
+                <w:color w:val="FF0000"/>
+                <w:spacing w:val="0"/>
+                <w:sz w:val="21"/>
+                <w:szCs w:val="24"/>
+                <w:vertAlign w:val="baseline"/>
+                <w:lang w:val="en-US" w:eastAsia="zh-CN"/>
+              </w:rPr>
+            </w:pPr>
+            <w:r>
+              <w:rPr>
+                <w:rFonts w:hint="eastAsia" w:ascii="华文中宋" w:hAnsi="华文中宋" w:cs="华文中宋"/>
+                <w:b/>
+                <w:bCs/>
+                <w:color w:val="FF0000"/>
+                <w:spacing w:val="0"/>
+                <w:sz w:val="21"/>
+                <w:szCs w:val="24"/>
+                <w:vertAlign w:val="baseline"/>
+                <w:lang w:val="en-US" w:eastAsia="zh-CN"/>
+              </w:rPr>
+              <w:t>wsl &lt;linux-cmd&gt;</w:t>
+            </w:r>
+          </w:p>
+        </w:tc>
+        <w:tc>
+          <w:tcPr>
+            <w:tcW w:w="0" w:type="auto"/>
+            <w:vAlign w:val="center"/>
+          </w:tcPr>
+          <w:p>
+            <w:pPr>
+              <w:bidi w:val="0"/>
+              <w:spacing w:line="240" w:lineRule="auto"/>
+              <w:jc w:val="both"/>
+              <w:rPr>
+                <w:rFonts w:hint="default" w:ascii="华文中宋" w:hAnsi="华文中宋" w:cs="华文中宋"/>
+                <w:bCs/>
+                <w:color w:val="E182F1"/>
+                <w:spacing w:val="7"/>
+                <w:lang w:val="en-US" w:eastAsia="zh-CN"/>
+              </w:rPr>
+            </w:pPr>
+            <w:r>
+              <w:rPr>
+                <w:rFonts w:hint="eastAsia" w:ascii="华文中宋" w:hAnsi="华文中宋" w:cs="华文中宋"/>
+                <w:bCs/>
+                <w:color w:val="E182F1"/>
+                <w:spacing w:val="7"/>
+                <w:lang w:val="en-US" w:eastAsia="zh-CN"/>
+              </w:rPr>
+              <w:t>调用linux命令</w:t>
             </w:r>
           </w:p>
         </w:tc>
@@ -38598,6 +39692,12 @@
             <w:insideH w:val="single" w:color="auto" w:sz="4" w:space="0"/>
             <w:insideV w:val="single" w:color="auto" w:sz="4" w:space="0"/>
           </w:tblBorders>
+          <w:tblCellMar>
+            <w:top w:w="0" w:type="dxa"/>
+            <w:left w:w="108" w:type="dxa"/>
+            <w:bottom w:w="0" w:type="dxa"/>
+            <w:right w:w="108" w:type="dxa"/>
+          </w:tblCellMar>
         </w:tblPrEx>
         <w:tc>
           <w:tcPr>
@@ -41181,6 +42281,12 @@
             <w:insideH w:val="single" w:color="auto" w:sz="4" w:space="0"/>
             <w:insideV w:val="single" w:color="auto" w:sz="4" w:space="0"/>
           </w:tblBorders>
+          <w:tblCellMar>
+            <w:top w:w="0" w:type="dxa"/>
+            <w:left w:w="108" w:type="dxa"/>
+            <w:bottom w:w="0" w:type="dxa"/>
+            <w:right w:w="108" w:type="dxa"/>
+          </w:tblCellMar>
         </w:tblPrEx>
         <w:tc>
           <w:tcPr>
@@ -42527,12 +43633,6 @@
             <w:insideH w:val="single" w:color="auto" w:sz="4" w:space="0"/>
             <w:insideV w:val="single" w:color="auto" w:sz="4" w:space="0"/>
           </w:tblBorders>
-          <w:tblCellMar>
-            <w:top w:w="0" w:type="dxa"/>
-            <w:left w:w="108" w:type="dxa"/>
-            <w:bottom w:w="0" w:type="dxa"/>
-            <w:right w:w="108" w:type="dxa"/>
-          </w:tblCellMar>
         </w:tblPrEx>
         <w:tc>
           <w:tcPr>
@@ -43445,6 +44545,12 @@
             <w:insideH w:val="single" w:color="auto" w:sz="4" w:space="0"/>
             <w:insideV w:val="single" w:color="auto" w:sz="4" w:space="0"/>
           </w:tblBorders>
+          <w:tblCellMar>
+            <w:top w:w="0" w:type="dxa"/>
+            <w:left w:w="108" w:type="dxa"/>
+            <w:bottom w:w="0" w:type="dxa"/>
+            <w:right w:w="108" w:type="dxa"/>
+          </w:tblCellMar>
         </w:tblPrEx>
         <w:tc>
           <w:tcPr>
@@ -46756,12 +47862,6 @@
             <w:insideH w:val="single" w:color="auto" w:sz="4" w:space="0"/>
             <w:insideV w:val="single" w:color="auto" w:sz="4" w:space="0"/>
           </w:tblBorders>
-          <w:tblCellMar>
-            <w:top w:w="0" w:type="dxa"/>
-            <w:left w:w="108" w:type="dxa"/>
-            <w:bottom w:w="0" w:type="dxa"/>
-            <w:right w:w="108" w:type="dxa"/>
-          </w:tblCellMar>
         </w:tblPrEx>
         <w:tc>
           <w:tcPr>

</xml_diff>

<commit_message>
update on 2026-03-16 23:58:33.687506
</commit_message>
<xml_diff>
--- a/cfg - system.docx
+++ b/cfg - system.docx
@@ -17433,7 +17433,6 @@
                 </w14:textFill>
               </w:rPr>
             </w:pPr>
-            <w:bookmarkStart w:id="9" w:name="_GoBack" w:colFirst="0" w:colLast="0"/>
             <w:r>
               <w:rPr>
                 <w:rFonts w:hint="eastAsia" w:ascii="华文中宋" w:hAnsi="华文中宋" w:cs="华文中宋"/>
@@ -17543,152 +17542,6 @@
                 </w14:textFill>
               </w:rPr>
               <w:t>安装wsl</w:t>
-            </w:r>
-          </w:p>
-        </w:tc>
-      </w:tr>
-      <w:bookmarkEnd w:id="9"/>
-      <w:tr>
-        <w:tblPrEx>
-          <w:tblBorders>
-            <w:top w:val="single" w:color="auto" w:sz="4" w:space="0"/>
-            <w:left w:val="single" w:color="auto" w:sz="4" w:space="0"/>
-            <w:bottom w:val="single" w:color="auto" w:sz="4" w:space="0"/>
-            <w:right w:val="single" w:color="auto" w:sz="4" w:space="0"/>
-            <w:insideH w:val="single" w:color="auto" w:sz="4" w:space="0"/>
-            <w:insideV w:val="single" w:color="auto" w:sz="4" w:space="0"/>
-          </w:tblBorders>
-          <w:tblCellMar>
-            <w:top w:w="0" w:type="dxa"/>
-            <w:left w:w="108" w:type="dxa"/>
-            <w:bottom w:w="0" w:type="dxa"/>
-            <w:right w:w="108" w:type="dxa"/>
-          </w:tblCellMar>
-        </w:tblPrEx>
-        <w:tc>
-          <w:tcPr>
-            <w:tcW w:w="654" w:type="dxa"/>
-            <w:vMerge w:val="continue"/>
-            <w:tcBorders/>
-            <w:vAlign w:val="center"/>
-          </w:tcPr>
-          <w:p>
-            <w:pPr>
-              <w:bidi w:val="0"/>
-              <w:spacing w:line="240" w:lineRule="auto"/>
-              <w:jc w:val="both"/>
-              <w:rPr>
-                <w:rFonts w:hint="eastAsia" w:ascii="华文中宋" w:hAnsi="华文中宋" w:cs="华文中宋"/>
-                <w:b/>
-                <w:bCs/>
-                <w:color w:val="ED7D31" w:themeColor="accent2"/>
-                <w:spacing w:val="0"/>
-                <w:sz w:val="21"/>
-                <w:szCs w:val="24"/>
-                <w:vertAlign w:val="baseline"/>
-                <w:lang w:val="en-US" w:eastAsia="zh-CN"/>
-                <w14:textFill>
-                  <w14:solidFill>
-                    <w14:schemeClr w14:val="accent2"/>
-                  </w14:solidFill>
-                </w14:textFill>
-              </w:rPr>
-            </w:pPr>
-          </w:p>
-        </w:tc>
-        <w:tc>
-          <w:tcPr>
-            <w:tcW w:w="0" w:type="auto"/>
-            <w:vAlign w:val="center"/>
-          </w:tcPr>
-          <w:p>
-            <w:pPr>
-              <w:bidi w:val="0"/>
-              <w:spacing w:line="240" w:lineRule="auto"/>
-              <w:jc w:val="both"/>
-              <w:rPr>
-                <w:rFonts w:hint="default" w:ascii="华文中宋" w:hAnsi="华文中宋" w:cs="华文中宋"/>
-                <w:b/>
-                <w:bCs/>
-                <w:color w:val="FF0000"/>
-                <w:spacing w:val="0"/>
-                <w:sz w:val="21"/>
-                <w:szCs w:val="24"/>
-                <w:vertAlign w:val="baseline"/>
-                <w:lang w:val="en-US" w:eastAsia="zh-CN"/>
-              </w:rPr>
-            </w:pPr>
-            <w:r>
-              <w:rPr>
-                <w:rFonts w:hint="eastAsia" w:ascii="华文中宋" w:hAnsi="华文中宋" w:cs="华文中宋"/>
-                <w:b/>
-                <w:bCs/>
-                <w:color w:val="FF0000"/>
-                <w:spacing w:val="0"/>
-                <w:sz w:val="21"/>
-                <w:szCs w:val="24"/>
-                <w:vertAlign w:val="baseline"/>
-                <w:lang w:val="en-US" w:eastAsia="zh-CN"/>
-              </w:rPr>
-              <w:t>wsl -l -o</w:t>
-            </w:r>
-          </w:p>
-        </w:tc>
-        <w:tc>
-          <w:tcPr>
-            <w:tcW w:w="0" w:type="auto"/>
-            <w:vAlign w:val="center"/>
-          </w:tcPr>
-          <w:p>
-            <w:pPr>
-              <w:bidi w:val="0"/>
-              <w:spacing w:line="240" w:lineRule="auto"/>
-              <w:jc w:val="both"/>
-              <w:rPr>
-                <w:rFonts w:hint="default" w:ascii="华文中宋" w:hAnsi="华文中宋" w:cs="华文中宋"/>
-                <w:b/>
-                <w:bCs/>
-                <w:color w:val="ED7D31" w:themeColor="accent2"/>
-                <w:spacing w:val="0"/>
-                <w:sz w:val="21"/>
-                <w:szCs w:val="24"/>
-                <w:vertAlign w:val="baseline"/>
-                <w:lang w:val="en-US" w:eastAsia="zh-CN"/>
-                <w14:textFill>
-                  <w14:solidFill>
-                    <w14:schemeClr w14:val="accent2"/>
-                  </w14:solidFill>
-                </w14:textFill>
-              </w:rPr>
-            </w:pPr>
-            <w:r>
-              <w:rPr>
-                <w:rFonts w:hint="eastAsia" w:ascii="华文中宋" w:hAnsi="华文中宋" w:eastAsia="华文中宋" w:cs="华文中宋"/>
-                <w:bCs/>
-                <w:color w:val="E182F1"/>
-                <w:spacing w:val="7"/>
-                <w:lang w:val="en-US" w:eastAsia="zh-CN"/>
-              </w:rPr>
-              <w:t>可用的</w:t>
-            </w:r>
-            <w:r>
-              <w:rPr>
-                <w:rFonts w:hint="eastAsia" w:ascii="华文中宋" w:hAnsi="华文中宋" w:cs="华文中宋"/>
-                <w:b/>
-                <w:bCs/>
-                <w:color w:val="ED7D31" w:themeColor="accent2"/>
-                <w:spacing w:val="0"/>
-                <w:sz w:val="21"/>
-                <w:szCs w:val="24"/>
-                <w:vertAlign w:val="baseline"/>
-                <w:lang w:val="en-US" w:eastAsia="zh-CN"/>
-                <w14:textFill>
-                  <w14:solidFill>
-                    <w14:schemeClr w14:val="accent2"/>
-                  </w14:solidFill>
-                </w14:textFill>
-              </w:rPr>
-              <w:t>发行版</w:t>
             </w:r>
           </w:p>
         </w:tc>
@@ -17775,7 +17628,7 @@
                 <w:vertAlign w:val="baseline"/>
                 <w:lang w:val="en-US" w:eastAsia="zh-CN"/>
               </w:rPr>
-              <w:t>wsl --install -d &lt;name&gt;</w:t>
+              <w:t>wsl -l -o</w:t>
             </w:r>
           </w:p>
         </w:tc>
@@ -17814,7 +17667,7 @@
                 <w:spacing w:val="7"/>
                 <w:lang w:val="en-US" w:eastAsia="zh-CN"/>
               </w:rPr>
-              <w:t>安装</w:t>
+              <w:t>可用的</w:t>
             </w:r>
             <w:r>
               <w:rPr>
@@ -17868,38 +17721,38 @@
               <w:spacing w:line="240" w:lineRule="auto"/>
               <w:jc w:val="both"/>
               <w:rPr>
+                <w:rFonts w:hint="eastAsia" w:ascii="华文中宋" w:hAnsi="华文中宋" w:cs="华文中宋"/>
+                <w:b/>
+                <w:bCs/>
+                <w:color w:val="ED7D31" w:themeColor="accent2"/>
+                <w:spacing w:val="0"/>
+                <w:sz w:val="21"/>
+                <w:szCs w:val="24"/>
+                <w:vertAlign w:val="baseline"/>
+                <w:lang w:val="en-US" w:eastAsia="zh-CN"/>
+                <w14:textFill>
+                  <w14:solidFill>
+                    <w14:schemeClr w14:val="accent2"/>
+                  </w14:solidFill>
+                </w14:textFill>
+              </w:rPr>
+            </w:pPr>
+          </w:p>
+        </w:tc>
+        <w:tc>
+          <w:tcPr>
+            <w:tcW w:w="0" w:type="auto"/>
+            <w:vAlign w:val="center"/>
+          </w:tcPr>
+          <w:p>
+            <w:pPr>
+              <w:bidi w:val="0"/>
+              <w:spacing w:line="240" w:lineRule="auto"/>
+              <w:jc w:val="both"/>
+              <w:rPr>
                 <w:rFonts w:hint="default" w:ascii="华文中宋" w:hAnsi="华文中宋" w:cs="华文中宋"/>
                 <w:b/>
                 <w:bCs/>
-                <w:color w:val="ED7D31" w:themeColor="accent2"/>
-                <w:spacing w:val="0"/>
-                <w:sz w:val="21"/>
-                <w:szCs w:val="24"/>
-                <w:vertAlign w:val="baseline"/>
-                <w:lang w:val="en-US" w:eastAsia="zh-CN"/>
-                <w14:textFill>
-                  <w14:solidFill>
-                    <w14:schemeClr w14:val="accent2"/>
-                  </w14:solidFill>
-                </w14:textFill>
-              </w:rPr>
-            </w:pPr>
-          </w:p>
-        </w:tc>
-        <w:tc>
-          <w:tcPr>
-            <w:tcW w:w="0" w:type="auto"/>
-            <w:vAlign w:val="center"/>
-          </w:tcPr>
-          <w:p>
-            <w:pPr>
-              <w:bidi w:val="0"/>
-              <w:spacing w:line="240" w:lineRule="auto"/>
-              <w:jc w:val="both"/>
-              <w:rPr>
-                <w:rFonts w:hint="default" w:ascii="华文中宋" w:hAnsi="华文中宋" w:cs="华文中宋"/>
-                <w:b/>
-                <w:bCs/>
                 <w:color w:val="FF0000"/>
                 <w:spacing w:val="0"/>
                 <w:sz w:val="21"/>
@@ -17920,7 +17773,7 @@
                 <w:vertAlign w:val="baseline"/>
                 <w:lang w:val="en-US" w:eastAsia="zh-CN"/>
               </w:rPr>
-              <w:t>wsl --set-default &lt;name&gt;</w:t>
+              <w:t>wsl --install -d &lt;name&gt;</w:t>
             </w:r>
           </w:p>
         </w:tc>
@@ -17959,7 +17812,7 @@
                 <w:spacing w:val="7"/>
                 <w:lang w:val="en-US" w:eastAsia="zh-CN"/>
               </w:rPr>
-              <w:t>设置默认</w:t>
+              <w:t>安装</w:t>
             </w:r>
             <w:r>
               <w:rPr>
@@ -18065,37 +17918,65 @@
                 <w:vertAlign w:val="baseline"/>
                 <w:lang w:val="en-US" w:eastAsia="zh-CN"/>
               </w:rPr>
-              <w:t>wsl --export &lt;name&gt; &lt;file&gt;</w:t>
-            </w:r>
-          </w:p>
-        </w:tc>
-        <w:tc>
-          <w:tcPr>
-            <w:tcW w:w="0" w:type="auto"/>
-            <w:vAlign w:val="center"/>
-          </w:tcPr>
-          <w:p>
-            <w:pPr>
-              <w:bidi w:val="0"/>
-              <w:spacing w:line="240" w:lineRule="auto"/>
-              <w:jc w:val="both"/>
-              <w:rPr>
-                <w:rFonts w:hint="default" w:ascii="华文中宋" w:hAnsi="华文中宋" w:eastAsia="华文中宋" w:cs="华文中宋"/>
+              <w:t>wsl --set-default &lt;name&gt;</w:t>
+            </w:r>
+          </w:p>
+        </w:tc>
+        <w:tc>
+          <w:tcPr>
+            <w:tcW w:w="0" w:type="auto"/>
+            <w:vAlign w:val="center"/>
+          </w:tcPr>
+          <w:p>
+            <w:pPr>
+              <w:bidi w:val="0"/>
+              <w:spacing w:line="240" w:lineRule="auto"/>
+              <w:jc w:val="both"/>
+              <w:rPr>
+                <w:rFonts w:hint="default" w:ascii="华文中宋" w:hAnsi="华文中宋" w:cs="华文中宋"/>
+                <w:b/>
+                <w:bCs/>
+                <w:color w:val="ED7D31" w:themeColor="accent2"/>
+                <w:spacing w:val="0"/>
+                <w:sz w:val="21"/>
+                <w:szCs w:val="24"/>
+                <w:vertAlign w:val="baseline"/>
+                <w:lang w:val="en-US" w:eastAsia="zh-CN"/>
+                <w14:textFill>
+                  <w14:solidFill>
+                    <w14:schemeClr w14:val="accent2"/>
+                  </w14:solidFill>
+                </w14:textFill>
+              </w:rPr>
+            </w:pPr>
+            <w:r>
+              <w:rPr>
+                <w:rFonts w:hint="eastAsia" w:ascii="华文中宋" w:hAnsi="华文中宋" w:eastAsia="华文中宋" w:cs="华文中宋"/>
                 <w:bCs/>
                 <w:color w:val="E182F1"/>
                 <w:spacing w:val="7"/>
                 <w:lang w:val="en-US" w:eastAsia="zh-CN"/>
               </w:rPr>
-            </w:pPr>
+              <w:t>设置默认</w:t>
+            </w:r>
             <w:r>
               <w:rPr>
                 <w:rFonts w:hint="eastAsia" w:ascii="华文中宋" w:hAnsi="华文中宋" w:cs="华文中宋"/>
-                <w:bCs/>
-                <w:color w:val="E182F1"/>
-                <w:spacing w:val="7"/>
-                <w:lang w:val="en-US" w:eastAsia="zh-CN"/>
-              </w:rPr>
-              <w:t>导出</w:t>
+                <w:b/>
+                <w:bCs/>
+                <w:color w:val="ED7D31" w:themeColor="accent2"/>
+                <w:spacing w:val="0"/>
+                <w:sz w:val="21"/>
+                <w:szCs w:val="24"/>
+                <w:vertAlign w:val="baseline"/>
+                <w:lang w:val="en-US" w:eastAsia="zh-CN"/>
+                <w14:textFill>
+                  <w14:solidFill>
+                    <w14:schemeClr w14:val="accent2"/>
+                  </w14:solidFill>
+                </w14:textFill>
+              </w:rPr>
+              <w:t>发行版</w:t>
             </w:r>
           </w:p>
         </w:tc>
@@ -18182,22 +18063,22 @@
                 <w:vertAlign w:val="baseline"/>
                 <w:lang w:val="en-US" w:eastAsia="zh-CN"/>
               </w:rPr>
-              <w:t>wsl --import &lt;name&gt; &lt;dir&gt; &lt;file&gt;</w:t>
-            </w:r>
-          </w:p>
-        </w:tc>
-        <w:tc>
-          <w:tcPr>
-            <w:tcW w:w="0" w:type="auto"/>
-            <w:vAlign w:val="center"/>
-          </w:tcPr>
-          <w:p>
-            <w:pPr>
-              <w:bidi w:val="0"/>
-              <w:spacing w:line="240" w:lineRule="auto"/>
-              <w:jc w:val="both"/>
-              <w:rPr>
-                <w:rFonts w:hint="default" w:ascii="华文中宋" w:hAnsi="华文中宋" w:cs="华文中宋"/>
+              <w:t>wsl --export &lt;name&gt; &lt;file&gt;</w:t>
+            </w:r>
+          </w:p>
+        </w:tc>
+        <w:tc>
+          <w:tcPr>
+            <w:tcW w:w="0" w:type="auto"/>
+            <w:vAlign w:val="center"/>
+          </w:tcPr>
+          <w:p>
+            <w:pPr>
+              <w:bidi w:val="0"/>
+              <w:spacing w:line="240" w:lineRule="auto"/>
+              <w:jc w:val="both"/>
+              <w:rPr>
+                <w:rFonts w:hint="default" w:ascii="华文中宋" w:hAnsi="华文中宋" w:eastAsia="华文中宋" w:cs="华文中宋"/>
                 <w:bCs/>
                 <w:color w:val="E182F1"/>
                 <w:spacing w:val="7"/>
@@ -18212,7 +18093,7 @@
                 <w:spacing w:val="7"/>
                 <w:lang w:val="en-US" w:eastAsia="zh-CN"/>
               </w:rPr>
-              <w:t>安装</w:t>
+              <w:t>导出</w:t>
             </w:r>
           </w:p>
         </w:tc>
@@ -18299,7 +18180,7 @@
                 <w:vertAlign w:val="baseline"/>
                 <w:lang w:val="en-US" w:eastAsia="zh-CN"/>
               </w:rPr>
-              <w:t>wsl --unregister &lt;name&gt;</w:t>
+              <w:t>wsl --import &lt;name&gt; &lt;dir&gt; &lt;file&gt;</w:t>
             </w:r>
           </w:p>
         </w:tc>
@@ -18329,7 +18210,7 @@
                 <w:spacing w:val="7"/>
                 <w:lang w:val="en-US" w:eastAsia="zh-CN"/>
               </w:rPr>
-              <w:t>卸载</w:t>
+              <w:t>安装</w:t>
             </w:r>
           </w:p>
         </w:tc>
@@ -18416,7 +18297,7 @@
                 <w:vertAlign w:val="baseline"/>
                 <w:lang w:val="en-US" w:eastAsia="zh-CN"/>
               </w:rPr>
-              <w:t>wsl &lt;linux-cmd&gt;</w:t>
+              <w:t>wsl --unregister &lt;name&gt;</w:t>
             </w:r>
           </w:p>
         </w:tc>
@@ -18446,8 +18327,244 @@
                 <w:spacing w:val="7"/>
                 <w:lang w:val="en-US" w:eastAsia="zh-CN"/>
               </w:rPr>
+              <w:t>卸载</w:t>
+            </w:r>
+          </w:p>
+        </w:tc>
+      </w:tr>
+      <w:tr>
+        <w:tblPrEx>
+          <w:tblBorders>
+            <w:top w:val="single" w:color="auto" w:sz="4" w:space="0"/>
+            <w:left w:val="single" w:color="auto" w:sz="4" w:space="0"/>
+            <w:bottom w:val="single" w:color="auto" w:sz="4" w:space="0"/>
+            <w:right w:val="single" w:color="auto" w:sz="4" w:space="0"/>
+            <w:insideH w:val="single" w:color="auto" w:sz="4" w:space="0"/>
+            <w:insideV w:val="single" w:color="auto" w:sz="4" w:space="0"/>
+          </w:tblBorders>
+          <w:tblCellMar>
+            <w:top w:w="0" w:type="dxa"/>
+            <w:left w:w="108" w:type="dxa"/>
+            <w:bottom w:w="0" w:type="dxa"/>
+            <w:right w:w="108" w:type="dxa"/>
+          </w:tblCellMar>
+        </w:tblPrEx>
+        <w:tc>
+          <w:tcPr>
+            <w:tcW w:w="654" w:type="dxa"/>
+            <w:vMerge w:val="continue"/>
+            <w:tcBorders/>
+            <w:vAlign w:val="center"/>
+          </w:tcPr>
+          <w:p>
+            <w:pPr>
+              <w:bidi w:val="0"/>
+              <w:spacing w:line="240" w:lineRule="auto"/>
+              <w:jc w:val="both"/>
+              <w:rPr>
+                <w:rFonts w:hint="default" w:ascii="华文中宋" w:hAnsi="华文中宋" w:cs="华文中宋"/>
+                <w:b/>
+                <w:bCs/>
+                <w:color w:val="ED7D31" w:themeColor="accent2"/>
+                <w:spacing w:val="0"/>
+                <w:sz w:val="21"/>
+                <w:szCs w:val="24"/>
+                <w:vertAlign w:val="baseline"/>
+                <w:lang w:val="en-US" w:eastAsia="zh-CN"/>
+                <w14:textFill>
+                  <w14:solidFill>
+                    <w14:schemeClr w14:val="accent2"/>
+                  </w14:solidFill>
+                </w14:textFill>
+              </w:rPr>
+            </w:pPr>
+          </w:p>
+        </w:tc>
+        <w:tc>
+          <w:tcPr>
+            <w:tcW w:w="0" w:type="auto"/>
+            <w:vAlign w:val="center"/>
+          </w:tcPr>
+          <w:p>
+            <w:pPr>
+              <w:bidi w:val="0"/>
+              <w:spacing w:line="240" w:lineRule="auto"/>
+              <w:jc w:val="both"/>
+              <w:rPr>
+                <w:rFonts w:hint="default" w:ascii="华文中宋" w:hAnsi="华文中宋" w:cs="华文中宋"/>
+                <w:b/>
+                <w:bCs/>
+                <w:color w:val="FF0000"/>
+                <w:spacing w:val="0"/>
+                <w:sz w:val="21"/>
+                <w:szCs w:val="24"/>
+                <w:vertAlign w:val="baseline"/>
+                <w:lang w:val="en-US" w:eastAsia="zh-CN"/>
+              </w:rPr>
+            </w:pPr>
+            <w:r>
+              <w:rPr>
+                <w:rFonts w:hint="eastAsia" w:ascii="华文中宋" w:hAnsi="华文中宋" w:cs="华文中宋"/>
+                <w:b/>
+                <w:bCs/>
+                <w:color w:val="FF0000"/>
+                <w:spacing w:val="0"/>
+                <w:sz w:val="21"/>
+                <w:szCs w:val="24"/>
+                <w:vertAlign w:val="baseline"/>
+                <w:lang w:val="en-US" w:eastAsia="zh-CN"/>
+              </w:rPr>
+              <w:t>wsl &lt;linux-cmd&gt;</w:t>
+            </w:r>
+          </w:p>
+        </w:tc>
+        <w:tc>
+          <w:tcPr>
+            <w:tcW w:w="0" w:type="auto"/>
+            <w:vAlign w:val="center"/>
+          </w:tcPr>
+          <w:p>
+            <w:pPr>
+              <w:bidi w:val="0"/>
+              <w:spacing w:line="240" w:lineRule="auto"/>
+              <w:jc w:val="both"/>
+              <w:rPr>
+                <w:rFonts w:hint="default" w:ascii="华文中宋" w:hAnsi="华文中宋" w:cs="华文中宋"/>
+                <w:bCs/>
+                <w:color w:val="E182F1"/>
+                <w:spacing w:val="7"/>
+                <w:lang w:val="en-US" w:eastAsia="zh-CN"/>
+              </w:rPr>
+            </w:pPr>
+            <w:r>
+              <w:rPr>
+                <w:rFonts w:hint="eastAsia" w:ascii="华文中宋" w:hAnsi="华文中宋" w:cs="华文中宋"/>
+                <w:bCs/>
+                <w:color w:val="E182F1"/>
+                <w:spacing w:val="7"/>
+                <w:lang w:val="en-US" w:eastAsia="zh-CN"/>
+              </w:rPr>
               <w:t>调用linux命令</w:t>
             </w:r>
+          </w:p>
+        </w:tc>
+      </w:tr>
+      <w:tr>
+        <w:tblPrEx>
+          <w:tblBorders>
+            <w:top w:val="single" w:color="auto" w:sz="4" w:space="0"/>
+            <w:left w:val="single" w:color="auto" w:sz="4" w:space="0"/>
+            <w:bottom w:val="single" w:color="auto" w:sz="4" w:space="0"/>
+            <w:right w:val="single" w:color="auto" w:sz="4" w:space="0"/>
+            <w:insideH w:val="single" w:color="auto" w:sz="4" w:space="0"/>
+            <w:insideV w:val="single" w:color="auto" w:sz="4" w:space="0"/>
+          </w:tblBorders>
+          <w:tblCellMar>
+            <w:top w:w="0" w:type="dxa"/>
+            <w:left w:w="108" w:type="dxa"/>
+            <w:bottom w:w="0" w:type="dxa"/>
+            <w:right w:w="108" w:type="dxa"/>
+          </w:tblCellMar>
+        </w:tblPrEx>
+        <w:tc>
+          <w:tcPr>
+            <w:tcW w:w="654" w:type="dxa"/>
+            <w:vMerge w:val="continue"/>
+            <w:tcBorders/>
+            <w:vAlign w:val="center"/>
+          </w:tcPr>
+          <w:p>
+            <w:pPr>
+              <w:bidi w:val="0"/>
+              <w:spacing w:line="240" w:lineRule="auto"/>
+              <w:jc w:val="both"/>
+              <w:rPr>
+                <w:rFonts w:hint="default" w:ascii="华文中宋" w:hAnsi="华文中宋" w:cs="华文中宋"/>
+                <w:b/>
+                <w:bCs/>
+                <w:color w:val="ED7D31" w:themeColor="accent2"/>
+                <w:spacing w:val="0"/>
+                <w:sz w:val="21"/>
+                <w:szCs w:val="24"/>
+                <w:vertAlign w:val="baseline"/>
+                <w:lang w:val="en-US" w:eastAsia="zh-CN"/>
+                <w14:textFill>
+                  <w14:solidFill>
+                    <w14:schemeClr w14:val="accent2"/>
+                  </w14:solidFill>
+                </w14:textFill>
+              </w:rPr>
+            </w:pPr>
+          </w:p>
+        </w:tc>
+        <w:tc>
+          <w:tcPr>
+            <w:tcW w:w="0" w:type="auto"/>
+            <w:vAlign w:val="center"/>
+          </w:tcPr>
+          <w:p>
+            <w:pPr>
+              <w:bidi w:val="0"/>
+              <w:spacing w:line="240" w:lineRule="auto"/>
+              <w:jc w:val="both"/>
+              <w:rPr>
+                <w:rFonts w:hint="default" w:ascii="华文中宋" w:hAnsi="华文中宋" w:cs="华文中宋"/>
+                <w:b/>
+                <w:bCs/>
+                <w:color w:val="FF0000"/>
+                <w:spacing w:val="0"/>
+                <w:sz w:val="21"/>
+                <w:szCs w:val="24"/>
+                <w:vertAlign w:val="baseline"/>
+                <w:lang w:val="en-US" w:eastAsia="zh-CN"/>
+              </w:rPr>
+            </w:pPr>
+            <w:r>
+              <w:rPr>
+                <w:rFonts w:hint="eastAsia" w:ascii="华文中宋" w:hAnsi="华文中宋" w:cs="华文中宋"/>
+                <w:b/>
+                <w:bCs/>
+                <w:color w:val="FF0000"/>
+                <w:spacing w:val="0"/>
+                <w:sz w:val="21"/>
+                <w:szCs w:val="24"/>
+                <w:vertAlign w:val="baseline"/>
+                <w:lang w:val="en-US" w:eastAsia="zh-CN"/>
+              </w:rPr>
+              <w:t>wsl --shutdown</w:t>
+            </w:r>
+          </w:p>
+        </w:tc>
+        <w:tc>
+          <w:tcPr>
+            <w:tcW w:w="0" w:type="auto"/>
+            <w:vAlign w:val="center"/>
+          </w:tcPr>
+          <w:p>
+            <w:pPr>
+              <w:bidi w:val="0"/>
+              <w:spacing w:line="240" w:lineRule="auto"/>
+              <w:jc w:val="both"/>
+              <w:rPr>
+                <w:rFonts w:hint="default" w:ascii="华文中宋" w:hAnsi="华文中宋" w:cs="华文中宋"/>
+                <w:bCs/>
+                <w:color w:val="E182F1"/>
+                <w:spacing w:val="7"/>
+                <w:lang w:val="en-US" w:eastAsia="zh-CN"/>
+              </w:rPr>
+            </w:pPr>
+            <w:r>
+              <w:rPr>
+                <w:rFonts w:hint="eastAsia" w:ascii="华文中宋" w:hAnsi="华文中宋" w:cs="华文中宋"/>
+                <w:bCs/>
+                <w:color w:val="E182F1"/>
+                <w:spacing w:val="7"/>
+                <w:lang w:val="en-US" w:eastAsia="zh-CN"/>
+              </w:rPr>
+              <w:t>关闭</w:t>
+            </w:r>
+            <w:bookmarkStart w:id="9" w:name="_GoBack"/>
+            <w:bookmarkEnd w:id="9"/>
           </w:p>
         </w:tc>
       </w:tr>
@@ -43633,6 +43750,12 @@
             <w:insideH w:val="single" w:color="auto" w:sz="4" w:space="0"/>
             <w:insideV w:val="single" w:color="auto" w:sz="4" w:space="0"/>
           </w:tblBorders>
+          <w:tblCellMar>
+            <w:top w:w="0" w:type="dxa"/>
+            <w:left w:w="108" w:type="dxa"/>
+            <w:bottom w:w="0" w:type="dxa"/>
+            <w:right w:w="108" w:type="dxa"/>
+          </w:tblCellMar>
         </w:tblPrEx>
         <w:tc>
           <w:tcPr>
@@ -47862,6 +47985,12 @@
             <w:insideH w:val="single" w:color="auto" w:sz="4" w:space="0"/>
             <w:insideV w:val="single" w:color="auto" w:sz="4" w:space="0"/>
           </w:tblBorders>
+          <w:tblCellMar>
+            <w:top w:w="0" w:type="dxa"/>
+            <w:left w:w="108" w:type="dxa"/>
+            <w:bottom w:w="0" w:type="dxa"/>
+            <w:right w:w="108" w:type="dxa"/>
+          </w:tblCellMar>
         </w:tblPrEx>
         <w:tc>
           <w:tcPr>

</xml_diff>

<commit_message>
update on 2026-04-10 21:52:49.998885
</commit_message>
<xml_diff>
--- a/cfg - system.docx
+++ b/cfg - system.docx
@@ -12590,12 +12590,6 @@
             <w:insideH w:val="single" w:color="auto" w:sz="4" w:space="0"/>
             <w:insideV w:val="single" w:color="auto" w:sz="4" w:space="0"/>
           </w:tblBorders>
-          <w:tblCellMar>
-            <w:top w:w="0" w:type="dxa"/>
-            <w:left w:w="108" w:type="dxa"/>
-            <w:bottom w:w="0" w:type="dxa"/>
-            <w:right w:w="108" w:type="dxa"/>
-          </w:tblCellMar>
         </w:tblPrEx>
         <w:tc>
           <w:tcPr>
@@ -17567,7 +17561,6 @@
           <w:tcPr>
             <w:tcW w:w="654" w:type="dxa"/>
             <w:vMerge w:val="continue"/>
-            <w:tcBorders/>
             <w:vAlign w:val="center"/>
           </w:tcPr>
           <w:p>
@@ -17712,7 +17705,6 @@
           <w:tcPr>
             <w:tcW w:w="654" w:type="dxa"/>
             <w:vMerge w:val="continue"/>
-            <w:tcBorders/>
             <w:vAlign w:val="center"/>
           </w:tcPr>
           <w:p>
@@ -17857,7 +17849,6 @@
           <w:tcPr>
             <w:tcW w:w="654" w:type="dxa"/>
             <w:vMerge w:val="continue"/>
-            <w:tcBorders/>
             <w:vAlign w:val="center"/>
           </w:tcPr>
           <w:p>
@@ -18002,7 +17993,6 @@
           <w:tcPr>
             <w:tcW w:w="654" w:type="dxa"/>
             <w:vMerge w:val="continue"/>
-            <w:tcBorders/>
             <w:vAlign w:val="center"/>
           </w:tcPr>
           <w:p>
@@ -18119,7 +18109,6 @@
           <w:tcPr>
             <w:tcW w:w="654" w:type="dxa"/>
             <w:vMerge w:val="continue"/>
-            <w:tcBorders/>
             <w:vAlign w:val="center"/>
           </w:tcPr>
           <w:p>
@@ -18236,7 +18225,6 @@
           <w:tcPr>
             <w:tcW w:w="654" w:type="dxa"/>
             <w:vMerge w:val="continue"/>
-            <w:tcBorders/>
             <w:vAlign w:val="center"/>
           </w:tcPr>
           <w:p>
@@ -18353,7 +18341,6 @@
           <w:tcPr>
             <w:tcW w:w="654" w:type="dxa"/>
             <w:vMerge w:val="continue"/>
-            <w:tcBorders/>
             <w:vAlign w:val="center"/>
           </w:tcPr>
           <w:p>
@@ -18470,7 +18457,6 @@
           <w:tcPr>
             <w:tcW w:w="654" w:type="dxa"/>
             <w:vMerge w:val="continue"/>
-            <w:tcBorders/>
             <w:vAlign w:val="center"/>
           </w:tcPr>
           <w:p>
@@ -18563,8 +18549,6 @@
               </w:rPr>
               <w:t>关闭</w:t>
             </w:r>
-            <w:bookmarkStart w:id="9" w:name="_GoBack"/>
-            <w:bookmarkEnd w:id="9"/>
           </w:p>
         </w:tc>
       </w:tr>
@@ -18661,8 +18645,8 @@
           </w14:textFill>
         </w:rPr>
       </w:pPr>
-      <w:bookmarkStart w:id="1" w:name="_Toc131002735"/>
-      <w:bookmarkStart w:id="2" w:name="_Toc12901"/>
+      <w:bookmarkStart w:id="1" w:name="_Toc12901"/>
+      <w:bookmarkStart w:id="2" w:name="_Toc131002735"/>
       <w:r>
         <w:rPr>
           <w:rFonts w:hint="eastAsia" w:ascii="华文中宋" w:hAnsi="华文中宋" w:eastAsia="华文中宋" w:cs="华文中宋"/>
@@ -25746,12 +25730,6 @@
             <w:insideH w:val="single" w:color="auto" w:sz="4" w:space="0"/>
             <w:insideV w:val="single" w:color="auto" w:sz="4" w:space="0"/>
           </w:tblBorders>
-          <w:tblCellMar>
-            <w:top w:w="0" w:type="dxa"/>
-            <w:left w:w="108" w:type="dxa"/>
-            <w:bottom w:w="0" w:type="dxa"/>
-            <w:right w:w="108" w:type="dxa"/>
-          </w:tblCellMar>
         </w:tblPrEx>
         <w:tc>
           <w:tcPr>
@@ -29849,6 +29827,1094 @@
         </w:drawing>
       </w:r>
     </w:p>
+    <w:p>
+      <w:pPr>
+        <w:bidi w:val="0"/>
+        <w:spacing w:line="240" w:lineRule="auto"/>
+        <w:jc w:val="left"/>
+      </w:pPr>
+    </w:p>
+    <w:p>
+      <w:pPr>
+        <w:bidi w:val="0"/>
+        <w:spacing w:line="240" w:lineRule="auto"/>
+        <w:jc w:val="left"/>
+      </w:pPr>
+    </w:p>
+    <w:p>
+      <w:pPr>
+        <w:bidi w:val="0"/>
+        <w:spacing w:line="240" w:lineRule="auto"/>
+        <w:jc w:val="left"/>
+        <w:outlineLvl w:val="0"/>
+        <w:rPr>
+          <w:rFonts w:hint="default" w:ascii="华文中宋" w:hAnsi="华文中宋" w:eastAsia="华文中宋" w:cs="华文中宋"/>
+          <w:b/>
+          <w:bCs/>
+          <w:color w:val="FF0000"/>
+          <w:spacing w:val="0"/>
+          <w:sz w:val="21"/>
+          <w:szCs w:val="24"/>
+          <w:vertAlign w:val="baseline"/>
+          <w:lang w:val="en-US" w:eastAsia="zh-CN"/>
+        </w:rPr>
+      </w:pPr>
+      <w:r>
+        <w:rPr>
+          <w:rFonts w:hint="eastAsia" w:ascii="华文中宋" w:hAnsi="华文中宋" w:cs="华文中宋"/>
+          <w:b/>
+          <w:bCs/>
+          <w:color w:val="70AD47" w:themeColor="accent6"/>
+          <w:spacing w:val="0"/>
+          <w:sz w:val="21"/>
+          <w:szCs w:val="24"/>
+          <w:vertAlign w:val="baseline"/>
+          <w:lang w:val="en-US" w:eastAsia="zh-CN"/>
+          <w14:textFill>
+            <w14:solidFill>
+              <w14:schemeClr w14:val="accent6"/>
+            </w14:solidFill>
+          </w14:textFill>
+        </w:rPr>
+        <w:t>opencode</w:t>
+      </w:r>
+      <w:r>
+        <w:rPr>
+          <w:rFonts w:hint="eastAsia" w:ascii="华文中宋" w:hAnsi="华文中宋" w:eastAsia="华文中宋" w:cs="华文中宋"/>
+          <w:b/>
+          <w:bCs/>
+          <w:color w:val="70AD47" w:themeColor="accent6"/>
+          <w:spacing w:val="0"/>
+          <w:sz w:val="21"/>
+          <w:szCs w:val="24"/>
+          <w:vertAlign w:val="baseline"/>
+          <w:lang w:val="en-US" w:eastAsia="zh-CN"/>
+          <w14:textFill>
+            <w14:solidFill>
+              <w14:schemeClr w14:val="accent6"/>
+            </w14:solidFill>
+          </w14:textFill>
+        </w:rPr>
+        <w:t>：</w:t>
+      </w:r>
+    </w:p>
+    <w:tbl>
+      <w:tblPr>
+        <w:tblStyle w:val="7"/>
+        <w:tblW w:w="0" w:type="auto"/>
+        <w:tblInd w:w="0" w:type="dxa"/>
+        <w:tblBorders>
+          <w:top w:val="single" w:color="auto" w:sz="4" w:space="0"/>
+          <w:left w:val="single" w:color="auto" w:sz="4" w:space="0"/>
+          <w:bottom w:val="single" w:color="auto" w:sz="4" w:space="0"/>
+          <w:right w:val="single" w:color="auto" w:sz="4" w:space="0"/>
+          <w:insideH w:val="single" w:color="auto" w:sz="4" w:space="0"/>
+          <w:insideV w:val="single" w:color="auto" w:sz="4" w:space="0"/>
+        </w:tblBorders>
+        <w:tblLayout w:type="autofit"/>
+        <w:tblCellMar>
+          <w:top w:w="0" w:type="dxa"/>
+          <w:left w:w="108" w:type="dxa"/>
+          <w:bottom w:w="0" w:type="dxa"/>
+          <w:right w:w="108" w:type="dxa"/>
+        </w:tblCellMar>
+      </w:tblPr>
+      <w:tblGrid>
+        <w:gridCol w:w="2296"/>
+        <w:gridCol w:w="661"/>
+      </w:tblGrid>
+      <w:tr>
+        <w:tblPrEx>
+          <w:tblBorders>
+            <w:top w:val="single" w:color="auto" w:sz="4" w:space="0"/>
+            <w:left w:val="single" w:color="auto" w:sz="4" w:space="0"/>
+            <w:bottom w:val="single" w:color="auto" w:sz="4" w:space="0"/>
+            <w:right w:val="single" w:color="auto" w:sz="4" w:space="0"/>
+            <w:insideH w:val="single" w:color="auto" w:sz="4" w:space="0"/>
+            <w:insideV w:val="single" w:color="auto" w:sz="4" w:space="0"/>
+          </w:tblBorders>
+          <w:tblCellMar>
+            <w:top w:w="0" w:type="dxa"/>
+            <w:left w:w="108" w:type="dxa"/>
+            <w:bottom w:w="0" w:type="dxa"/>
+            <w:right w:w="108" w:type="dxa"/>
+          </w:tblCellMar>
+        </w:tblPrEx>
+        <w:tc>
+          <w:tcPr>
+            <w:tcW w:w="0" w:type="auto"/>
+            <w:gridSpan w:val="2"/>
+            <w:vAlign w:val="center"/>
+          </w:tcPr>
+          <w:p>
+            <w:pPr>
+              <w:bidi w:val="0"/>
+              <w:spacing w:line="240" w:lineRule="auto"/>
+              <w:jc w:val="both"/>
+              <w:rPr>
+                <w:rFonts w:hint="eastAsia" w:ascii="华文中宋" w:hAnsi="华文中宋" w:eastAsia="华文中宋" w:cs="华文中宋"/>
+                <w:b/>
+                <w:bCs/>
+                <w:color w:val="ED7D31" w:themeColor="accent2"/>
+                <w:spacing w:val="0"/>
+                <w:sz w:val="21"/>
+                <w:szCs w:val="24"/>
+                <w:vertAlign w:val="baseline"/>
+                <w:lang w:val="en-US" w:eastAsia="zh-CN"/>
+                <w14:textFill>
+                  <w14:solidFill>
+                    <w14:schemeClr w14:val="accent2"/>
+                  </w14:solidFill>
+                </w14:textFill>
+              </w:rPr>
+            </w:pPr>
+            <w:r>
+              <w:rPr>
+                <w:rFonts w:hint="eastAsia" w:ascii="华文中宋" w:hAnsi="华文中宋" w:cs="华文中宋"/>
+                <w:b/>
+                <w:bCs/>
+                <w:color w:val="ED7D31" w:themeColor="accent2"/>
+                <w:spacing w:val="0"/>
+                <w:sz w:val="21"/>
+                <w:szCs w:val="24"/>
+                <w:vertAlign w:val="baseline"/>
+                <w:lang w:val="en-US" w:eastAsia="zh-CN"/>
+                <w14:textFill>
+                  <w14:solidFill>
+                    <w14:schemeClr w14:val="accent2"/>
+                  </w14:solidFill>
+                </w14:textFill>
+              </w:rPr>
+              <w:t>command</w:t>
+            </w:r>
+            <w:r>
+              <w:rPr>
+                <w:rFonts w:hint="eastAsia" w:ascii="华文中宋" w:hAnsi="华文中宋" w:eastAsia="华文中宋" w:cs="华文中宋"/>
+                <w:b/>
+                <w:bCs/>
+                <w:color w:val="ED7D31" w:themeColor="accent2"/>
+                <w:spacing w:val="0"/>
+                <w:sz w:val="21"/>
+                <w:szCs w:val="24"/>
+                <w:vertAlign w:val="baseline"/>
+                <w:lang w:val="en-US" w:eastAsia="zh-CN"/>
+                <w14:textFill>
+                  <w14:solidFill>
+                    <w14:schemeClr w14:val="accent2"/>
+                  </w14:solidFill>
+                </w14:textFill>
+              </w:rPr>
+              <w:t>：</w:t>
+            </w:r>
+          </w:p>
+        </w:tc>
+      </w:tr>
+      <w:tr>
+        <w:tblPrEx>
+          <w:tblBorders>
+            <w:top w:val="single" w:color="auto" w:sz="4" w:space="0"/>
+            <w:left w:val="single" w:color="auto" w:sz="4" w:space="0"/>
+            <w:bottom w:val="single" w:color="auto" w:sz="4" w:space="0"/>
+            <w:right w:val="single" w:color="auto" w:sz="4" w:space="0"/>
+            <w:insideH w:val="single" w:color="auto" w:sz="4" w:space="0"/>
+            <w:insideV w:val="single" w:color="auto" w:sz="4" w:space="0"/>
+          </w:tblBorders>
+          <w:tblCellMar>
+            <w:top w:w="0" w:type="dxa"/>
+            <w:left w:w="108" w:type="dxa"/>
+            <w:bottom w:w="0" w:type="dxa"/>
+            <w:right w:w="108" w:type="dxa"/>
+          </w:tblCellMar>
+        </w:tblPrEx>
+        <w:tc>
+          <w:tcPr>
+            <w:tcW w:w="0" w:type="auto"/>
+            <w:vAlign w:val="center"/>
+          </w:tcPr>
+          <w:p>
+            <w:pPr>
+              <w:bidi w:val="0"/>
+              <w:spacing w:line="240" w:lineRule="auto"/>
+              <w:jc w:val="both"/>
+              <w:rPr>
+                <w:rFonts w:hint="default" w:ascii="华文中宋" w:hAnsi="华文中宋" w:eastAsia="华文中宋" w:cs="华文中宋"/>
+                <w:b/>
+                <w:bCs/>
+                <w:color w:val="FF0000"/>
+                <w:spacing w:val="0"/>
+                <w:sz w:val="21"/>
+                <w:szCs w:val="24"/>
+                <w:vertAlign w:val="baseline"/>
+                <w:lang w:val="en-US" w:eastAsia="zh-CN"/>
+              </w:rPr>
+            </w:pPr>
+            <w:r>
+              <w:rPr>
+                <w:rFonts w:hint="eastAsia" w:ascii="华文中宋" w:hAnsi="华文中宋" w:cs="华文中宋"/>
+                <w:b/>
+                <w:bCs/>
+                <w:color w:val="FF0000"/>
+                <w:spacing w:val="0"/>
+                <w:sz w:val="21"/>
+                <w:szCs w:val="24"/>
+                <w:vertAlign w:val="baseline"/>
+                <w:lang w:val="en-US" w:eastAsia="zh-CN"/>
+              </w:rPr>
+              <w:t>opencode auth login</w:t>
+            </w:r>
+          </w:p>
+        </w:tc>
+        <w:tc>
+          <w:tcPr>
+            <w:tcW w:w="0" w:type="auto"/>
+            <w:vAlign w:val="center"/>
+          </w:tcPr>
+          <w:p>
+            <w:pPr>
+              <w:bidi w:val="0"/>
+              <w:spacing w:line="240" w:lineRule="auto"/>
+              <w:jc w:val="both"/>
+              <w:rPr>
+                <w:rFonts w:hint="default" w:ascii="华文中宋" w:hAnsi="华文中宋" w:eastAsia="华文中宋" w:cs="华文中宋"/>
+                <w:b/>
+                <w:bCs/>
+                <w:color w:val="ED7D31" w:themeColor="accent2"/>
+                <w:spacing w:val="0"/>
+                <w:sz w:val="21"/>
+                <w:szCs w:val="24"/>
+                <w:vertAlign w:val="baseline"/>
+                <w:lang w:val="en-US" w:eastAsia="zh-CN"/>
+                <w14:textFill>
+                  <w14:solidFill>
+                    <w14:schemeClr w14:val="accent2"/>
+                  </w14:solidFill>
+                </w14:textFill>
+              </w:rPr>
+            </w:pPr>
+            <w:r>
+              <w:rPr>
+                <w:rFonts w:hint="eastAsia" w:ascii="华文中宋" w:hAnsi="华文中宋" w:cs="华文中宋"/>
+                <w:b/>
+                <w:bCs/>
+                <w:color w:val="EA82F1"/>
+                <w:sz w:val="21"/>
+                <w:szCs w:val="24"/>
+                <w:lang w:val="en-US" w:eastAsia="zh-CN"/>
+              </w:rPr>
+              <w:t>登录</w:t>
+            </w:r>
+          </w:p>
+        </w:tc>
+      </w:tr>
+    </w:tbl>
+    <w:p>
+      <w:pPr>
+        <w:bidi w:val="0"/>
+        <w:spacing w:line="240" w:lineRule="auto"/>
+        <w:jc w:val="left"/>
+      </w:pPr>
+    </w:p>
+    <w:tbl>
+      <w:tblPr>
+        <w:tblStyle w:val="7"/>
+        <w:tblW w:w="0" w:type="auto"/>
+        <w:tblInd w:w="0" w:type="dxa"/>
+        <w:tblBorders>
+          <w:top w:val="single" w:color="auto" w:sz="4" w:space="0"/>
+          <w:left w:val="single" w:color="auto" w:sz="4" w:space="0"/>
+          <w:bottom w:val="single" w:color="auto" w:sz="4" w:space="0"/>
+          <w:right w:val="single" w:color="auto" w:sz="4" w:space="0"/>
+          <w:insideH w:val="single" w:color="auto" w:sz="4" w:space="0"/>
+          <w:insideV w:val="single" w:color="auto" w:sz="4" w:space="0"/>
+        </w:tblBorders>
+        <w:tblLayout w:type="autofit"/>
+        <w:tblCellMar>
+          <w:top w:w="0" w:type="dxa"/>
+          <w:left w:w="108" w:type="dxa"/>
+          <w:bottom w:w="0" w:type="dxa"/>
+          <w:right w:w="108" w:type="dxa"/>
+        </w:tblCellMar>
+      </w:tblPr>
+      <w:tblGrid>
+        <w:gridCol w:w="2464"/>
+        <w:gridCol w:w="2660"/>
+      </w:tblGrid>
+      <w:tr>
+        <w:tblPrEx>
+          <w:tblBorders>
+            <w:top w:val="single" w:color="auto" w:sz="4" w:space="0"/>
+            <w:left w:val="single" w:color="auto" w:sz="4" w:space="0"/>
+            <w:bottom w:val="single" w:color="auto" w:sz="4" w:space="0"/>
+            <w:right w:val="single" w:color="auto" w:sz="4" w:space="0"/>
+            <w:insideH w:val="single" w:color="auto" w:sz="4" w:space="0"/>
+            <w:insideV w:val="single" w:color="auto" w:sz="4" w:space="0"/>
+          </w:tblBorders>
+          <w:tblCellMar>
+            <w:top w:w="0" w:type="dxa"/>
+            <w:left w:w="108" w:type="dxa"/>
+            <w:bottom w:w="0" w:type="dxa"/>
+            <w:right w:w="108" w:type="dxa"/>
+          </w:tblCellMar>
+        </w:tblPrEx>
+        <w:trPr>
+          <w:trHeight w:val="292" w:hRule="atLeast"/>
+        </w:trPr>
+        <w:tc>
+          <w:tcPr>
+            <w:tcW w:w="0" w:type="auto"/>
+            <w:gridSpan w:val="2"/>
+            <w:vAlign w:val="center"/>
+          </w:tcPr>
+          <w:p>
+            <w:pPr>
+              <w:bidi w:val="0"/>
+              <w:spacing w:line="240" w:lineRule="auto"/>
+              <w:jc w:val="both"/>
+              <w:rPr>
+                <w:rFonts w:hint="eastAsia" w:ascii="华文中宋" w:hAnsi="华文中宋" w:eastAsia="华文中宋" w:cs="华文中宋"/>
+                <w:b/>
+                <w:bCs/>
+                <w:color w:val="ED7D31" w:themeColor="accent2"/>
+                <w:spacing w:val="0"/>
+                <w:sz w:val="21"/>
+                <w:szCs w:val="24"/>
+                <w:vertAlign w:val="baseline"/>
+                <w:lang w:val="en-US" w:eastAsia="zh-CN"/>
+                <w14:textFill>
+                  <w14:solidFill>
+                    <w14:schemeClr w14:val="accent2"/>
+                  </w14:solidFill>
+                </w14:textFill>
+              </w:rPr>
+            </w:pPr>
+            <w:r>
+              <w:rPr>
+                <w:rFonts w:hint="eastAsia" w:ascii="华文中宋" w:hAnsi="华文中宋" w:cs="华文中宋"/>
+                <w:b/>
+                <w:bCs/>
+                <w:color w:val="ED7D31" w:themeColor="accent2"/>
+                <w:spacing w:val="0"/>
+                <w:sz w:val="21"/>
+                <w:szCs w:val="24"/>
+                <w:vertAlign w:val="baseline"/>
+                <w:lang w:val="en-US" w:eastAsia="zh-CN"/>
+                <w14:textFill>
+                  <w14:solidFill>
+                    <w14:schemeClr w14:val="accent2"/>
+                  </w14:solidFill>
+                </w14:textFill>
+              </w:rPr>
+              <w:t>skills</w:t>
+            </w:r>
+            <w:r>
+              <w:rPr>
+                <w:rFonts w:hint="eastAsia" w:ascii="华文中宋" w:hAnsi="华文中宋" w:eastAsia="华文中宋" w:cs="华文中宋"/>
+                <w:b/>
+                <w:bCs/>
+                <w:color w:val="ED7D31" w:themeColor="accent2"/>
+                <w:spacing w:val="0"/>
+                <w:sz w:val="21"/>
+                <w:szCs w:val="24"/>
+                <w:vertAlign w:val="baseline"/>
+                <w:lang w:val="en-US" w:eastAsia="zh-CN"/>
+                <w14:textFill>
+                  <w14:solidFill>
+                    <w14:schemeClr w14:val="accent2"/>
+                  </w14:solidFill>
+                </w14:textFill>
+              </w:rPr>
+              <w:t>：</w:t>
+            </w:r>
+          </w:p>
+        </w:tc>
+      </w:tr>
+      <w:tr>
+        <w:tblPrEx>
+          <w:tblBorders>
+            <w:top w:val="single" w:color="auto" w:sz="4" w:space="0"/>
+            <w:left w:val="single" w:color="auto" w:sz="4" w:space="0"/>
+            <w:bottom w:val="single" w:color="auto" w:sz="4" w:space="0"/>
+            <w:right w:val="single" w:color="auto" w:sz="4" w:space="0"/>
+            <w:insideH w:val="single" w:color="auto" w:sz="4" w:space="0"/>
+            <w:insideV w:val="single" w:color="auto" w:sz="4" w:space="0"/>
+          </w:tblBorders>
+          <w:tblCellMar>
+            <w:top w:w="0" w:type="dxa"/>
+            <w:left w:w="108" w:type="dxa"/>
+            <w:bottom w:w="0" w:type="dxa"/>
+            <w:right w:w="108" w:type="dxa"/>
+          </w:tblCellMar>
+        </w:tblPrEx>
+        <w:trPr>
+          <w:trHeight w:val="90" w:hRule="atLeast"/>
+        </w:trPr>
+        <w:tc>
+          <w:tcPr>
+            <w:tcW w:w="0" w:type="auto"/>
+            <w:vAlign w:val="center"/>
+          </w:tcPr>
+          <w:p>
+            <w:pPr>
+              <w:bidi w:val="0"/>
+              <w:spacing w:line="240" w:lineRule="auto"/>
+              <w:jc w:val="both"/>
+              <w:rPr>
+                <w:rFonts w:hint="default" w:ascii="华文中宋" w:hAnsi="华文中宋" w:eastAsia="华文中宋" w:cs="华文中宋"/>
+                <w:b/>
+                <w:bCs/>
+                <w:color w:val="FF0000"/>
+                <w:spacing w:val="0"/>
+                <w:sz w:val="21"/>
+                <w:szCs w:val="24"/>
+                <w:vertAlign w:val="baseline"/>
+                <w:lang w:val="en-US" w:eastAsia="zh-CN"/>
+              </w:rPr>
+            </w:pPr>
+            <w:r>
+              <w:rPr>
+                <w:rFonts w:hint="eastAsia" w:ascii="华文中宋" w:hAnsi="华文中宋" w:cs="华文中宋"/>
+                <w:b/>
+                <w:bCs/>
+                <w:color w:val="FF0000"/>
+                <w:spacing w:val="0"/>
+                <w:sz w:val="21"/>
+                <w:szCs w:val="24"/>
+                <w:vertAlign w:val="baseline"/>
+                <w:lang w:val="en-US" w:eastAsia="zh-CN"/>
+              </w:rPr>
+              <w:t>handoff</w:t>
+            </w:r>
+          </w:p>
+        </w:tc>
+        <w:tc>
+          <w:tcPr>
+            <w:tcW w:w="0" w:type="auto"/>
+            <w:vAlign w:val="center"/>
+          </w:tcPr>
+          <w:p>
+            <w:pPr>
+              <w:bidi w:val="0"/>
+              <w:spacing w:line="240" w:lineRule="auto"/>
+              <w:jc w:val="both"/>
+              <w:rPr>
+                <w:rFonts w:hint="default" w:ascii="华文中宋" w:hAnsi="华文中宋" w:eastAsia="华文中宋" w:cs="华文中宋"/>
+                <w:b/>
+                <w:bCs/>
+                <w:color w:val="ED7D31" w:themeColor="accent2"/>
+                <w:spacing w:val="0"/>
+                <w:sz w:val="21"/>
+                <w:szCs w:val="24"/>
+                <w:vertAlign w:val="baseline"/>
+                <w:lang w:val="en-US" w:eastAsia="zh-CN"/>
+                <w14:textFill>
+                  <w14:solidFill>
+                    <w14:schemeClr w14:val="accent2"/>
+                  </w14:solidFill>
+                </w14:textFill>
+              </w:rPr>
+            </w:pPr>
+            <w:r>
+              <w:rPr>
+                <w:rFonts w:hint="eastAsia" w:ascii="华文中宋" w:hAnsi="华文中宋" w:cs="华文中宋"/>
+                <w:b/>
+                <w:bCs/>
+                <w:color w:val="ED7D31" w:themeColor="accent2"/>
+                <w:spacing w:val="0"/>
+                <w:sz w:val="21"/>
+                <w:szCs w:val="24"/>
+                <w:vertAlign w:val="baseline"/>
+                <w:lang w:val="en-US" w:eastAsia="zh-CN"/>
+                <w14:textFill>
+                  <w14:solidFill>
+                    <w14:schemeClr w14:val="accent2"/>
+                  </w14:solidFill>
+                </w14:textFill>
+              </w:rPr>
+              <w:t>生成</w:t>
+            </w:r>
+            <w:r>
+              <w:rPr>
+                <w:rFonts w:hint="eastAsia" w:ascii="华文中宋" w:hAnsi="华文中宋" w:cs="华文中宋"/>
+                <w:b/>
+                <w:bCs/>
+                <w:color w:val="EA82F1"/>
+                <w:sz w:val="21"/>
+                <w:szCs w:val="24"/>
+                <w:lang w:val="en-US" w:eastAsia="zh-CN"/>
+              </w:rPr>
+              <w:t>交接文档</w:t>
+            </w:r>
+          </w:p>
+        </w:tc>
+      </w:tr>
+      <w:tr>
+        <w:tblPrEx>
+          <w:tblBorders>
+            <w:top w:val="single" w:color="auto" w:sz="4" w:space="0"/>
+            <w:left w:val="single" w:color="auto" w:sz="4" w:space="0"/>
+            <w:bottom w:val="single" w:color="auto" w:sz="4" w:space="0"/>
+            <w:right w:val="single" w:color="auto" w:sz="4" w:space="0"/>
+            <w:insideH w:val="single" w:color="auto" w:sz="4" w:space="0"/>
+            <w:insideV w:val="single" w:color="auto" w:sz="4" w:space="0"/>
+          </w:tblBorders>
+          <w:tblCellMar>
+            <w:top w:w="0" w:type="dxa"/>
+            <w:left w:w="108" w:type="dxa"/>
+            <w:bottom w:w="0" w:type="dxa"/>
+            <w:right w:w="108" w:type="dxa"/>
+          </w:tblCellMar>
+        </w:tblPrEx>
+        <w:trPr>
+          <w:trHeight w:val="90" w:hRule="atLeast"/>
+        </w:trPr>
+        <w:tc>
+          <w:tcPr>
+            <w:tcW w:w="0" w:type="auto"/>
+            <w:vAlign w:val="center"/>
+          </w:tcPr>
+          <w:p>
+            <w:pPr>
+              <w:bidi w:val="0"/>
+              <w:spacing w:line="240" w:lineRule="auto"/>
+              <w:jc w:val="both"/>
+              <w:rPr>
+                <w:rFonts w:hint="default" w:ascii="华文中宋" w:hAnsi="华文中宋" w:cs="华文中宋"/>
+                <w:b/>
+                <w:bCs/>
+                <w:color w:val="FF0000"/>
+                <w:spacing w:val="0"/>
+                <w:sz w:val="21"/>
+                <w:szCs w:val="24"/>
+                <w:vertAlign w:val="baseline"/>
+                <w:lang w:val="en-US" w:eastAsia="zh-CN"/>
+              </w:rPr>
+            </w:pPr>
+            <w:r>
+              <w:rPr>
+                <w:rFonts w:hint="eastAsia" w:ascii="华文中宋" w:hAnsi="华文中宋" w:cs="华文中宋"/>
+                <w:b/>
+                <w:bCs/>
+                <w:color w:val="FF0000"/>
+                <w:spacing w:val="0"/>
+                <w:sz w:val="21"/>
+                <w:szCs w:val="24"/>
+                <w:vertAlign w:val="baseline"/>
+                <w:lang w:val="en-US" w:eastAsia="zh-CN"/>
+              </w:rPr>
+              <w:t>mineru</w:t>
+            </w:r>
+          </w:p>
+        </w:tc>
+        <w:tc>
+          <w:tcPr>
+            <w:tcW w:w="0" w:type="auto"/>
+            <w:vAlign w:val="center"/>
+          </w:tcPr>
+          <w:p>
+            <w:pPr>
+              <w:bidi w:val="0"/>
+              <w:spacing w:line="240" w:lineRule="auto"/>
+              <w:jc w:val="both"/>
+              <w:rPr>
+                <w:rFonts w:hint="default" w:ascii="华文中宋" w:hAnsi="华文中宋" w:cs="华文中宋"/>
+                <w:b/>
+                <w:bCs/>
+                <w:color w:val="ED7D31" w:themeColor="accent2"/>
+                <w:spacing w:val="0"/>
+                <w:sz w:val="21"/>
+                <w:szCs w:val="24"/>
+                <w:vertAlign w:val="baseline"/>
+                <w:lang w:val="en-US" w:eastAsia="zh-CN"/>
+                <w14:textFill>
+                  <w14:solidFill>
+                    <w14:schemeClr w14:val="accent2"/>
+                  </w14:solidFill>
+                </w14:textFill>
+              </w:rPr>
+            </w:pPr>
+            <w:r>
+              <w:rPr>
+                <w:rFonts w:hint="eastAsia" w:ascii="华文中宋" w:hAnsi="华文中宋" w:cs="华文中宋"/>
+                <w:b/>
+                <w:bCs/>
+                <w:color w:val="EA82F1"/>
+                <w:sz w:val="21"/>
+                <w:szCs w:val="24"/>
+                <w:lang w:val="en-US" w:eastAsia="zh-CN"/>
+              </w:rPr>
+              <w:t>多数文档 -&gt; markdown</w:t>
+            </w:r>
+          </w:p>
+        </w:tc>
+      </w:tr>
+      <w:tr>
+        <w:tblPrEx>
+          <w:tblBorders>
+            <w:top w:val="single" w:color="auto" w:sz="4" w:space="0"/>
+            <w:left w:val="single" w:color="auto" w:sz="4" w:space="0"/>
+            <w:bottom w:val="single" w:color="auto" w:sz="4" w:space="0"/>
+            <w:right w:val="single" w:color="auto" w:sz="4" w:space="0"/>
+            <w:insideH w:val="single" w:color="auto" w:sz="4" w:space="0"/>
+            <w:insideV w:val="single" w:color="auto" w:sz="4" w:space="0"/>
+          </w:tblBorders>
+          <w:tblCellMar>
+            <w:top w:w="0" w:type="dxa"/>
+            <w:left w:w="108" w:type="dxa"/>
+            <w:bottom w:w="0" w:type="dxa"/>
+            <w:right w:w="108" w:type="dxa"/>
+          </w:tblCellMar>
+        </w:tblPrEx>
+        <w:tc>
+          <w:tcPr>
+            <w:tcW w:w="0" w:type="auto"/>
+            <w:vAlign w:val="center"/>
+          </w:tcPr>
+          <w:p>
+            <w:pPr>
+              <w:bidi w:val="0"/>
+              <w:spacing w:line="240" w:lineRule="auto"/>
+              <w:jc w:val="both"/>
+              <w:rPr>
+                <w:rFonts w:hint="default" w:ascii="华文中宋" w:hAnsi="华文中宋" w:cs="华文中宋"/>
+                <w:b/>
+                <w:bCs/>
+                <w:color w:val="FF0000"/>
+                <w:spacing w:val="0"/>
+                <w:sz w:val="21"/>
+                <w:szCs w:val="24"/>
+                <w:vertAlign w:val="baseline"/>
+                <w:lang w:val="en-US" w:eastAsia="zh-CN"/>
+              </w:rPr>
+            </w:pPr>
+            <w:r>
+              <w:rPr>
+                <w:rFonts w:hint="eastAsia" w:ascii="华文中宋" w:hAnsi="华文中宋" w:cs="华文中宋"/>
+                <w:b/>
+                <w:bCs/>
+                <w:color w:val="FF0000"/>
+                <w:spacing w:val="0"/>
+                <w:sz w:val="21"/>
+                <w:szCs w:val="24"/>
+                <w:vertAlign w:val="baseline"/>
+                <w:lang w:val="en-US" w:eastAsia="zh-CN"/>
+              </w:rPr>
+              <w:t>ralph_loop / ulw_loop</w:t>
+            </w:r>
+          </w:p>
+        </w:tc>
+        <w:tc>
+          <w:tcPr>
+            <w:tcW w:w="0" w:type="auto"/>
+            <w:vAlign w:val="center"/>
+          </w:tcPr>
+          <w:p>
+            <w:pPr>
+              <w:bidi w:val="0"/>
+              <w:spacing w:line="240" w:lineRule="auto"/>
+              <w:jc w:val="both"/>
+              <w:rPr>
+                <w:rFonts w:hint="default" w:ascii="华文中宋" w:hAnsi="华文中宋" w:cs="华文中宋"/>
+                <w:b/>
+                <w:bCs/>
+                <w:color w:val="EA82F1"/>
+                <w:sz w:val="21"/>
+                <w:szCs w:val="24"/>
+                <w:lang w:val="en-US" w:eastAsia="zh-CN"/>
+              </w:rPr>
+            </w:pPr>
+            <w:r>
+              <w:rPr>
+                <w:rFonts w:hint="eastAsia" w:ascii="华文中宋" w:hAnsi="华文中宋" w:cs="华文中宋"/>
+                <w:b/>
+                <w:bCs/>
+                <w:color w:val="EA82F1"/>
+                <w:sz w:val="21"/>
+                <w:szCs w:val="24"/>
+                <w:lang w:val="en-US" w:eastAsia="zh-CN"/>
+              </w:rPr>
+              <w:t>开发循环</w:t>
+            </w:r>
+          </w:p>
+        </w:tc>
+      </w:tr>
+      <w:tr>
+        <w:tblPrEx>
+          <w:tblBorders>
+            <w:top w:val="single" w:color="auto" w:sz="4" w:space="0"/>
+            <w:left w:val="single" w:color="auto" w:sz="4" w:space="0"/>
+            <w:bottom w:val="single" w:color="auto" w:sz="4" w:space="0"/>
+            <w:right w:val="single" w:color="auto" w:sz="4" w:space="0"/>
+            <w:insideH w:val="single" w:color="auto" w:sz="4" w:space="0"/>
+            <w:insideV w:val="single" w:color="auto" w:sz="4" w:space="0"/>
+          </w:tblBorders>
+          <w:tblCellMar>
+            <w:top w:w="0" w:type="dxa"/>
+            <w:left w:w="108" w:type="dxa"/>
+            <w:bottom w:w="0" w:type="dxa"/>
+            <w:right w:w="108" w:type="dxa"/>
+          </w:tblCellMar>
+        </w:tblPrEx>
+        <w:tc>
+          <w:tcPr>
+            <w:tcW w:w="0" w:type="auto"/>
+            <w:shd w:val="clear"/>
+            <w:vAlign w:val="center"/>
+          </w:tcPr>
+          <w:p>
+            <w:pPr>
+              <w:bidi w:val="0"/>
+              <w:spacing w:line="240" w:lineRule="auto"/>
+              <w:jc w:val="both"/>
+              <w:rPr>
+                <w:rFonts w:hint="eastAsia" w:ascii="华文中宋" w:hAnsi="华文中宋" w:eastAsia="华文中宋" w:cs="华文中宋"/>
+                <w:b/>
+                <w:bCs/>
+                <w:color w:val="FF0000"/>
+                <w:spacing w:val="0"/>
+                <w:kern w:val="2"/>
+                <w:sz w:val="21"/>
+                <w:szCs w:val="24"/>
+                <w:vertAlign w:val="baseline"/>
+                <w:lang w:val="en-US" w:eastAsia="zh-CN" w:bidi="ar-SA"/>
+              </w:rPr>
+            </w:pPr>
+            <w:r>
+              <w:rPr>
+                <w:rFonts w:hint="eastAsia" w:ascii="华文中宋" w:hAnsi="华文中宋" w:cs="华文中宋"/>
+                <w:b/>
+                <w:bCs/>
+                <w:color w:val="FF0000"/>
+                <w:spacing w:val="0"/>
+                <w:sz w:val="21"/>
+                <w:szCs w:val="24"/>
+                <w:vertAlign w:val="baseline"/>
+                <w:lang w:val="en-US" w:eastAsia="zh-CN"/>
+              </w:rPr>
+              <w:t>refactor</w:t>
+            </w:r>
+          </w:p>
+        </w:tc>
+        <w:tc>
+          <w:tcPr>
+            <w:tcW w:w="0" w:type="auto"/>
+            <w:shd w:val="clear"/>
+            <w:vAlign w:val="center"/>
+          </w:tcPr>
+          <w:p>
+            <w:pPr>
+              <w:bidi w:val="0"/>
+              <w:spacing w:line="240" w:lineRule="auto"/>
+              <w:jc w:val="both"/>
+              <w:rPr>
+                <w:rFonts w:hint="eastAsia" w:ascii="华文中宋" w:hAnsi="华文中宋" w:eastAsia="华文中宋" w:cs="华文中宋"/>
+                <w:b/>
+                <w:bCs/>
+                <w:color w:val="ED7D31" w:themeColor="accent2"/>
+                <w:spacing w:val="0"/>
+                <w:kern w:val="2"/>
+                <w:sz w:val="21"/>
+                <w:szCs w:val="24"/>
+                <w:vertAlign w:val="baseline"/>
+                <w:lang w:val="en-US" w:eastAsia="zh-CN" w:bidi="ar-SA"/>
+                <w14:textFill>
+                  <w14:solidFill>
+                    <w14:schemeClr w14:val="accent2"/>
+                  </w14:solidFill>
+                </w14:textFill>
+              </w:rPr>
+            </w:pPr>
+            <w:r>
+              <w:rPr>
+                <w:rFonts w:hint="eastAsia" w:ascii="华文中宋" w:hAnsi="华文中宋" w:cs="华文中宋"/>
+                <w:b/>
+                <w:bCs/>
+                <w:color w:val="EA82F1"/>
+                <w:sz w:val="21"/>
+                <w:szCs w:val="24"/>
+                <w:lang w:val="en-US" w:eastAsia="zh-CN"/>
+              </w:rPr>
+              <w:t>重构代码</w:t>
+            </w:r>
+          </w:p>
+        </w:tc>
+      </w:tr>
+      <w:tr>
+        <w:tblPrEx>
+          <w:tblBorders>
+            <w:top w:val="single" w:color="auto" w:sz="4" w:space="0"/>
+            <w:left w:val="single" w:color="auto" w:sz="4" w:space="0"/>
+            <w:bottom w:val="single" w:color="auto" w:sz="4" w:space="0"/>
+            <w:right w:val="single" w:color="auto" w:sz="4" w:space="0"/>
+            <w:insideH w:val="single" w:color="auto" w:sz="4" w:space="0"/>
+            <w:insideV w:val="single" w:color="auto" w:sz="4" w:space="0"/>
+          </w:tblBorders>
+          <w:tblCellMar>
+            <w:top w:w="0" w:type="dxa"/>
+            <w:left w:w="108" w:type="dxa"/>
+            <w:bottom w:w="0" w:type="dxa"/>
+            <w:right w:w="108" w:type="dxa"/>
+          </w:tblCellMar>
+        </w:tblPrEx>
+        <w:tc>
+          <w:tcPr>
+            <w:tcW w:w="0" w:type="auto"/>
+            <w:shd w:val="clear"/>
+            <w:vAlign w:val="center"/>
+          </w:tcPr>
+          <w:p>
+            <w:pPr>
+              <w:bidi w:val="0"/>
+              <w:spacing w:line="240" w:lineRule="auto"/>
+              <w:jc w:val="both"/>
+              <w:rPr>
+                <w:rFonts w:hint="default" w:ascii="华文中宋" w:hAnsi="华文中宋" w:cs="华文中宋"/>
+                <w:b/>
+                <w:bCs/>
+                <w:color w:val="FF0000"/>
+                <w:spacing w:val="0"/>
+                <w:sz w:val="21"/>
+                <w:szCs w:val="24"/>
+                <w:vertAlign w:val="baseline"/>
+                <w:lang w:val="en-US" w:eastAsia="zh-CN"/>
+              </w:rPr>
+            </w:pPr>
+            <w:r>
+              <w:rPr>
+                <w:rFonts w:hint="eastAsia" w:ascii="华文中宋" w:hAnsi="华文中宋" w:cs="华文中宋"/>
+                <w:b/>
+                <w:bCs/>
+                <w:color w:val="FF0000"/>
+                <w:spacing w:val="0"/>
+                <w:sz w:val="21"/>
+                <w:szCs w:val="24"/>
+                <w:vertAlign w:val="baseline"/>
+                <w:lang w:val="en-US" w:eastAsia="zh-CN"/>
+              </w:rPr>
+              <w:t>remove-ai-slops</w:t>
+            </w:r>
+          </w:p>
+        </w:tc>
+        <w:tc>
+          <w:tcPr>
+            <w:tcW w:w="0" w:type="auto"/>
+            <w:shd w:val="clear"/>
+            <w:vAlign w:val="center"/>
+          </w:tcPr>
+          <w:p>
+            <w:pPr>
+              <w:bidi w:val="0"/>
+              <w:spacing w:line="240" w:lineRule="auto"/>
+              <w:jc w:val="both"/>
+              <w:rPr>
+                <w:rFonts w:hint="default" w:ascii="华文中宋" w:hAnsi="华文中宋" w:cs="华文中宋"/>
+                <w:b/>
+                <w:bCs/>
+                <w:color w:val="EA82F1"/>
+                <w:sz w:val="21"/>
+                <w:szCs w:val="24"/>
+                <w:lang w:val="en-US" w:eastAsia="zh-CN"/>
+              </w:rPr>
+            </w:pPr>
+            <w:r>
+              <w:rPr>
+                <w:rFonts w:hint="eastAsia" w:ascii="华文中宋" w:hAnsi="华文中宋" w:cs="华文中宋"/>
+                <w:b/>
+                <w:bCs/>
+                <w:color w:val="EA82F1"/>
+                <w:sz w:val="21"/>
+                <w:szCs w:val="24"/>
+                <w:lang w:val="en-US" w:eastAsia="zh-CN"/>
+              </w:rPr>
+              <w:t>清理AI代码</w:t>
+            </w:r>
+          </w:p>
+        </w:tc>
+      </w:tr>
+      <w:tr>
+        <w:tblPrEx>
+          <w:tblBorders>
+            <w:top w:val="single" w:color="auto" w:sz="4" w:space="0"/>
+            <w:left w:val="single" w:color="auto" w:sz="4" w:space="0"/>
+            <w:bottom w:val="single" w:color="auto" w:sz="4" w:space="0"/>
+            <w:right w:val="single" w:color="auto" w:sz="4" w:space="0"/>
+            <w:insideH w:val="single" w:color="auto" w:sz="4" w:space="0"/>
+            <w:insideV w:val="single" w:color="auto" w:sz="4" w:space="0"/>
+          </w:tblBorders>
+          <w:tblCellMar>
+            <w:top w:w="0" w:type="dxa"/>
+            <w:left w:w="108" w:type="dxa"/>
+            <w:bottom w:w="0" w:type="dxa"/>
+            <w:right w:w="108" w:type="dxa"/>
+          </w:tblCellMar>
+        </w:tblPrEx>
+        <w:tc>
+          <w:tcPr>
+            <w:tcW w:w="0" w:type="auto"/>
+            <w:shd w:val="clear"/>
+            <w:vAlign w:val="center"/>
+          </w:tcPr>
+          <w:p>
+            <w:pPr>
+              <w:bidi w:val="0"/>
+              <w:spacing w:line="240" w:lineRule="auto"/>
+              <w:jc w:val="both"/>
+              <w:rPr>
+                <w:rFonts w:hint="default" w:ascii="华文中宋" w:hAnsi="华文中宋" w:cs="华文中宋"/>
+                <w:b/>
+                <w:bCs/>
+                <w:color w:val="FF0000"/>
+                <w:spacing w:val="0"/>
+                <w:sz w:val="21"/>
+                <w:szCs w:val="24"/>
+                <w:vertAlign w:val="baseline"/>
+                <w:lang w:val="en-US" w:eastAsia="zh-CN"/>
+              </w:rPr>
+            </w:pPr>
+            <w:r>
+              <w:rPr>
+                <w:rFonts w:hint="eastAsia" w:ascii="华文中宋" w:hAnsi="华文中宋" w:cs="华文中宋"/>
+                <w:b/>
+                <w:bCs/>
+                <w:color w:val="FF0000"/>
+                <w:spacing w:val="0"/>
+                <w:sz w:val="21"/>
+                <w:szCs w:val="24"/>
+                <w:vertAlign w:val="baseline"/>
+                <w:lang w:val="en-US" w:eastAsia="zh-CN"/>
+              </w:rPr>
+              <w:t>start-work</w:t>
+            </w:r>
+          </w:p>
+        </w:tc>
+        <w:tc>
+          <w:tcPr>
+            <w:tcW w:w="0" w:type="auto"/>
+            <w:shd w:val="clear"/>
+            <w:vAlign w:val="center"/>
+          </w:tcPr>
+          <w:p>
+            <w:pPr>
+              <w:bidi w:val="0"/>
+              <w:spacing w:line="240" w:lineRule="auto"/>
+              <w:jc w:val="both"/>
+              <w:rPr>
+                <w:rFonts w:hint="default" w:ascii="华文中宋" w:hAnsi="华文中宋" w:cs="华文中宋"/>
+                <w:b/>
+                <w:bCs/>
+                <w:color w:val="EA82F1"/>
+                <w:sz w:val="21"/>
+                <w:szCs w:val="24"/>
+                <w:lang w:val="en-US" w:eastAsia="zh-CN"/>
+              </w:rPr>
+            </w:pPr>
+            <w:r>
+              <w:rPr>
+                <w:rFonts w:hint="eastAsia" w:ascii="华文中宋" w:hAnsi="华文中宋" w:cs="华文中宋"/>
+                <w:b/>
+                <w:bCs/>
+                <w:color w:val="EA82F1"/>
+                <w:sz w:val="21"/>
+                <w:szCs w:val="24"/>
+                <w:lang w:val="en-US" w:eastAsia="zh-CN"/>
+              </w:rPr>
+              <w:t>执行计划</w:t>
+            </w:r>
+          </w:p>
+        </w:tc>
+      </w:tr>
+      <w:tr>
+        <w:tblPrEx>
+          <w:tblBorders>
+            <w:top w:val="single" w:color="auto" w:sz="4" w:space="0"/>
+            <w:left w:val="single" w:color="auto" w:sz="4" w:space="0"/>
+            <w:bottom w:val="single" w:color="auto" w:sz="4" w:space="0"/>
+            <w:right w:val="single" w:color="auto" w:sz="4" w:space="0"/>
+            <w:insideH w:val="single" w:color="auto" w:sz="4" w:space="0"/>
+            <w:insideV w:val="single" w:color="auto" w:sz="4" w:space="0"/>
+          </w:tblBorders>
+          <w:tblCellMar>
+            <w:top w:w="0" w:type="dxa"/>
+            <w:left w:w="108" w:type="dxa"/>
+            <w:bottom w:w="0" w:type="dxa"/>
+            <w:right w:w="108" w:type="dxa"/>
+          </w:tblCellMar>
+        </w:tblPrEx>
+        <w:tc>
+          <w:tcPr>
+            <w:tcW w:w="0" w:type="auto"/>
+            <w:shd w:val="clear"/>
+            <w:vAlign w:val="center"/>
+          </w:tcPr>
+          <w:p>
+            <w:pPr>
+              <w:bidi w:val="0"/>
+              <w:spacing w:line="240" w:lineRule="auto"/>
+              <w:jc w:val="both"/>
+              <w:rPr>
+                <w:rFonts w:hint="eastAsia" w:ascii="华文中宋" w:hAnsi="华文中宋" w:cs="华文中宋"/>
+                <w:b/>
+                <w:bCs/>
+                <w:color w:val="FF0000"/>
+                <w:spacing w:val="0"/>
+                <w:sz w:val="21"/>
+                <w:szCs w:val="24"/>
+                <w:vertAlign w:val="baseline"/>
+                <w:lang w:val="en-US" w:eastAsia="zh-CN"/>
+              </w:rPr>
+            </w:pPr>
+            <w:r>
+              <w:rPr>
+                <w:rFonts w:hint="eastAsia" w:ascii="华文中宋" w:hAnsi="华文中宋" w:cs="华文中宋"/>
+                <w:b/>
+                <w:bCs/>
+                <w:color w:val="FF0000"/>
+                <w:spacing w:val="0"/>
+                <w:sz w:val="21"/>
+                <w:szCs w:val="24"/>
+                <w:vertAlign w:val="baseline"/>
+                <w:lang w:val="en-US" w:eastAsia="zh-CN"/>
+              </w:rPr>
+              <w:t>stop-continuation</w:t>
+            </w:r>
+          </w:p>
+        </w:tc>
+        <w:tc>
+          <w:tcPr>
+            <w:tcW w:w="0" w:type="auto"/>
+            <w:shd w:val="clear"/>
+            <w:vAlign w:val="center"/>
+          </w:tcPr>
+          <w:p>
+            <w:pPr>
+              <w:bidi w:val="0"/>
+              <w:spacing w:line="240" w:lineRule="auto"/>
+              <w:jc w:val="both"/>
+              <w:rPr>
+                <w:rFonts w:hint="default" w:ascii="华文中宋" w:hAnsi="华文中宋" w:cs="华文中宋"/>
+                <w:b/>
+                <w:bCs/>
+                <w:color w:val="EA82F1"/>
+                <w:sz w:val="21"/>
+                <w:szCs w:val="24"/>
+                <w:lang w:val="en-US" w:eastAsia="zh-CN"/>
+              </w:rPr>
+            </w:pPr>
+            <w:r>
+              <w:rPr>
+                <w:rFonts w:hint="eastAsia" w:ascii="华文中宋" w:hAnsi="华文中宋" w:cs="华文中宋"/>
+                <w:b/>
+                <w:bCs/>
+                <w:color w:val="EA82F1"/>
+                <w:sz w:val="21"/>
+                <w:szCs w:val="24"/>
+                <w:lang w:val="en-US" w:eastAsia="zh-CN"/>
+              </w:rPr>
+              <w:t>停止自动延续</w:t>
+            </w:r>
+          </w:p>
+        </w:tc>
+      </w:tr>
+    </w:tbl>
     <w:p>
       <w:pPr>
         <w:bidi w:val="0"/>
@@ -47668,12 +48734,6 @@
             <w:insideH w:val="single" w:color="auto" w:sz="4" w:space="0"/>
             <w:insideV w:val="single" w:color="auto" w:sz="4" w:space="0"/>
           </w:tblBorders>
-          <w:tblCellMar>
-            <w:top w:w="0" w:type="dxa"/>
-            <w:left w:w="108" w:type="dxa"/>
-            <w:bottom w:w="0" w:type="dxa"/>
-            <w:right w:w="108" w:type="dxa"/>
-          </w:tblCellMar>
         </w:tblPrEx>
         <w:tc>
           <w:tcPr>
@@ -48793,12 +49853,6 @@
             <w:insideH w:val="single" w:color="auto" w:sz="4" w:space="0"/>
             <w:insideV w:val="single" w:color="auto" w:sz="4" w:space="0"/>
           </w:tblBorders>
-          <w:tblCellMar>
-            <w:top w:w="0" w:type="dxa"/>
-            <w:left w:w="108" w:type="dxa"/>
-            <w:bottom w:w="0" w:type="dxa"/>
-            <w:right w:w="108" w:type="dxa"/>
-          </w:tblCellMar>
         </w:tblPrEx>
         <w:tc>
           <w:tcPr>

</xml_diff>

<commit_message>
update on 2026-05-06 23:27:47.422856
</commit_message>
<xml_diff>
--- a/cfg - system.docx
+++ b/cfg - system.docx
@@ -8067,14 +8067,6 @@
       </w:tr>
       <w:tr>
         <w:tblPrEx>
-          <w:tblBorders>
-            <w:top w:val="single" w:color="auto" w:sz="4" w:space="0"/>
-            <w:left w:val="single" w:color="auto" w:sz="4" w:space="0"/>
-            <w:bottom w:val="single" w:color="auto" w:sz="4" w:space="0"/>
-            <w:right w:val="single" w:color="auto" w:sz="4" w:space="0"/>
-            <w:insideH w:val="single" w:color="auto" w:sz="4" w:space="0"/>
-            <w:insideV w:val="single" w:color="auto" w:sz="4" w:space="0"/>
-          </w:tblBorders>
           <w:tblCellMar>
             <w:top w:w="0" w:type="dxa"/>
             <w:left w:w="108" w:type="dxa"/>
@@ -15220,12 +15212,6 @@
             <w:insideH w:val="single" w:color="auto" w:sz="4" w:space="0"/>
             <w:insideV w:val="single" w:color="auto" w:sz="4" w:space="0"/>
           </w:tblBorders>
-          <w:tblCellMar>
-            <w:top w:w="0" w:type="dxa"/>
-            <w:left w:w="108" w:type="dxa"/>
-            <w:bottom w:w="0" w:type="dxa"/>
-            <w:right w:w="108" w:type="dxa"/>
-          </w:tblCellMar>
         </w:tblPrEx>
         <w:tc>
           <w:tcPr>
@@ -18645,8 +18631,8 @@
           </w14:textFill>
         </w:rPr>
       </w:pPr>
-      <w:bookmarkStart w:id="1" w:name="_Toc12901"/>
-      <w:bookmarkStart w:id="2" w:name="_Toc131002735"/>
+      <w:bookmarkStart w:id="1" w:name="_Toc131002735"/>
+      <w:bookmarkStart w:id="2" w:name="_Toc12901"/>
       <w:r>
         <w:rPr>
           <w:rFonts w:hint="eastAsia" w:ascii="华文中宋" w:hAnsi="华文中宋" w:eastAsia="华文中宋" w:cs="华文中宋"/>
@@ -18771,12 +18757,6 @@
             <w:insideH w:val="single" w:color="auto" w:sz="4" w:space="0"/>
             <w:insideV w:val="single" w:color="auto" w:sz="4" w:space="0"/>
           </w:tblBorders>
-          <w:tblCellMar>
-            <w:top w:w="0" w:type="dxa"/>
-            <w:left w:w="108" w:type="dxa"/>
-            <w:bottom w:w="0" w:type="dxa"/>
-            <w:right w:w="108" w:type="dxa"/>
-          </w:tblCellMar>
         </w:tblPrEx>
         <w:tc>
           <w:tcPr>
@@ -30136,7 +30116,7 @@
         </w:tblCellMar>
       </w:tblPr>
       <w:tblGrid>
-        <w:gridCol w:w="2464"/>
+        <w:gridCol w:w="2422"/>
         <w:gridCol w:w="2660"/>
       </w:tblGrid>
       <w:tr>
@@ -30498,7 +30478,7 @@
                 <w:vertAlign w:val="baseline"/>
                 <w:lang w:val="en-US" w:eastAsia="zh-CN"/>
               </w:rPr>
-              <w:t>ralph_loop / ulw_loop</w:t>
+              <w:t>ralph-loop / ulw-loop</w:t>
             </w:r>
           </w:p>
         </w:tc>
@@ -30557,7 +30537,7 @@
         <w:tc>
           <w:tcPr>
             <w:tcW w:w="0" w:type="auto"/>
-            <w:shd w:val="clear"/>
+            <w:shd w:val="clear" w:color="auto" w:fill="auto"/>
             <w:vAlign w:val="center"/>
           </w:tcPr>
           <w:p>
@@ -30597,7 +30577,7 @@
         <w:tc>
           <w:tcPr>
             <w:tcW w:w="0" w:type="auto"/>
-            <w:shd w:val="clear"/>
+            <w:shd w:val="clear" w:color="auto" w:fill="auto"/>
             <w:vAlign w:val="center"/>
           </w:tcPr>
           <w:p>
@@ -30658,7 +30638,7 @@
         <w:tc>
           <w:tcPr>
             <w:tcW w:w="0" w:type="auto"/>
-            <w:shd w:val="clear"/>
+            <w:shd w:val="clear" w:color="auto" w:fill="auto"/>
             <w:vAlign w:val="center"/>
           </w:tcPr>
           <w:p>
@@ -30697,7 +30677,7 @@
         <w:tc>
           <w:tcPr>
             <w:tcW w:w="0" w:type="auto"/>
-            <w:shd w:val="clear"/>
+            <w:shd w:val="clear" w:color="auto" w:fill="auto"/>
             <w:vAlign w:val="center"/>
           </w:tcPr>
           <w:p>
@@ -30750,7 +30730,7 @@
         <w:tc>
           <w:tcPr>
             <w:tcW w:w="0" w:type="auto"/>
-            <w:shd w:val="clear"/>
+            <w:shd w:val="clear" w:color="auto" w:fill="auto"/>
             <w:vAlign w:val="center"/>
           </w:tcPr>
           <w:p>
@@ -30789,7 +30769,7 @@
         <w:tc>
           <w:tcPr>
             <w:tcW w:w="0" w:type="auto"/>
-            <w:shd w:val="clear"/>
+            <w:shd w:val="clear" w:color="auto" w:fill="auto"/>
             <w:vAlign w:val="center"/>
           </w:tcPr>
           <w:p>
@@ -30842,7 +30822,7 @@
         <w:tc>
           <w:tcPr>
             <w:tcW w:w="0" w:type="auto"/>
-            <w:shd w:val="clear"/>
+            <w:shd w:val="clear" w:color="auto" w:fill="auto"/>
             <w:vAlign w:val="center"/>
           </w:tcPr>
           <w:p>
@@ -30881,7 +30861,7 @@
         <w:tc>
           <w:tcPr>
             <w:tcW w:w="0" w:type="auto"/>
-            <w:shd w:val="clear"/>
+            <w:shd w:val="clear" w:color="auto" w:fill="auto"/>
             <w:vAlign w:val="center"/>
           </w:tcPr>
           <w:p>
@@ -31103,6 +31083,8 @@
         </w:rPr>
         <w:t xml:space="preserve"> mysql80</w:t>
       </w:r>
+      <w:bookmarkStart w:id="9" w:name="_GoBack"/>
+      <w:bookmarkEnd w:id="9"/>
     </w:p>
     <w:p>
       <w:pPr>
@@ -48734,6 +48716,12 @@
             <w:insideH w:val="single" w:color="auto" w:sz="4" w:space="0"/>
             <w:insideV w:val="single" w:color="auto" w:sz="4" w:space="0"/>
           </w:tblBorders>
+          <w:tblCellMar>
+            <w:top w:w="0" w:type="dxa"/>
+            <w:left w:w="108" w:type="dxa"/>
+            <w:bottom w:w="0" w:type="dxa"/>
+            <w:right w:w="108" w:type="dxa"/>
+          </w:tblCellMar>
         </w:tblPrEx>
         <w:tc>
           <w:tcPr>
@@ -49853,6 +49841,12 @@
             <w:insideH w:val="single" w:color="auto" w:sz="4" w:space="0"/>
             <w:insideV w:val="single" w:color="auto" w:sz="4" w:space="0"/>
           </w:tblBorders>
+          <w:tblCellMar>
+            <w:top w:w="0" w:type="dxa"/>
+            <w:left w:w="108" w:type="dxa"/>
+            <w:bottom w:w="0" w:type="dxa"/>
+            <w:right w:w="108" w:type="dxa"/>
+          </w:tblCellMar>
         </w:tblPrEx>
         <w:tc>
           <w:tcPr>

</xml_diff>

<commit_message>
update on 2026-08-03 17:59:16.268897
</commit_message>
<xml_diff>
--- a/cfg - system.docx
+++ b/cfg - system.docx
@@ -2845,12 +2845,6 @@
             <w:insideH w:val="single" w:color="auto" w:sz="4" w:space="0"/>
             <w:insideV w:val="single" w:color="auto" w:sz="4" w:space="0"/>
           </w:tblBorders>
-          <w:tblCellMar>
-            <w:top w:w="0" w:type="dxa"/>
-            <w:left w:w="108" w:type="dxa"/>
-            <w:bottom w:w="0" w:type="dxa"/>
-            <w:right w:w="108" w:type="dxa"/>
-          </w:tblCellMar>
         </w:tblPrEx>
         <w:tc>
           <w:tcPr>
@@ -6014,7 +6008,23 @@
                 <w:vertAlign w:val="baseline"/>
                 <w:lang w:val="en-US" w:eastAsia="zh-CN"/>
               </w:rPr>
-              <w:t>du -h &lt;dir&gt;</w:t>
+              <w:t>du -h --max-depth=1</w:t>
+            </w:r>
+            <w:bookmarkStart w:id="9" w:name="_GoBack"/>
+            <w:bookmarkEnd w:id="9"/>
+            <w:r>
+              <w:rPr>
+                <w:rFonts w:hint="eastAsia" w:ascii="华文中宋" w:hAnsi="华文中宋" w:cs="华文中宋"/>
+                <w:b/>
+                <w:bCs/>
+                <w:color w:val="FF0000"/>
+                <w:spacing w:val="0"/>
+                <w:sz w:val="21"/>
+                <w:szCs w:val="24"/>
+                <w:vertAlign w:val="baseline"/>
+                <w:lang w:val="en-US" w:eastAsia="zh-CN"/>
+              </w:rPr>
+              <w:t xml:space="preserve"> &lt;dir&gt;</w:t>
             </w:r>
           </w:p>
         </w:tc>
@@ -8067,6 +8077,14 @@
       </w:tr>
       <w:tr>
         <w:tblPrEx>
+          <w:tblBorders>
+            <w:top w:val="single" w:color="auto" w:sz="4" w:space="0"/>
+            <w:left w:val="single" w:color="auto" w:sz="4" w:space="0"/>
+            <w:bottom w:val="single" w:color="auto" w:sz="4" w:space="0"/>
+            <w:right w:val="single" w:color="auto" w:sz="4" w:space="0"/>
+            <w:insideH w:val="single" w:color="auto" w:sz="4" w:space="0"/>
+            <w:insideV w:val="single" w:color="auto" w:sz="4" w:space="0"/>
+          </w:tblBorders>
           <w:tblCellMar>
             <w:top w:w="0" w:type="dxa"/>
             <w:left w:w="108" w:type="dxa"/>
@@ -9289,14 +9307,6 @@
       </w:tblGrid>
       <w:tr>
         <w:tblPrEx>
-          <w:tblBorders>
-            <w:top w:val="single" w:color="auto" w:sz="4" w:space="0"/>
-            <w:left w:val="single" w:color="auto" w:sz="4" w:space="0"/>
-            <w:bottom w:val="single" w:color="auto" w:sz="4" w:space="0"/>
-            <w:right w:val="single" w:color="auto" w:sz="4" w:space="0"/>
-            <w:insideH w:val="single" w:color="auto" w:sz="4" w:space="0"/>
-            <w:insideV w:val="single" w:color="auto" w:sz="4" w:space="0"/>
-          </w:tblBorders>
           <w:tblCellMar>
             <w:top w:w="0" w:type="dxa"/>
             <w:left w:w="108" w:type="dxa"/>
@@ -10737,12 +10747,6 @@
             <w:insideH w:val="single" w:color="auto" w:sz="4" w:space="0"/>
             <w:insideV w:val="single" w:color="auto" w:sz="4" w:space="0"/>
           </w:tblBorders>
-          <w:tblCellMar>
-            <w:top w:w="0" w:type="dxa"/>
-            <w:left w:w="108" w:type="dxa"/>
-            <w:bottom w:w="0" w:type="dxa"/>
-            <w:right w:w="108" w:type="dxa"/>
-          </w:tblCellMar>
         </w:tblPrEx>
         <w:tc>
           <w:tcPr>
@@ -12582,6 +12586,12 @@
             <w:insideH w:val="single" w:color="auto" w:sz="4" w:space="0"/>
             <w:insideV w:val="single" w:color="auto" w:sz="4" w:space="0"/>
           </w:tblBorders>
+          <w:tblCellMar>
+            <w:top w:w="0" w:type="dxa"/>
+            <w:left w:w="108" w:type="dxa"/>
+            <w:bottom w:w="0" w:type="dxa"/>
+            <w:right w:w="108" w:type="dxa"/>
+          </w:tblCellMar>
         </w:tblPrEx>
         <w:tc>
           <w:tcPr>
@@ -15212,6 +15222,12 @@
             <w:insideH w:val="single" w:color="auto" w:sz="4" w:space="0"/>
             <w:insideV w:val="single" w:color="auto" w:sz="4" w:space="0"/>
           </w:tblBorders>
+          <w:tblCellMar>
+            <w:top w:w="0" w:type="dxa"/>
+            <w:left w:w="108" w:type="dxa"/>
+            <w:bottom w:w="0" w:type="dxa"/>
+            <w:right w:w="108" w:type="dxa"/>
+          </w:tblCellMar>
         </w:tblPrEx>
         <w:tc>
           <w:tcPr>
@@ -18631,8 +18647,8 @@
           </w14:textFill>
         </w:rPr>
       </w:pPr>
-      <w:bookmarkStart w:id="1" w:name="_Toc131002735"/>
-      <w:bookmarkStart w:id="2" w:name="_Toc12901"/>
+      <w:bookmarkStart w:id="1" w:name="_Toc12901"/>
+      <w:bookmarkStart w:id="2" w:name="_Toc131002735"/>
       <w:r>
         <w:rPr>
           <w:rFonts w:hint="eastAsia" w:ascii="华文中宋" w:hAnsi="华文中宋" w:eastAsia="华文中宋" w:cs="华文中宋"/>
@@ -18757,6 +18773,12 @@
             <w:insideH w:val="single" w:color="auto" w:sz="4" w:space="0"/>
             <w:insideV w:val="single" w:color="auto" w:sz="4" w:space="0"/>
           </w:tblBorders>
+          <w:tblCellMar>
+            <w:top w:w="0" w:type="dxa"/>
+            <w:left w:w="108" w:type="dxa"/>
+            <w:bottom w:w="0" w:type="dxa"/>
+            <w:right w:w="108" w:type="dxa"/>
+          </w:tblCellMar>
         </w:tblPrEx>
         <w:tc>
           <w:tcPr>
@@ -31083,8 +31105,6 @@
         </w:rPr>
         <w:t xml:space="preserve"> mysql80</w:t>
       </w:r>
-      <w:bookmarkStart w:id="9" w:name="_GoBack"/>
-      <w:bookmarkEnd w:id="9"/>
     </w:p>
     <w:p>
       <w:pPr>
@@ -44798,12 +44818,6 @@
             <w:insideH w:val="single" w:color="auto" w:sz="4" w:space="0"/>
             <w:insideV w:val="single" w:color="auto" w:sz="4" w:space="0"/>
           </w:tblBorders>
-          <w:tblCellMar>
-            <w:top w:w="0" w:type="dxa"/>
-            <w:left w:w="108" w:type="dxa"/>
-            <w:bottom w:w="0" w:type="dxa"/>
-            <w:right w:w="108" w:type="dxa"/>
-          </w:tblCellMar>
         </w:tblPrEx>
         <w:tc>
           <w:tcPr>

</xml_diff>